<commit_message>
Lesson 2 COMPLETE: Context Menu EVENTS and EVENT HIERARCHIES
</commit_message>
<xml_diff>
--- a/pythogui.com notes.docx
+++ b/pythogui.com notes.docx
@@ -51,13 +51,8 @@
           <w:numId w:val="1"/>
         </w:numPr>
       </w:pPr>
-      <w:proofErr w:type="spellStart"/>
-      <w:r>
-        <w:t>QtWidgets</w:t>
-      </w:r>
-      <w:proofErr w:type="spellEnd"/>
-      <w:r>
-        <w:t xml:space="preserve"> contains a bunch of classes useful for creating an application.</w:t>
+      <w:r>
+        <w:t>QtWidgets contains a bunch of classes useful for creating an application.</w:t>
       </w:r>
     </w:p>
     <w:p>
@@ -69,31 +64,7 @@
         </w:numPr>
       </w:pPr>
       <w:r>
-        <w:t xml:space="preserve">The main modules for Qt are </w:t>
-      </w:r>
-      <w:proofErr w:type="spellStart"/>
-      <w:r>
-        <w:t>QtWidgets</w:t>
-      </w:r>
-      <w:proofErr w:type="spellEnd"/>
-      <w:r>
-        <w:t xml:space="preserve">, </w:t>
-      </w:r>
-      <w:proofErr w:type="spellStart"/>
-      <w:r>
-        <w:t>QtGui</w:t>
-      </w:r>
-      <w:proofErr w:type="spellEnd"/>
-      <w:r>
-        <w:t xml:space="preserve"> and </w:t>
-      </w:r>
-      <w:proofErr w:type="spellStart"/>
-      <w:r>
-        <w:t>QtCore</w:t>
-      </w:r>
-      <w:proofErr w:type="spellEnd"/>
-      <w:r>
-        <w:t>.</w:t>
+        <w:t>The main modules for Qt are QtWidgets, QtGui and QtCore.</w:t>
       </w:r>
     </w:p>
     <w:p>
@@ -105,21 +76,8 @@
         </w:numPr>
       </w:pPr>
       <w:r>
-        <w:t xml:space="preserve">app = </w:t>
-      </w:r>
-      <w:proofErr w:type="spellStart"/>
-      <w:r>
-        <w:t>QApplication</w:t>
-      </w:r>
-      <w:proofErr w:type="spellEnd"/>
-      <w:r>
-        <w:t xml:space="preserve">() is an instance of </w:t>
-      </w:r>
-      <w:proofErr w:type="spellStart"/>
-      <w:r>
-        <w:t>QApplication</w:t>
-      </w:r>
-      <w:proofErr w:type="spellEnd"/>
+        <w:t>app = QApplication() is an instance of QApplication</w:t>
+      </w:r>
     </w:p>
     <w:p>
       <w:pPr>
@@ -130,23 +88,7 @@
         </w:numPr>
       </w:pPr>
       <w:r>
-        <w:t xml:space="preserve">by calling &lt;import sys&gt;, we can use </w:t>
-      </w:r>
-      <w:proofErr w:type="spellStart"/>
-      <w:r>
-        <w:t>sys.argv</w:t>
-      </w:r>
-      <w:proofErr w:type="spellEnd"/>
-      <w:r>
-        <w:t xml:space="preserve"> as a parameter for </w:t>
-      </w:r>
-      <w:proofErr w:type="spellStart"/>
-      <w:r>
-        <w:t>QApplication</w:t>
-      </w:r>
-      <w:proofErr w:type="spellEnd"/>
-      <w:r>
-        <w:t xml:space="preserve"> if our application requires command line arguments.</w:t>
+        <w:t>by calling &lt;import sys&gt;, we can use sys.argv as a parameter for QApplication if our application requires command line arguments.</w:t>
       </w:r>
     </w:p>
     <w:p>
@@ -157,13 +99,8 @@
           <w:numId w:val="1"/>
         </w:numPr>
       </w:pPr>
-      <w:proofErr w:type="spellStart"/>
-      <w:r>
-        <w:t>sys.argv</w:t>
-      </w:r>
-      <w:proofErr w:type="spellEnd"/>
-      <w:r>
-        <w:t xml:space="preserve"> contains a list of command line arguments.</w:t>
+      <w:r>
+        <w:t>sys.argv contains a list of command line arguments.</w:t>
       </w:r>
     </w:p>
     <w:p>
@@ -439,13 +376,8 @@
           <w:numId w:val="13"/>
         </w:numPr>
       </w:pPr>
-      <w:proofErr w:type="spellStart"/>
-      <w:r>
-        <w:t>QApplication</w:t>
-      </w:r>
-      <w:proofErr w:type="spellEnd"/>
-      <w:r>
-        <w:t xml:space="preserve"> holds the Qt event loop.</w:t>
+      <w:r>
+        <w:t>QApplication holds the Qt event loop.</w:t>
       </w:r>
       <w:r>
         <w:rPr>
@@ -464,15 +396,7 @@
       </w:pPr>
       <w:r>
         <w:lastRenderedPageBreak/>
-        <w:t xml:space="preserve">.exec() method of </w:t>
-      </w:r>
-      <w:proofErr w:type="spellStart"/>
-      <w:r>
-        <w:t>QApplication</w:t>
-      </w:r>
-      <w:proofErr w:type="spellEnd"/>
-      <w:r>
-        <w:t xml:space="preserve"> starts the event loop.</w:t>
+        <w:t>.exec() method of QApplication starts the event loop.</w:t>
       </w:r>
     </w:p>
     <w:p>
@@ -482,28 +406,9 @@
           <w:ilvl w:val="0"/>
           <w:numId w:val="13"/>
         </w:numPr>
-        <w:pBdr>
-          <w:bottom w:val="single" w:sz="6" w:space="1" w:color="auto"/>
-        </w:pBdr>
-      </w:pPr>
-      <w:r>
-        <w:t xml:space="preserve">We define subclass </w:t>
-      </w:r>
-      <w:proofErr w:type="spellStart"/>
-      <w:r>
-        <w:t>MainWindow</w:t>
-      </w:r>
-      <w:proofErr w:type="spellEnd"/>
-      <w:r>
-        <w:t xml:space="preserve"> of </w:t>
-      </w:r>
-      <w:proofErr w:type="spellStart"/>
-      <w:r>
-        <w:t>QMainWindow</w:t>
-      </w:r>
-      <w:proofErr w:type="spellEnd"/>
-      <w:r>
-        <w:t xml:space="preserve"> because we want to create custom windows with custom functionalit</w:t>
+      </w:pPr>
+      <w:r>
+        <w:t>We define subclass MainWindow of QMainWindow because we want to create custom windows with custom functionalit</w:t>
       </w:r>
       <w:r>
         <w:t>y.</w:t>
@@ -516,32 +421,16 @@
           <w:ilvl w:val="0"/>
           <w:numId w:val="13"/>
         </w:numPr>
-        <w:pBdr>
-          <w:bottom w:val="single" w:sz="6" w:space="1" w:color="auto"/>
-        </w:pBdr>
-      </w:pPr>
-      <w:r>
-        <w:t xml:space="preserve">From PyQt6.QtCore import Qt, the Qt namespace stores all qt constants and identifiers. Example: </w:t>
-      </w:r>
-      <w:proofErr w:type="spellStart"/>
-      <w:r>
-        <w:t>Qt.MouseButton</w:t>
-      </w:r>
-      <w:proofErr w:type="spellEnd"/>
-    </w:p>
-    <w:p>
-      <w:pPr>
-        <w:rPr>
-          <w:b/>
-          <w:bCs/>
-          <w:i/>
-          <w:iCs/>
-          <w:sz w:val="40"/>
-          <w:szCs w:val="40"/>
-          <w:u w:val="single"/>
-        </w:rPr>
-      </w:pPr>
-    </w:p>
+      </w:pPr>
+    </w:p>
+    <w:p>
+      <w:r>
+        <w:pict w14:anchorId="01DD9C5F">
+          <v:rect id="_x0000_i1027" style="width:0;height:1.5pt" o:hralign="center" o:hrstd="t" o:hr="t" fillcolor="#a0a0a0" stroked="f"/>
+        </w:pict>
+      </w:r>
+    </w:p>
+    <w:p/>
     <w:p>
       <w:pPr>
         <w:jc w:val="center"/>
@@ -555,7 +444,6 @@
           <w:u w:val="single"/>
         </w:rPr>
       </w:pPr>
-      <w:proofErr w:type="spellStart"/>
       <w:r>
         <w:rPr>
           <w:b/>
@@ -568,7 +456,6 @@
         </w:rPr>
         <w:t>QtWidget</w:t>
       </w:r>
-      <w:proofErr w:type="spellEnd"/>
     </w:p>
     <w:p>
       <w:pPr>
@@ -578,11 +465,9 @@
           <w:numId w:val="14"/>
         </w:numPr>
       </w:pPr>
-      <w:proofErr w:type="spellStart"/>
       <w:r>
         <w:t>QApplication</w:t>
       </w:r>
-      <w:proofErr w:type="spellEnd"/>
     </w:p>
     <w:p>
       <w:pPr>
@@ -604,21 +489,8 @@
           <w:numId w:val="14"/>
         </w:numPr>
       </w:pPr>
-      <w:proofErr w:type="spellStart"/>
-      <w:r>
-        <w:t>QApplication</w:t>
-      </w:r>
-      <w:proofErr w:type="spellEnd"/>
-      <w:r>
-        <w:t>(</w:t>
-      </w:r>
-      <w:proofErr w:type="spellStart"/>
-      <w:r>
-        <w:t>sys.argv</w:t>
-      </w:r>
-      <w:proofErr w:type="spellEnd"/>
-      <w:r>
-        <w:t>) if command line arguments are needed.</w:t>
+      <w:r>
+        <w:t>QApplication(sys.argv) if command line arguments are needed.</w:t>
       </w:r>
     </w:p>
     <w:p>
@@ -629,13 +501,8 @@
           <w:numId w:val="14"/>
         </w:numPr>
       </w:pPr>
-      <w:proofErr w:type="spellStart"/>
-      <w:r>
-        <w:t>QApplication</w:t>
-      </w:r>
-      <w:proofErr w:type="spellEnd"/>
-      <w:r>
-        <w:t>([]) if not</w:t>
+      <w:r>
+        <w:t>QApplication([]) if not</w:t>
       </w:r>
     </w:p>
     <w:p>
@@ -658,11 +525,9 @@
           <w:numId w:val="14"/>
         </w:numPr>
       </w:pPr>
-      <w:proofErr w:type="spellStart"/>
       <w:r>
         <w:t>QMainWindow</w:t>
       </w:r>
-      <w:proofErr w:type="spellEnd"/>
     </w:p>
     <w:p>
       <w:pPr>
@@ -673,13 +538,8 @@
         </w:numPr>
       </w:pPr>
       <w:r>
-        <w:t xml:space="preserve">Qt’s default window </w:t>
-      </w:r>
-      <w:proofErr w:type="spellStart"/>
-      <w:r>
-        <w:t>class</w:t>
-      </w:r>
-      <w:proofErr w:type="spellEnd"/>
+        <w:t>Qt’s default window class</w:t>
+      </w:r>
     </w:p>
     <w:p>
       <w:pPr>
@@ -690,15 +550,7 @@
         </w:numPr>
       </w:pPr>
       <w:r>
-        <w:t>.</w:t>
-      </w:r>
-      <w:proofErr w:type="spellStart"/>
-      <w:r>
-        <w:t>setWindowTitle</w:t>
-      </w:r>
-      <w:proofErr w:type="spellEnd"/>
-      <w:r>
-        <w:t>() changes the title of the main window.</w:t>
+        <w:t>.setWindowTitle() changes the title of the main window.</w:t>
       </w:r>
     </w:p>
     <w:p>
@@ -709,11 +561,9 @@
           <w:numId w:val="14"/>
         </w:numPr>
       </w:pPr>
-      <w:proofErr w:type="spellStart"/>
       <w:r>
         <w:t>QWidget</w:t>
       </w:r>
-      <w:proofErr w:type="spellEnd"/>
     </w:p>
     <w:p>
       <w:pPr>
@@ -750,11 +600,9 @@
           <w:numId w:val="19"/>
         </w:numPr>
       </w:pPr>
-      <w:proofErr w:type="spellStart"/>
       <w:r>
         <w:t>QPushButton</w:t>
       </w:r>
-      <w:proofErr w:type="spellEnd"/>
     </w:p>
     <w:p>
       <w:pPr>
@@ -788,11 +636,9 @@
           <w:numId w:val="19"/>
         </w:numPr>
       </w:pPr>
-      <w:proofErr w:type="spellStart"/>
       <w:r>
         <w:t>QLabel</w:t>
       </w:r>
-      <w:proofErr w:type="spellEnd"/>
     </w:p>
     <w:p>
       <w:pPr>
@@ -814,11 +660,9 @@
           <w:numId w:val="19"/>
         </w:numPr>
       </w:pPr>
-      <w:proofErr w:type="spellStart"/>
       <w:r>
         <w:t>QLineEdit</w:t>
       </w:r>
-      <w:proofErr w:type="spellEnd"/>
     </w:p>
     <w:p>
       <w:pPr>
@@ -830,6 +674,30 @@
       </w:pPr>
       <w:r>
         <w:t>Text input box</w:t>
+      </w:r>
+    </w:p>
+    <w:p>
+      <w:pPr>
+        <w:pStyle w:val="ListParagraph"/>
+        <w:numPr>
+          <w:ilvl w:val="0"/>
+          <w:numId w:val="19"/>
+        </w:numPr>
+      </w:pPr>
+      <w:r>
+        <w:t>QMenu</w:t>
+      </w:r>
+    </w:p>
+    <w:p>
+      <w:pPr>
+        <w:pStyle w:val="ListParagraph"/>
+        <w:numPr>
+          <w:ilvl w:val="1"/>
+          <w:numId w:val="19"/>
+        </w:numPr>
+      </w:pPr>
+      <w:r>
+        <w:t>A menu of QAction obejcts</w:t>
       </w:r>
     </w:p>
     <w:p>
@@ -866,7 +734,6 @@
           <w:u w:val="single"/>
         </w:rPr>
       </w:pPr>
-      <w:proofErr w:type="spellStart"/>
       <w:r>
         <w:rPr>
           <w:b/>
@@ -879,7 +746,6 @@
         </w:rPr>
         <w:t>QtCore</w:t>
       </w:r>
-      <w:proofErr w:type="spellEnd"/>
     </w:p>
     <w:p>
       <w:pPr>
@@ -889,11 +755,34 @@
           <w:numId w:val="21"/>
         </w:numPr>
       </w:pPr>
-      <w:proofErr w:type="spellStart"/>
-      <w:r>
+      <w:r>
+        <w:t>Qt</w:t>
+      </w:r>
+    </w:p>
+    <w:p>
+      <w:pPr>
+        <w:pStyle w:val="ListParagraph"/>
+        <w:numPr>
+          <w:ilvl w:val="1"/>
+          <w:numId w:val="21"/>
+        </w:numPr>
+      </w:pPr>
+      <w:r>
+        <w:t>stores all qt constants and identifiers. Example: Qt.MouseButton</w:t>
+      </w:r>
+    </w:p>
+    <w:p>
+      <w:pPr>
+        <w:pStyle w:val="ListParagraph"/>
+        <w:numPr>
+          <w:ilvl w:val="0"/>
+          <w:numId w:val="21"/>
+        </w:numPr>
+      </w:pPr>
+      <w:r>
+        <w:lastRenderedPageBreak/>
         <w:t>QSize</w:t>
       </w:r>
-      <w:proofErr w:type="spellEnd"/>
     </w:p>
     <w:p>
       <w:pPr>
@@ -938,7 +827,7 @@
           <w:szCs w:val="40"/>
           <w:u w:val="single"/>
         </w:rPr>
-        <w:t>Widget Methods</w:t>
+        <w:t>QtGui</w:t>
       </w:r>
     </w:p>
     <w:p>
@@ -946,19 +835,12 @@
         <w:pStyle w:val="ListParagraph"/>
         <w:numPr>
           <w:ilvl w:val="0"/>
-          <w:numId w:val="21"/>
-        </w:numPr>
-      </w:pPr>
-      <w:r>
-        <w:t>.</w:t>
-      </w:r>
-      <w:proofErr w:type="spellStart"/>
-      <w:r>
-        <w:t>setCentralWidget</w:t>
-      </w:r>
-      <w:proofErr w:type="spellEnd"/>
-      <w:r>
-        <w:t xml:space="preserve">(&lt;widget&gt;) </w:t>
+          <w:numId w:val="24"/>
+        </w:numPr>
+        <w:jc w:val="both"/>
+      </w:pPr>
+      <w:r>
+        <w:t>QAction</w:t>
       </w:r>
     </w:p>
     <w:p>
@@ -966,333 +848,29 @@
         <w:pStyle w:val="ListParagraph"/>
         <w:numPr>
           <w:ilvl w:val="1"/>
-          <w:numId w:val="21"/>
-        </w:numPr>
-      </w:pPr>
-      <w:r>
-        <w:t xml:space="preserve">places a widget at the middle of the window. By default, it takes self. </w:t>
-      </w:r>
-    </w:p>
-    <w:p>
-      <w:pPr>
-        <w:pStyle w:val="ListParagraph"/>
-        <w:numPr>
-          <w:ilvl w:val="1"/>
-          <w:numId w:val="21"/>
-        </w:numPr>
-      </w:pPr>
-      <w:r>
-        <w:t>The widget resizes alongside the window.</w:t>
-      </w:r>
-    </w:p>
-    <w:p>
-      <w:pPr>
-        <w:pStyle w:val="ListParagraph"/>
-        <w:numPr>
-          <w:ilvl w:val="0"/>
-          <w:numId w:val="21"/>
-        </w:numPr>
-      </w:pPr>
-      <w:r>
-        <w:t>.</w:t>
-      </w:r>
-      <w:proofErr w:type="spellStart"/>
-      <w:r>
-        <w:t>setFixedSize</w:t>
-      </w:r>
-      <w:proofErr w:type="spellEnd"/>
-      <w:r>
-        <w:t>(&lt;</w:t>
-      </w:r>
-      <w:proofErr w:type="spellStart"/>
-      <w:r>
-        <w:t>QSize</w:t>
-      </w:r>
-      <w:proofErr w:type="spellEnd"/>
-      <w:r>
-        <w:t xml:space="preserve">&gt;) </w:t>
-      </w:r>
-    </w:p>
-    <w:p>
-      <w:pPr>
-        <w:pStyle w:val="ListParagraph"/>
-        <w:numPr>
-          <w:ilvl w:val="1"/>
-          <w:numId w:val="21"/>
-        </w:numPr>
-      </w:pPr>
-      <w:r>
-        <w:t>will create a fixed window size.</w:t>
-      </w:r>
-    </w:p>
-    <w:p>
-      <w:pPr>
-        <w:pStyle w:val="ListParagraph"/>
-        <w:numPr>
-          <w:ilvl w:val="0"/>
-          <w:numId w:val="21"/>
-        </w:numPr>
-      </w:pPr>
-      <w:r>
-        <w:t>.</w:t>
-      </w:r>
-      <w:proofErr w:type="spellStart"/>
-      <w:r>
-        <w:t>setMinimumSize</w:t>
-      </w:r>
-      <w:proofErr w:type="spellEnd"/>
-      <w:r>
-        <w:t>(&lt;</w:t>
-      </w:r>
-      <w:proofErr w:type="spellStart"/>
-      <w:r>
-        <w:t>QSize</w:t>
-      </w:r>
-      <w:proofErr w:type="spellEnd"/>
-      <w:r>
-        <w:t>&gt;), .</w:t>
-      </w:r>
-      <w:proofErr w:type="spellStart"/>
-      <w:r>
-        <w:t>setMaximumSize</w:t>
-      </w:r>
-      <w:proofErr w:type="spellEnd"/>
-      <w:r>
-        <w:t>(&lt;</w:t>
-      </w:r>
-      <w:proofErr w:type="spellStart"/>
-      <w:r>
-        <w:t>QSize</w:t>
-      </w:r>
-      <w:proofErr w:type="spellEnd"/>
-      <w:r>
-        <w:t>&gt;)</w:t>
-      </w:r>
-    </w:p>
-    <w:p>
-      <w:pPr>
-        <w:pStyle w:val="ListParagraph"/>
-        <w:numPr>
-          <w:ilvl w:val="0"/>
-          <w:numId w:val="21"/>
-        </w:numPr>
-      </w:pPr>
-      <w:r>
-        <w:t>.</w:t>
-      </w:r>
-      <w:proofErr w:type="spellStart"/>
-      <w:r>
-        <w:t>setCheckable</w:t>
-      </w:r>
-      <w:proofErr w:type="spellEnd"/>
-      <w:r>
-        <w:t>(&lt;bool&gt;)</w:t>
-      </w:r>
-    </w:p>
-    <w:p>
-      <w:pPr>
-        <w:pStyle w:val="ListParagraph"/>
-        <w:numPr>
-          <w:ilvl w:val="1"/>
-          <w:numId w:val="21"/>
-        </w:numPr>
-      </w:pPr>
-      <w:r>
-        <w:t>&lt;bool&gt; can be set to True or False and accordingly,</w:t>
-      </w:r>
-    </w:p>
-    <w:p>
-      <w:pPr>
-        <w:pStyle w:val="ListParagraph"/>
-        <w:numPr>
-          <w:ilvl w:val="1"/>
-          <w:numId w:val="21"/>
-        </w:numPr>
-      </w:pPr>
-      <w:r>
-        <w:t>Gives widgets an on(True) or off(False) state.</w:t>
-      </w:r>
-    </w:p>
-    <w:p>
-      <w:pPr>
-        <w:pStyle w:val="ListParagraph"/>
-        <w:numPr>
-          <w:ilvl w:val="0"/>
-          <w:numId w:val="21"/>
-        </w:numPr>
-      </w:pPr>
-      <w:r>
-        <w:t>.</w:t>
-      </w:r>
-      <w:proofErr w:type="spellStart"/>
-      <w:r>
-        <w:t>setChecked</w:t>
-      </w:r>
-      <w:proofErr w:type="spellEnd"/>
-      <w:r>
-        <w:t xml:space="preserve"> (&lt;bool&gt;)</w:t>
-      </w:r>
-    </w:p>
-    <w:p>
-      <w:pPr>
-        <w:pStyle w:val="ListParagraph"/>
-        <w:numPr>
-          <w:ilvl w:val="1"/>
-          <w:numId w:val="21"/>
-        </w:numPr>
-      </w:pPr>
-      <w:r>
-        <w:t>Set the state(True or False) for widget</w:t>
-      </w:r>
-    </w:p>
-    <w:p>
-      <w:pPr>
-        <w:pStyle w:val="ListParagraph"/>
-        <w:numPr>
-          <w:ilvl w:val="0"/>
-          <w:numId w:val="21"/>
-        </w:numPr>
-      </w:pPr>
-      <w:r>
-        <w:t>.</w:t>
-      </w:r>
-      <w:proofErr w:type="spellStart"/>
-      <w:r>
-        <w:t>setEnabled</w:t>
-      </w:r>
-      <w:proofErr w:type="spellEnd"/>
-      <w:r>
-        <w:t>(&lt;bool&gt;), .</w:t>
-      </w:r>
-      <w:proofErr w:type="spellStart"/>
-      <w:r>
-        <w:t>setDisabled</w:t>
-      </w:r>
-      <w:proofErr w:type="spellEnd"/>
-      <w:r>
-        <w:t>(&lt;bool&gt;)</w:t>
-      </w:r>
-    </w:p>
-    <w:p>
-      <w:pPr>
-        <w:pStyle w:val="ListParagraph"/>
-        <w:numPr>
-          <w:ilvl w:val="0"/>
-          <w:numId w:val="21"/>
-        </w:numPr>
-      </w:pPr>
-      <w:r>
-        <w:t>.</w:t>
-      </w:r>
-      <w:proofErr w:type="spellStart"/>
-      <w:r>
-        <w:t>setText</w:t>
-      </w:r>
-      <w:proofErr w:type="spellEnd"/>
-      <w:r>
-        <w:t>(&lt;string&gt;)</w:t>
-      </w:r>
-    </w:p>
-    <w:p>
-      <w:pPr>
-        <w:pStyle w:val="ListParagraph"/>
-        <w:numPr>
-          <w:ilvl w:val="1"/>
-          <w:numId w:val="21"/>
-        </w:numPr>
-      </w:pPr>
-      <w:r>
-        <w:t>change the text in widget</w:t>
-      </w:r>
-    </w:p>
-    <w:p>
-      <w:pPr>
-        <w:pStyle w:val="ListParagraph"/>
-        <w:numPr>
-          <w:ilvl w:val="0"/>
-          <w:numId w:val="21"/>
-        </w:numPr>
-      </w:pPr>
-      <w:r>
-        <w:t>.</w:t>
-      </w:r>
-      <w:proofErr w:type="spellStart"/>
-      <w:r>
-        <w:t>setLayout</w:t>
-      </w:r>
-      <w:proofErr w:type="spellEnd"/>
-      <w:r>
-        <w:t>(&lt;</w:t>
-      </w:r>
-      <w:proofErr w:type="spellStart"/>
-      <w:r>
-        <w:t>layout_object</w:t>
-      </w:r>
-      <w:proofErr w:type="spellEnd"/>
-      <w:r>
-        <w:t>&gt;)</w:t>
-      </w:r>
-    </w:p>
-    <w:p>
-      <w:pPr>
-        <w:pStyle w:val="ListParagraph"/>
-        <w:numPr>
-          <w:ilvl w:val="1"/>
-          <w:numId w:val="21"/>
-        </w:numPr>
-      </w:pPr>
-      <w:r>
-        <w:t>Takes a layout object as parameter and lays out the widgets within the layout accordingly in the outer widget.</w:t>
-      </w:r>
-    </w:p>
-    <w:p>
-      <w:pPr>
-        <w:pStyle w:val="ListParagraph"/>
-        <w:numPr>
-          <w:ilvl w:val="0"/>
-          <w:numId w:val="21"/>
-        </w:numPr>
-      </w:pPr>
-      <w:proofErr w:type="spellStart"/>
-      <w:r>
-        <w:t>setMouseTracking</w:t>
-      </w:r>
-      <w:proofErr w:type="spellEnd"/>
-      <w:r>
-        <w:t>(True)</w:t>
-      </w:r>
-    </w:p>
-    <w:p>
-      <w:pPr>
-        <w:pStyle w:val="ListParagraph"/>
-        <w:numPr>
-          <w:ilvl w:val="1"/>
-          <w:numId w:val="21"/>
-        </w:numPr>
-      </w:pPr>
-      <w:r>
-        <w:t xml:space="preserve">allows widgets to detect </w:t>
-      </w:r>
-      <w:proofErr w:type="spellStart"/>
-      <w:r>
-        <w:t>mouseMoveEvent</w:t>
-      </w:r>
-      <w:proofErr w:type="spellEnd"/>
-      <w:r>
-        <w:t xml:space="preserve"> even when a button on the mouse is not clicked</w:t>
-      </w:r>
-    </w:p>
-    <w:p>
-      <w:pPr>
-        <w:pStyle w:val="ListParagraph"/>
-        <w:numPr>
-          <w:ilvl w:val="1"/>
-          <w:numId w:val="21"/>
-        </w:numPr>
-      </w:pPr>
-      <w:r>
-        <w:t>must be called for both window and widget</w:t>
-      </w:r>
+          <w:numId w:val="24"/>
+        </w:numPr>
+        <w:jc w:val="both"/>
+      </w:pPr>
+      <w:r>
+        <w:t>QMenu dropdown objects</w:t>
+      </w:r>
+    </w:p>
+    <w:p>
+      <w:pPr>
+        <w:pBdr>
+          <w:bottom w:val="single" w:sz="6" w:space="1" w:color="auto"/>
+        </w:pBdr>
+        <w:rPr>
+          <w:b/>
+          <w:bCs/>
+          <w:i/>
+          <w:iCs/>
+          <w:sz w:val="40"/>
+          <w:szCs w:val="40"/>
+          <w:u w:val="single"/>
+        </w:rPr>
+      </w:pPr>
     </w:p>
     <w:p>
       <w:pPr>
@@ -1325,6 +903,356 @@
           <w:szCs w:val="40"/>
           <w:u w:val="single"/>
         </w:rPr>
+        <w:t>Widget Methods</w:t>
+      </w:r>
+    </w:p>
+    <w:p>
+      <w:pPr>
+        <w:pStyle w:val="ListParagraph"/>
+        <w:numPr>
+          <w:ilvl w:val="0"/>
+          <w:numId w:val="21"/>
+        </w:numPr>
+      </w:pPr>
+      <w:r>
+        <w:t>.exec()</w:t>
+      </w:r>
+    </w:p>
+    <w:p>
+      <w:pPr>
+        <w:pStyle w:val="ListParagraph"/>
+        <w:numPr>
+          <w:ilvl w:val="1"/>
+          <w:numId w:val="21"/>
+        </w:numPr>
+      </w:pPr>
+      <w:r>
+        <w:t>Starts event loop.</w:t>
+      </w:r>
+    </w:p>
+    <w:p>
+      <w:pPr>
+        <w:pStyle w:val="ListParagraph"/>
+        <w:numPr>
+          <w:ilvl w:val="1"/>
+          <w:numId w:val="21"/>
+        </w:numPr>
+      </w:pPr>
+      <w:r>
+        <w:t>Used for QApplication and QMenu</w:t>
+      </w:r>
+    </w:p>
+    <w:p>
+      <w:pPr>
+        <w:pStyle w:val="ListParagraph"/>
+        <w:numPr>
+          <w:ilvl w:val="0"/>
+          <w:numId w:val="21"/>
+        </w:numPr>
+      </w:pPr>
+      <w:r>
+        <w:t xml:space="preserve">.setCentralWidget(&lt;widget&gt;) </w:t>
+      </w:r>
+    </w:p>
+    <w:p>
+      <w:pPr>
+        <w:pStyle w:val="ListParagraph"/>
+        <w:numPr>
+          <w:ilvl w:val="1"/>
+          <w:numId w:val="21"/>
+        </w:numPr>
+      </w:pPr>
+      <w:r>
+        <w:t xml:space="preserve">places a widget at the middle of the window. By default, it takes self. </w:t>
+      </w:r>
+    </w:p>
+    <w:p>
+      <w:pPr>
+        <w:pStyle w:val="ListParagraph"/>
+        <w:numPr>
+          <w:ilvl w:val="1"/>
+          <w:numId w:val="21"/>
+        </w:numPr>
+      </w:pPr>
+      <w:r>
+        <w:t>The widget resizes alongside the window.</w:t>
+      </w:r>
+    </w:p>
+    <w:p>
+      <w:pPr>
+        <w:pStyle w:val="ListParagraph"/>
+        <w:numPr>
+          <w:ilvl w:val="0"/>
+          <w:numId w:val="21"/>
+        </w:numPr>
+      </w:pPr>
+      <w:r>
+        <w:t xml:space="preserve">.setFixedSize(&lt;QSize&gt;) </w:t>
+      </w:r>
+    </w:p>
+    <w:p>
+      <w:pPr>
+        <w:pStyle w:val="ListParagraph"/>
+        <w:numPr>
+          <w:ilvl w:val="1"/>
+          <w:numId w:val="21"/>
+        </w:numPr>
+      </w:pPr>
+      <w:r>
+        <w:t>will create a fixed window size.</w:t>
+      </w:r>
+    </w:p>
+    <w:p>
+      <w:pPr>
+        <w:pStyle w:val="ListParagraph"/>
+        <w:numPr>
+          <w:ilvl w:val="0"/>
+          <w:numId w:val="21"/>
+        </w:numPr>
+      </w:pPr>
+      <w:r>
+        <w:t>.setMinimumSize(&lt;QSize&gt;), .setMaximumSize(&lt;QSize&gt;)</w:t>
+      </w:r>
+    </w:p>
+    <w:p>
+      <w:pPr>
+        <w:pStyle w:val="ListParagraph"/>
+        <w:numPr>
+          <w:ilvl w:val="0"/>
+          <w:numId w:val="21"/>
+        </w:numPr>
+      </w:pPr>
+      <w:r>
+        <w:t>.setCheckable(&lt;bool&gt;)</w:t>
+      </w:r>
+    </w:p>
+    <w:p>
+      <w:pPr>
+        <w:pStyle w:val="ListParagraph"/>
+        <w:numPr>
+          <w:ilvl w:val="1"/>
+          <w:numId w:val="21"/>
+        </w:numPr>
+      </w:pPr>
+      <w:r>
+        <w:t>&lt;bool&gt; can be set to True or False and accordingly,</w:t>
+      </w:r>
+    </w:p>
+    <w:p>
+      <w:pPr>
+        <w:pStyle w:val="ListParagraph"/>
+        <w:numPr>
+          <w:ilvl w:val="1"/>
+          <w:numId w:val="21"/>
+        </w:numPr>
+      </w:pPr>
+      <w:r>
+        <w:t>Gives widgets an on(True) or off(False) state.</w:t>
+      </w:r>
+    </w:p>
+    <w:p>
+      <w:pPr>
+        <w:pStyle w:val="ListParagraph"/>
+        <w:numPr>
+          <w:ilvl w:val="0"/>
+          <w:numId w:val="21"/>
+        </w:numPr>
+      </w:pPr>
+      <w:r>
+        <w:t>.setChecked (&lt;bool&gt;)</w:t>
+      </w:r>
+    </w:p>
+    <w:p>
+      <w:pPr>
+        <w:pStyle w:val="ListParagraph"/>
+        <w:numPr>
+          <w:ilvl w:val="1"/>
+          <w:numId w:val="21"/>
+        </w:numPr>
+      </w:pPr>
+      <w:r>
+        <w:t>Set the state(True or False) for widget</w:t>
+      </w:r>
+    </w:p>
+    <w:p>
+      <w:pPr>
+        <w:pStyle w:val="ListParagraph"/>
+        <w:numPr>
+          <w:ilvl w:val="0"/>
+          <w:numId w:val="21"/>
+        </w:numPr>
+      </w:pPr>
+      <w:r>
+        <w:t>.setEnabled(&lt;bool&gt;), .setDisabled(&lt;bool&gt;)</w:t>
+      </w:r>
+    </w:p>
+    <w:p>
+      <w:pPr>
+        <w:pStyle w:val="ListParagraph"/>
+        <w:numPr>
+          <w:ilvl w:val="0"/>
+          <w:numId w:val="21"/>
+        </w:numPr>
+      </w:pPr>
+      <w:r>
+        <w:t>.setText(&lt;string&gt;)</w:t>
+      </w:r>
+    </w:p>
+    <w:p>
+      <w:pPr>
+        <w:pStyle w:val="ListParagraph"/>
+        <w:numPr>
+          <w:ilvl w:val="1"/>
+          <w:numId w:val="21"/>
+        </w:numPr>
+      </w:pPr>
+      <w:r>
+        <w:t>change the text in widget</w:t>
+      </w:r>
+    </w:p>
+    <w:p>
+      <w:pPr>
+        <w:pStyle w:val="ListParagraph"/>
+        <w:numPr>
+          <w:ilvl w:val="0"/>
+          <w:numId w:val="21"/>
+        </w:numPr>
+      </w:pPr>
+      <w:r>
+        <w:t>.setLayout(&lt;layout_object&gt;)</w:t>
+      </w:r>
+    </w:p>
+    <w:p>
+      <w:pPr>
+        <w:pStyle w:val="ListParagraph"/>
+        <w:numPr>
+          <w:ilvl w:val="1"/>
+          <w:numId w:val="21"/>
+        </w:numPr>
+      </w:pPr>
+      <w:r>
+        <w:t>Takes a layout object as parameter and lays out the widgets within the layout accordingly in the outer widget.</w:t>
+      </w:r>
+    </w:p>
+    <w:p>
+      <w:pPr>
+        <w:pStyle w:val="ListParagraph"/>
+        <w:numPr>
+          <w:ilvl w:val="0"/>
+          <w:numId w:val="21"/>
+        </w:numPr>
+      </w:pPr>
+      <w:r>
+        <w:lastRenderedPageBreak/>
+        <w:t>.</w:t>
+      </w:r>
+      <w:r>
+        <w:t>setMouseTracking(True)</w:t>
+      </w:r>
+    </w:p>
+    <w:p>
+      <w:pPr>
+        <w:pStyle w:val="ListParagraph"/>
+        <w:numPr>
+          <w:ilvl w:val="1"/>
+          <w:numId w:val="21"/>
+        </w:numPr>
+      </w:pPr>
+      <w:r>
+        <w:t>allows widgets to detect mouseMoveEvent even when a button on the mouse is not clicked</w:t>
+      </w:r>
+    </w:p>
+    <w:p>
+      <w:pPr>
+        <w:pStyle w:val="ListParagraph"/>
+        <w:numPr>
+          <w:ilvl w:val="1"/>
+          <w:numId w:val="21"/>
+        </w:numPr>
+      </w:pPr>
+      <w:r>
+        <w:t>must be called for both window and widget</w:t>
+      </w:r>
+    </w:p>
+    <w:p>
+      <w:pPr>
+        <w:pStyle w:val="ListParagraph"/>
+        <w:numPr>
+          <w:ilvl w:val="0"/>
+          <w:numId w:val="21"/>
+        </w:numPr>
+      </w:pPr>
+      <w:r>
+        <w:t>.addAction(&lt;QAction&gt;)</w:t>
+      </w:r>
+    </w:p>
+    <w:p>
+      <w:pPr>
+        <w:pStyle w:val="ListParagraph"/>
+        <w:numPr>
+          <w:ilvl w:val="1"/>
+          <w:numId w:val="21"/>
+        </w:numPr>
+      </w:pPr>
+      <w:r>
+        <w:t>can add QAction object to QMenu objects.</w:t>
+      </w:r>
+    </w:p>
+    <w:p>
+      <w:pPr>
+        <w:pStyle w:val="ListParagraph"/>
+        <w:numPr>
+          <w:ilvl w:val="0"/>
+          <w:numId w:val="21"/>
+        </w:numPr>
+      </w:pPr>
+      <w:r>
+        <w:t>.mapToGlobal(&lt;QPoint&gt;)</w:t>
+      </w:r>
+    </w:p>
+    <w:p>
+      <w:pPr>
+        <w:pStyle w:val="ListParagraph"/>
+        <w:numPr>
+          <w:ilvl w:val="1"/>
+          <w:numId w:val="21"/>
+        </w:numPr>
+      </w:pPr>
+      <w:r>
+        <w:t>Takes relative position and returns global screen coordinates</w:t>
+      </w:r>
+    </w:p>
+    <w:p>
+      <w:pPr>
+        <w:pBdr>
+          <w:bottom w:val="single" w:sz="6" w:space="1" w:color="auto"/>
+        </w:pBdr>
+      </w:pPr>
+    </w:p>
+    <w:p/>
+    <w:p>
+      <w:pPr>
+        <w:jc w:val="center"/>
+        <w:rPr>
+          <w:b/>
+          <w:bCs/>
+          <w:i/>
+          <w:iCs/>
+          <w:sz w:val="40"/>
+          <w:szCs w:val="40"/>
+          <w:u w:val="single"/>
+        </w:rPr>
+      </w:pPr>
+      <w:r>
+        <w:rPr>
+          <w:b/>
+          <w:bCs/>
+          <w:i/>
+          <w:iCs/>
+          <w:sz w:val="40"/>
+          <w:szCs w:val="40"/>
+          <w:u w:val="single"/>
+        </w:rPr>
         <w:t>Signals, Slots and Events</w:t>
       </w:r>
     </w:p>
@@ -1372,11 +1300,9 @@
           <w:numId w:val="22"/>
         </w:numPr>
       </w:pPr>
-      <w:proofErr w:type="spellStart"/>
       <w:r>
         <w:t>QPushButton.clicked</w:t>
       </w:r>
-      <w:proofErr w:type="spellEnd"/>
     </w:p>
     <w:p>
       <w:pPr>
@@ -1399,7 +1325,6 @@
         </w:numPr>
       </w:pPr>
       <w:r>
-        <w:lastRenderedPageBreak/>
         <w:t>Signal sends a &lt;bool&gt; argument</w:t>
       </w:r>
     </w:p>
@@ -1411,11 +1336,9 @@
           <w:numId w:val="22"/>
         </w:numPr>
       </w:pPr>
-      <w:proofErr w:type="spellStart"/>
       <w:r>
         <w:t>QPushButton.released</w:t>
       </w:r>
-      <w:proofErr w:type="spellEnd"/>
     </w:p>
     <w:p>
       <w:pPr>
@@ -1449,11 +1372,9 @@
           <w:numId w:val="22"/>
         </w:numPr>
       </w:pPr>
-      <w:proofErr w:type="spellStart"/>
       <w:r>
         <w:t>QMainWindow.windowTitleChanged</w:t>
       </w:r>
-      <w:proofErr w:type="spellEnd"/>
     </w:p>
     <w:p>
       <w:pPr>
@@ -1487,11 +1408,9 @@
           <w:numId w:val="22"/>
         </w:numPr>
       </w:pPr>
-      <w:proofErr w:type="spellStart"/>
       <w:r>
         <w:t>QLineEdit.textChanged</w:t>
       </w:r>
-      <w:proofErr w:type="spellEnd"/>
     </w:p>
     <w:p>
       <w:pPr>
@@ -1545,6 +1464,32 @@
     <w:p/>
     <w:p>
       <w:pPr>
+        <w:jc w:val="center"/>
+        <w:rPr>
+          <w:b/>
+          <w:bCs/>
+          <w:i/>
+          <w:iCs/>
+          <w:sz w:val="36"/>
+          <w:szCs w:val="36"/>
+          <w:u w:val="single"/>
+        </w:rPr>
+      </w:pPr>
+      <w:r>
+        <w:rPr>
+          <w:b/>
+          <w:bCs/>
+          <w:i/>
+          <w:iCs/>
+          <w:sz w:val="36"/>
+          <w:szCs w:val="36"/>
+          <w:u w:val="single"/>
+        </w:rPr>
+        <w:t>EVENTS</w:t>
+      </w:r>
+    </w:p>
+    <w:p>
+      <w:pPr>
         <w:pStyle w:val="ListParagraph"/>
         <w:numPr>
           <w:ilvl w:val="0"/>
@@ -1552,6 +1497,7 @@
         </w:numPr>
       </w:pPr>
       <w:r>
+        <w:lastRenderedPageBreak/>
         <w:t>Events are every interaction that the user has with a Qt application.</w:t>
       </w:r>
     </w:p>
@@ -1611,11 +1557,9 @@
           <w:numId w:val="22"/>
         </w:numPr>
       </w:pPr>
-      <w:proofErr w:type="spellStart"/>
       <w:r>
         <w:t>QMouseEvents</w:t>
       </w:r>
-      <w:proofErr w:type="spellEnd"/>
     </w:p>
     <w:p>
       <w:pPr>
@@ -1625,11 +1569,9 @@
           <w:numId w:val="22"/>
         </w:numPr>
       </w:pPr>
-      <w:proofErr w:type="spellStart"/>
       <w:r>
         <w:t>mouseMoveEvent</w:t>
       </w:r>
-      <w:proofErr w:type="spellEnd"/>
     </w:p>
     <w:p>
       <w:pPr>
@@ -1639,11 +1581,9 @@
           <w:numId w:val="22"/>
         </w:numPr>
       </w:pPr>
-      <w:proofErr w:type="spellStart"/>
       <w:r>
         <w:t>mousePressEvent</w:t>
       </w:r>
-      <w:proofErr w:type="spellEnd"/>
     </w:p>
     <w:p>
       <w:pPr>
@@ -1653,11 +1593,9 @@
           <w:numId w:val="22"/>
         </w:numPr>
       </w:pPr>
-      <w:proofErr w:type="spellStart"/>
       <w:r>
         <w:t>mouseReleaseEvent</w:t>
       </w:r>
-      <w:proofErr w:type="spellEnd"/>
     </w:p>
     <w:p>
       <w:pPr>
@@ -1667,11 +1605,39 @@
           <w:numId w:val="22"/>
         </w:numPr>
       </w:pPr>
-      <w:proofErr w:type="spellStart"/>
       <w:r>
         <w:t>mouseDoubleClickEvent</w:t>
       </w:r>
-      <w:proofErr w:type="spellEnd"/>
+    </w:p>
+    <w:p>
+      <w:pPr>
+        <w:pStyle w:val="ListParagraph"/>
+        <w:numPr>
+          <w:ilvl w:val="3"/>
+          <w:numId w:val="22"/>
+        </w:numPr>
+      </w:pPr>
+      <w:r>
+        <w:t xml:space="preserve">all </w:t>
+      </w:r>
+      <w:r>
+        <w:t>the</w:t>
+      </w:r>
+      <w:r>
+        <w:t>s</w:t>
+      </w:r>
+      <w:r>
+        <w:t>e &lt;SIGNAL&gt;</w:t>
+      </w:r>
+      <w:r>
+        <w:t xml:space="preserve"> </w:t>
+      </w:r>
+      <w:r>
+        <w:t xml:space="preserve">return </w:t>
+      </w:r>
+      <w:r>
+        <w:t>mouse position as QPoint integer</w:t>
+      </w:r>
     </w:p>
     <w:p>
       <w:pPr>
@@ -1681,53 +1647,8 @@
           <w:numId w:val="22"/>
         </w:numPr>
       </w:pPr>
-      <w:proofErr w:type="spellStart"/>
-      <w:r>
-        <w:t>Qt.MouseButton</w:t>
-      </w:r>
-      <w:proofErr w:type="spellEnd"/>
-      <w:r>
-        <w:t>.(</w:t>
-      </w:r>
-      <w:proofErr w:type="spellStart"/>
-      <w:r>
-        <w:t>LeftButton</w:t>
-      </w:r>
-      <w:proofErr w:type="spellEnd"/>
-      <w:r>
-        <w:t>/</w:t>
-      </w:r>
-      <w:proofErr w:type="spellStart"/>
-      <w:r>
-        <w:t>RightButton</w:t>
-      </w:r>
-      <w:proofErr w:type="spellEnd"/>
-      <w:r>
-        <w:t>/</w:t>
-      </w:r>
-      <w:proofErr w:type="spellStart"/>
-      <w:r>
-        <w:t>MiddleButton</w:t>
-      </w:r>
-      <w:proofErr w:type="spellEnd"/>
-      <w:r>
-        <w:t>/</w:t>
-      </w:r>
-      <w:proofErr w:type="spellStart"/>
-      <w:r>
-        <w:t>NoButton</w:t>
-      </w:r>
-      <w:proofErr w:type="spellEnd"/>
-      <w:r>
-        <w:t xml:space="preserve">) (NOTE: </w:t>
-      </w:r>
-      <w:proofErr w:type="spellStart"/>
-      <w:r>
-        <w:t>MoveEvent</w:t>
-      </w:r>
-      <w:proofErr w:type="spellEnd"/>
-      <w:r>
-        <w:t xml:space="preserve"> does not take buttons.)</w:t>
+      <w:r>
+        <w:t>Qt.MouseButton.(LeftButton/RightButton/MiddleButton/NoButton) (NOTE: MoveEvent does not take buttons.)</w:t>
       </w:r>
     </w:p>
     <w:p>
@@ -1741,6 +1662,10 @@
       <w:r>
         <w:t>.button()</w:t>
       </w:r>
+      <w:r>
+        <w:tab/>
+        <w:t>&lt;METHOD&gt;</w:t>
+      </w:r>
     </w:p>
     <w:p>
       <w:pPr>
@@ -1765,6 +1690,10 @@
       <w:r>
         <w:t>.buttons()</w:t>
       </w:r>
+      <w:r>
+        <w:tab/>
+        <w:t>&lt;METHOD&gt;</w:t>
+      </w:r>
     </w:p>
     <w:p>
       <w:pPr>
@@ -1789,6 +1718,10 @@
       <w:r>
         <w:t>.position()</w:t>
       </w:r>
+      <w:r>
+        <w:tab/>
+        <w:t>&lt;METHOD&gt;</w:t>
+      </w:r>
     </w:p>
     <w:p>
       <w:pPr>
@@ -1799,17 +1732,341 @@
         </w:numPr>
       </w:pPr>
       <w:r>
-        <w:t xml:space="preserve">Widget-relative position of the mouse cursor as a </w:t>
-      </w:r>
-      <w:proofErr w:type="spellStart"/>
-      <w:r>
-        <w:t>QPoint</w:t>
-      </w:r>
-      <w:proofErr w:type="spellEnd"/>
-      <w:r>
-        <w:t xml:space="preserve"> integer</w:t>
-      </w:r>
-    </w:p>
+        <w:t>Widget-relative position of the mouse cursor as a QPoint integer</w:t>
+      </w:r>
+    </w:p>
+    <w:p>
+      <w:pPr>
+        <w:pStyle w:val="ListParagraph"/>
+        <w:numPr>
+          <w:ilvl w:val="2"/>
+          <w:numId w:val="22"/>
+        </w:numPr>
+      </w:pPr>
+      <w:r>
+        <w:t>.globalPos()</w:t>
+      </w:r>
+      <w:r>
+        <w:tab/>
+        <w:t>&lt;METHOD&gt;</w:t>
+      </w:r>
+    </w:p>
+    <w:p>
+      <w:pPr>
+        <w:pStyle w:val="ListParagraph"/>
+        <w:numPr>
+          <w:ilvl w:val="3"/>
+          <w:numId w:val="22"/>
+        </w:numPr>
+      </w:pPr>
+      <w:r>
+        <w:t>returns the position of mouse in global screen coordinates as QPoint integer</w:t>
+      </w:r>
+    </w:p>
+    <w:p>
+      <w:pPr>
+        <w:pStyle w:val="ListParagraph"/>
+        <w:ind w:left="2880"/>
+      </w:pPr>
+    </w:p>
+    <w:p>
+      <w:pPr>
+        <w:pStyle w:val="ListParagraph"/>
+        <w:numPr>
+          <w:ilvl w:val="1"/>
+          <w:numId w:val="22"/>
+        </w:numPr>
+      </w:pPr>
+      <w:r>
+        <w:t>QContextMenuEvent</w:t>
+      </w:r>
+    </w:p>
+    <w:p>
+      <w:pPr>
+        <w:pStyle w:val="ListParagraph"/>
+        <w:numPr>
+          <w:ilvl w:val="2"/>
+          <w:numId w:val="22"/>
+        </w:numPr>
+      </w:pPr>
+      <w:r>
+        <w:t>Context menu is a small context-sensitive menu that appears when right-clicking on a window</w:t>
+      </w:r>
+    </w:p>
+    <w:p>
+      <w:pPr>
+        <w:pStyle w:val="ListParagraph"/>
+        <w:numPr>
+          <w:ilvl w:val="2"/>
+          <w:numId w:val="22"/>
+        </w:numPr>
+      </w:pPr>
+      <w:r>
+        <w:t>c</w:t>
+      </w:r>
+      <w:r>
+        <w:t>ontextMenuEvent</w:t>
+      </w:r>
+      <w:r>
+        <w:tab/>
+        <w:t>&lt;SIGNAL&gt;</w:t>
+      </w:r>
+    </w:p>
+    <w:p>
+      <w:pPr>
+        <w:pStyle w:val="ListParagraph"/>
+        <w:numPr>
+          <w:ilvl w:val="2"/>
+          <w:numId w:val="22"/>
+        </w:numPr>
+      </w:pPr>
+      <w:r>
+        <w:t>customContextMenuRequested</w:t>
+      </w:r>
+      <w:r>
+        <w:tab/>
+        <w:t>&lt;SIGNAL&gt;</w:t>
+      </w:r>
+    </w:p>
+    <w:p>
+      <w:pPr>
+        <w:pStyle w:val="ListParagraph"/>
+        <w:numPr>
+          <w:ilvl w:val="3"/>
+          <w:numId w:val="22"/>
+        </w:numPr>
+      </w:pPr>
+      <w:r>
+        <w:t>returns mouse position as QPoint integer relative to widget</w:t>
+      </w:r>
+    </w:p>
+    <w:p>
+      <w:pPr>
+        <w:pStyle w:val="ListParagraph"/>
+        <w:numPr>
+          <w:ilvl w:val="2"/>
+          <w:numId w:val="22"/>
+        </w:numPr>
+      </w:pPr>
+      <w:r>
+        <w:t>.setContextMenuPolicy(Qt.ContextMenuPolicy.CustomContextMenu)</w:t>
+      </w:r>
+      <w:r>
+        <w:tab/>
+        <w:t>&lt;METHOD&gt;</w:t>
+      </w:r>
+    </w:p>
+    <w:p>
+      <w:pPr>
+        <w:pStyle w:val="ListParagraph"/>
+        <w:numPr>
+          <w:ilvl w:val="3"/>
+          <w:numId w:val="22"/>
+        </w:numPr>
+      </w:pPr>
+      <w:r>
+        <w:t>Tells Qt to use custom context menu when right-click is detected</w:t>
+      </w:r>
+    </w:p>
+    <w:p>
+      <w:pPr>
+        <w:pStyle w:val="ListParagraph"/>
+        <w:numPr>
+          <w:ilvl w:val="0"/>
+          <w:numId w:val="22"/>
+        </w:numPr>
+      </w:pPr>
+      <w:r>
+        <w:t>Event handl</w:t>
+      </w:r>
+      <w:r>
+        <w:t>ers for each widget can be different</w:t>
+      </w:r>
+      <w:r>
+        <w:t>:</w:t>
+      </w:r>
+    </w:p>
+    <w:p>
+      <w:pPr>
+        <w:pStyle w:val="ListParagraph"/>
+        <w:numPr>
+          <w:ilvl w:val="1"/>
+          <w:numId w:val="22"/>
+        </w:numPr>
+      </w:pPr>
+      <w:r>
+        <w:t>EVENT</w:t>
+      </w:r>
+      <w:r>
+        <w:t>.accept()</w:t>
+      </w:r>
+    </w:p>
+    <w:p>
+      <w:pPr>
+        <w:pStyle w:val="ListParagraph"/>
+        <w:numPr>
+          <w:ilvl w:val="2"/>
+          <w:numId w:val="22"/>
+        </w:numPr>
+      </w:pPr>
+      <w:r>
+        <w:t>Marks the event as handled.</w:t>
+      </w:r>
+    </w:p>
+    <w:p>
+      <w:pPr>
+        <w:pStyle w:val="ListParagraph"/>
+        <w:numPr>
+          <w:ilvl w:val="1"/>
+          <w:numId w:val="22"/>
+        </w:numPr>
+      </w:pPr>
+      <w:r>
+        <w:t>EVENT.ignore()</w:t>
+      </w:r>
+    </w:p>
+    <w:p>
+      <w:pPr>
+        <w:pStyle w:val="ListParagraph"/>
+        <w:numPr>
+          <w:ilvl w:val="2"/>
+          <w:numId w:val="22"/>
+        </w:numPr>
+      </w:pPr>
+      <w:r>
+        <w:t>Bublles up the event to the hierarchy.</w:t>
+      </w:r>
+    </w:p>
+    <w:p/>
+    <w:p/>
+    <w:p>
+      <w:pPr>
+        <w:jc w:val="center"/>
+        <w:rPr>
+          <w:b/>
+          <w:bCs/>
+          <w:i/>
+          <w:iCs/>
+          <w:sz w:val="36"/>
+          <w:szCs w:val="36"/>
+          <w:u w:val="single"/>
+        </w:rPr>
+      </w:pPr>
+      <w:r>
+        <w:rPr>
+          <w:b/>
+          <w:bCs/>
+          <w:i/>
+          <w:iCs/>
+          <w:sz w:val="36"/>
+          <w:szCs w:val="36"/>
+          <w:u w:val="single"/>
+        </w:rPr>
+        <w:t>Event Hierarchy</w:t>
+      </w:r>
+    </w:p>
+    <w:p>
+      <w:r>
+        <w:t xml:space="preserve">In PyQt, every widget is part of two hierarchies: </w:t>
+      </w:r>
+    </w:p>
+    <w:p>
+      <w:pPr>
+        <w:pStyle w:val="ListParagraph"/>
+        <w:numPr>
+          <w:ilvl w:val="0"/>
+          <w:numId w:val="25"/>
+        </w:numPr>
+      </w:pPr>
+      <w:r>
+        <w:t xml:space="preserve">Python Object Hierarchy </w:t>
+      </w:r>
+    </w:p>
+    <w:p>
+      <w:pPr>
+        <w:pStyle w:val="ListParagraph"/>
+        <w:numPr>
+          <w:ilvl w:val="1"/>
+          <w:numId w:val="25"/>
+        </w:numPr>
+      </w:pPr>
+      <w:r>
+        <w:t>Python Inheritance Forwarding</w:t>
+      </w:r>
+    </w:p>
+    <w:p>
+      <w:pPr>
+        <w:pStyle w:val="ListParagraph"/>
+        <w:numPr>
+          <w:ilvl w:val="2"/>
+          <w:numId w:val="25"/>
+        </w:numPr>
+      </w:pPr>
+      <w:r>
+        <w:t>Polymorphism and Inheritance</w:t>
+      </w:r>
+    </w:p>
+    <w:p>
+      <w:pPr>
+        <w:pStyle w:val="ListParagraph"/>
+        <w:numPr>
+          <w:ilvl w:val="0"/>
+          <w:numId w:val="25"/>
+        </w:numPr>
+      </w:pPr>
+      <w:r>
+        <w:t>Qt Layout Hierarchy.</w:t>
+      </w:r>
+    </w:p>
+    <w:p>
+      <w:pPr>
+        <w:pStyle w:val="ListParagraph"/>
+        <w:numPr>
+          <w:ilvl w:val="1"/>
+          <w:numId w:val="25"/>
+        </w:numPr>
+      </w:pPr>
+      <w:r>
+        <w:t>Layout Forwarding</w:t>
+      </w:r>
+    </w:p>
+    <w:p>
+      <w:pPr>
+        <w:pStyle w:val="ListParagraph"/>
+        <w:numPr>
+          <w:ilvl w:val="2"/>
+          <w:numId w:val="25"/>
+        </w:numPr>
+      </w:pPr>
+      <w:r>
+        <w:t>Events are passed to the uppermost widget in the UI. So, a button receives the event before the window.</w:t>
+      </w:r>
+    </w:p>
+    <w:p>
+      <w:pPr>
+        <w:pStyle w:val="ListParagraph"/>
+        <w:numPr>
+          <w:ilvl w:val="2"/>
+          <w:numId w:val="25"/>
+        </w:numPr>
+      </w:pPr>
+      <w:r>
+        <w:t>If the uppermost widget cannot or chooses not to handle the event, the event will pass to the parent widget, which will given a turn to handle the event.</w:t>
+      </w:r>
+    </w:p>
+    <w:p>
+      <w:pPr>
+        <w:pStyle w:val="ListParagraph"/>
+        <w:numPr>
+          <w:ilvl w:val="2"/>
+          <w:numId w:val="25"/>
+        </w:numPr>
+      </w:pPr>
+      <w:r>
+        <w:t>This bubbling mechanic continues all the way up the nested widgets, until either the widget has been handled or it reaches the main window.</w:t>
+      </w:r>
+    </w:p>
+    <w:p/>
     <w:sectPr>
       <w:headerReference w:type="default" r:id="rId8"/>
       <w:pgSz w:w="12240" w:h="15840"/>
@@ -2701,6 +2958,119 @@
     </w:lvl>
   </w:abstractNum>
   <w:abstractNum w:abstractNumId="8" w15:restartNumberingAfterBreak="0">
+    <w:nsid w:val="431F40A1"/>
+    <w:multiLevelType w:val="hybridMultilevel"/>
+    <w:tmpl w:val="6966C5CE"/>
+    <w:lvl w:ilvl="0" w:tplc="04090001">
+      <w:start w:val="1"/>
+      <w:numFmt w:val="bullet"/>
+      <w:lvlText w:val=""/>
+      <w:lvlJc w:val="left"/>
+      <w:pPr>
+        <w:ind w:left="720" w:hanging="360"/>
+      </w:pPr>
+      <w:rPr>
+        <w:rFonts w:ascii="Symbol" w:hAnsi="Symbol" w:hint="default"/>
+      </w:rPr>
+    </w:lvl>
+    <w:lvl w:ilvl="1" w:tplc="04090003">
+      <w:start w:val="1"/>
+      <w:numFmt w:val="bullet"/>
+      <w:lvlText w:val="o"/>
+      <w:lvlJc w:val="left"/>
+      <w:pPr>
+        <w:ind w:left="1440" w:hanging="360"/>
+      </w:pPr>
+      <w:rPr>
+        <w:rFonts w:ascii="Courier New" w:hAnsi="Courier New" w:cs="Courier New" w:hint="default"/>
+      </w:rPr>
+    </w:lvl>
+    <w:lvl w:ilvl="2" w:tplc="04090005" w:tentative="1">
+      <w:start w:val="1"/>
+      <w:numFmt w:val="bullet"/>
+      <w:lvlText w:val=""/>
+      <w:lvlJc w:val="left"/>
+      <w:pPr>
+        <w:ind w:left="2160" w:hanging="360"/>
+      </w:pPr>
+      <w:rPr>
+        <w:rFonts w:ascii="Wingdings" w:hAnsi="Wingdings" w:hint="default"/>
+      </w:rPr>
+    </w:lvl>
+    <w:lvl w:ilvl="3" w:tplc="04090001" w:tentative="1">
+      <w:start w:val="1"/>
+      <w:numFmt w:val="bullet"/>
+      <w:lvlText w:val=""/>
+      <w:lvlJc w:val="left"/>
+      <w:pPr>
+        <w:ind w:left="2880" w:hanging="360"/>
+      </w:pPr>
+      <w:rPr>
+        <w:rFonts w:ascii="Symbol" w:hAnsi="Symbol" w:hint="default"/>
+      </w:rPr>
+    </w:lvl>
+    <w:lvl w:ilvl="4" w:tplc="04090003" w:tentative="1">
+      <w:start w:val="1"/>
+      <w:numFmt w:val="bullet"/>
+      <w:lvlText w:val="o"/>
+      <w:lvlJc w:val="left"/>
+      <w:pPr>
+        <w:ind w:left="3600" w:hanging="360"/>
+      </w:pPr>
+      <w:rPr>
+        <w:rFonts w:ascii="Courier New" w:hAnsi="Courier New" w:cs="Courier New" w:hint="default"/>
+      </w:rPr>
+    </w:lvl>
+    <w:lvl w:ilvl="5" w:tplc="04090005" w:tentative="1">
+      <w:start w:val="1"/>
+      <w:numFmt w:val="bullet"/>
+      <w:lvlText w:val=""/>
+      <w:lvlJc w:val="left"/>
+      <w:pPr>
+        <w:ind w:left="4320" w:hanging="360"/>
+      </w:pPr>
+      <w:rPr>
+        <w:rFonts w:ascii="Wingdings" w:hAnsi="Wingdings" w:hint="default"/>
+      </w:rPr>
+    </w:lvl>
+    <w:lvl w:ilvl="6" w:tplc="04090001" w:tentative="1">
+      <w:start w:val="1"/>
+      <w:numFmt w:val="bullet"/>
+      <w:lvlText w:val=""/>
+      <w:lvlJc w:val="left"/>
+      <w:pPr>
+        <w:ind w:left="5040" w:hanging="360"/>
+      </w:pPr>
+      <w:rPr>
+        <w:rFonts w:ascii="Symbol" w:hAnsi="Symbol" w:hint="default"/>
+      </w:rPr>
+    </w:lvl>
+    <w:lvl w:ilvl="7" w:tplc="04090003" w:tentative="1">
+      <w:start w:val="1"/>
+      <w:numFmt w:val="bullet"/>
+      <w:lvlText w:val="o"/>
+      <w:lvlJc w:val="left"/>
+      <w:pPr>
+        <w:ind w:left="5760" w:hanging="360"/>
+      </w:pPr>
+      <w:rPr>
+        <w:rFonts w:ascii="Courier New" w:hAnsi="Courier New" w:cs="Courier New" w:hint="default"/>
+      </w:rPr>
+    </w:lvl>
+    <w:lvl w:ilvl="8" w:tplc="04090005" w:tentative="1">
+      <w:start w:val="1"/>
+      <w:numFmt w:val="bullet"/>
+      <w:lvlText w:val=""/>
+      <w:lvlJc w:val="left"/>
+      <w:pPr>
+        <w:ind w:left="6480" w:hanging="360"/>
+      </w:pPr>
+      <w:rPr>
+        <w:rFonts w:ascii="Wingdings" w:hAnsi="Wingdings" w:hint="default"/>
+      </w:rPr>
+    </w:lvl>
+  </w:abstractNum>
+  <w:abstractNum w:abstractNumId="9" w15:restartNumberingAfterBreak="0">
     <w:nsid w:val="443B4C41"/>
     <w:multiLevelType w:val="hybridMultilevel"/>
     <w:tmpl w:val="4E44E868"/>
@@ -2790,7 +3160,7 @@
       </w:pPr>
     </w:lvl>
   </w:abstractNum>
-  <w:abstractNum w:abstractNumId="9" w15:restartNumberingAfterBreak="0">
+  <w:abstractNum w:abstractNumId="10" w15:restartNumberingAfterBreak="0">
     <w:nsid w:val="459D5B3D"/>
     <w:multiLevelType w:val="hybridMultilevel"/>
     <w:tmpl w:val="133C25DC"/>
@@ -2903,7 +3273,7 @@
       </w:rPr>
     </w:lvl>
   </w:abstractNum>
-  <w:abstractNum w:abstractNumId="10" w15:restartNumberingAfterBreak="0">
+  <w:abstractNum w:abstractNumId="11" w15:restartNumberingAfterBreak="0">
     <w:nsid w:val="45EE0583"/>
     <w:multiLevelType w:val="hybridMultilevel"/>
     <w:tmpl w:val="62BE6C00"/>
@@ -2989,7 +3359,120 @@
       </w:pPr>
     </w:lvl>
   </w:abstractNum>
-  <w:abstractNum w:abstractNumId="11" w15:restartNumberingAfterBreak="0">
+  <w:abstractNum w:abstractNumId="12" w15:restartNumberingAfterBreak="0">
+    <w:nsid w:val="46207B96"/>
+    <w:multiLevelType w:val="hybridMultilevel"/>
+    <w:tmpl w:val="1D4AFD74"/>
+    <w:lvl w:ilvl="0" w:tplc="04090001">
+      <w:start w:val="1"/>
+      <w:numFmt w:val="bullet"/>
+      <w:lvlText w:val=""/>
+      <w:lvlJc w:val="left"/>
+      <w:pPr>
+        <w:ind w:left="720" w:hanging="360"/>
+      </w:pPr>
+      <w:rPr>
+        <w:rFonts w:ascii="Symbol" w:hAnsi="Symbol" w:hint="default"/>
+      </w:rPr>
+    </w:lvl>
+    <w:lvl w:ilvl="1" w:tplc="04090003">
+      <w:start w:val="1"/>
+      <w:numFmt w:val="bullet"/>
+      <w:lvlText w:val="o"/>
+      <w:lvlJc w:val="left"/>
+      <w:pPr>
+        <w:ind w:left="1440" w:hanging="360"/>
+      </w:pPr>
+      <w:rPr>
+        <w:rFonts w:ascii="Courier New" w:hAnsi="Courier New" w:cs="Courier New" w:hint="default"/>
+      </w:rPr>
+    </w:lvl>
+    <w:lvl w:ilvl="2" w:tplc="04090005" w:tentative="1">
+      <w:start w:val="1"/>
+      <w:numFmt w:val="bullet"/>
+      <w:lvlText w:val=""/>
+      <w:lvlJc w:val="left"/>
+      <w:pPr>
+        <w:ind w:left="2160" w:hanging="360"/>
+      </w:pPr>
+      <w:rPr>
+        <w:rFonts w:ascii="Wingdings" w:hAnsi="Wingdings" w:hint="default"/>
+      </w:rPr>
+    </w:lvl>
+    <w:lvl w:ilvl="3" w:tplc="04090001" w:tentative="1">
+      <w:start w:val="1"/>
+      <w:numFmt w:val="bullet"/>
+      <w:lvlText w:val=""/>
+      <w:lvlJc w:val="left"/>
+      <w:pPr>
+        <w:ind w:left="2880" w:hanging="360"/>
+      </w:pPr>
+      <w:rPr>
+        <w:rFonts w:ascii="Symbol" w:hAnsi="Symbol" w:hint="default"/>
+      </w:rPr>
+    </w:lvl>
+    <w:lvl w:ilvl="4" w:tplc="04090003" w:tentative="1">
+      <w:start w:val="1"/>
+      <w:numFmt w:val="bullet"/>
+      <w:lvlText w:val="o"/>
+      <w:lvlJc w:val="left"/>
+      <w:pPr>
+        <w:ind w:left="3600" w:hanging="360"/>
+      </w:pPr>
+      <w:rPr>
+        <w:rFonts w:ascii="Courier New" w:hAnsi="Courier New" w:cs="Courier New" w:hint="default"/>
+      </w:rPr>
+    </w:lvl>
+    <w:lvl w:ilvl="5" w:tplc="04090005" w:tentative="1">
+      <w:start w:val="1"/>
+      <w:numFmt w:val="bullet"/>
+      <w:lvlText w:val=""/>
+      <w:lvlJc w:val="left"/>
+      <w:pPr>
+        <w:ind w:left="4320" w:hanging="360"/>
+      </w:pPr>
+      <w:rPr>
+        <w:rFonts w:ascii="Wingdings" w:hAnsi="Wingdings" w:hint="default"/>
+      </w:rPr>
+    </w:lvl>
+    <w:lvl w:ilvl="6" w:tplc="04090001" w:tentative="1">
+      <w:start w:val="1"/>
+      <w:numFmt w:val="bullet"/>
+      <w:lvlText w:val=""/>
+      <w:lvlJc w:val="left"/>
+      <w:pPr>
+        <w:ind w:left="5040" w:hanging="360"/>
+      </w:pPr>
+      <w:rPr>
+        <w:rFonts w:ascii="Symbol" w:hAnsi="Symbol" w:hint="default"/>
+      </w:rPr>
+    </w:lvl>
+    <w:lvl w:ilvl="7" w:tplc="04090003" w:tentative="1">
+      <w:start w:val="1"/>
+      <w:numFmt w:val="bullet"/>
+      <w:lvlText w:val="o"/>
+      <w:lvlJc w:val="left"/>
+      <w:pPr>
+        <w:ind w:left="5760" w:hanging="360"/>
+      </w:pPr>
+      <w:rPr>
+        <w:rFonts w:ascii="Courier New" w:hAnsi="Courier New" w:cs="Courier New" w:hint="default"/>
+      </w:rPr>
+    </w:lvl>
+    <w:lvl w:ilvl="8" w:tplc="04090005" w:tentative="1">
+      <w:start w:val="1"/>
+      <w:numFmt w:val="bullet"/>
+      <w:lvlText w:val=""/>
+      <w:lvlJc w:val="left"/>
+      <w:pPr>
+        <w:ind w:left="6480" w:hanging="360"/>
+      </w:pPr>
+      <w:rPr>
+        <w:rFonts w:ascii="Wingdings" w:hAnsi="Wingdings" w:hint="default"/>
+      </w:rPr>
+    </w:lvl>
+  </w:abstractNum>
+  <w:abstractNum w:abstractNumId="13" w15:restartNumberingAfterBreak="0">
     <w:nsid w:val="4C7D0AF3"/>
     <w:multiLevelType w:val="hybridMultilevel"/>
     <w:tmpl w:val="4BF8E956"/>
@@ -3079,7 +3562,7 @@
       </w:pPr>
     </w:lvl>
   </w:abstractNum>
-  <w:abstractNum w:abstractNumId="12" w15:restartNumberingAfterBreak="0">
+  <w:abstractNum w:abstractNumId="14" w15:restartNumberingAfterBreak="0">
     <w:nsid w:val="4CD84B4C"/>
     <w:multiLevelType w:val="hybridMultilevel"/>
     <w:tmpl w:val="C4D489C4"/>
@@ -3169,7 +3652,7 @@
       </w:pPr>
     </w:lvl>
   </w:abstractNum>
-  <w:abstractNum w:abstractNumId="13" w15:restartNumberingAfterBreak="0">
+  <w:abstractNum w:abstractNumId="15" w15:restartNumberingAfterBreak="0">
     <w:nsid w:val="597B1A34"/>
     <w:multiLevelType w:val="hybridMultilevel"/>
     <w:tmpl w:val="25849922"/>
@@ -3282,7 +3765,93 @@
       </w:rPr>
     </w:lvl>
   </w:abstractNum>
-  <w:abstractNum w:abstractNumId="14" w15:restartNumberingAfterBreak="0">
+  <w:abstractNum w:abstractNumId="16" w15:restartNumberingAfterBreak="0">
+    <w:nsid w:val="5AD42FE0"/>
+    <w:multiLevelType w:val="hybridMultilevel"/>
+    <w:tmpl w:val="DD92E936"/>
+    <w:lvl w:ilvl="0" w:tplc="0409000F">
+      <w:start w:val="1"/>
+      <w:numFmt w:val="decimal"/>
+      <w:lvlText w:val="%1."/>
+      <w:lvlJc w:val="left"/>
+      <w:pPr>
+        <w:ind w:left="720" w:hanging="360"/>
+      </w:pPr>
+    </w:lvl>
+    <w:lvl w:ilvl="1" w:tplc="04090019">
+      <w:start w:val="1"/>
+      <w:numFmt w:val="lowerLetter"/>
+      <w:lvlText w:val="%2."/>
+      <w:lvlJc w:val="left"/>
+      <w:pPr>
+        <w:ind w:left="1440" w:hanging="360"/>
+      </w:pPr>
+    </w:lvl>
+    <w:lvl w:ilvl="2" w:tplc="0409001B">
+      <w:start w:val="1"/>
+      <w:numFmt w:val="lowerRoman"/>
+      <w:lvlText w:val="%3."/>
+      <w:lvlJc w:val="right"/>
+      <w:pPr>
+        <w:ind w:left="2160" w:hanging="180"/>
+      </w:pPr>
+    </w:lvl>
+    <w:lvl w:ilvl="3" w:tplc="0409000F" w:tentative="1">
+      <w:start w:val="1"/>
+      <w:numFmt w:val="decimal"/>
+      <w:lvlText w:val="%4."/>
+      <w:lvlJc w:val="left"/>
+      <w:pPr>
+        <w:ind w:left="2880" w:hanging="360"/>
+      </w:pPr>
+    </w:lvl>
+    <w:lvl w:ilvl="4" w:tplc="04090019" w:tentative="1">
+      <w:start w:val="1"/>
+      <w:numFmt w:val="lowerLetter"/>
+      <w:lvlText w:val="%5."/>
+      <w:lvlJc w:val="left"/>
+      <w:pPr>
+        <w:ind w:left="3600" w:hanging="360"/>
+      </w:pPr>
+    </w:lvl>
+    <w:lvl w:ilvl="5" w:tplc="0409001B" w:tentative="1">
+      <w:start w:val="1"/>
+      <w:numFmt w:val="lowerRoman"/>
+      <w:lvlText w:val="%6."/>
+      <w:lvlJc w:val="right"/>
+      <w:pPr>
+        <w:ind w:left="4320" w:hanging="180"/>
+      </w:pPr>
+    </w:lvl>
+    <w:lvl w:ilvl="6" w:tplc="0409000F" w:tentative="1">
+      <w:start w:val="1"/>
+      <w:numFmt w:val="decimal"/>
+      <w:lvlText w:val="%7."/>
+      <w:lvlJc w:val="left"/>
+      <w:pPr>
+        <w:ind w:left="5040" w:hanging="360"/>
+      </w:pPr>
+    </w:lvl>
+    <w:lvl w:ilvl="7" w:tplc="04090019" w:tentative="1">
+      <w:start w:val="1"/>
+      <w:numFmt w:val="lowerLetter"/>
+      <w:lvlText w:val="%8."/>
+      <w:lvlJc w:val="left"/>
+      <w:pPr>
+        <w:ind w:left="5760" w:hanging="360"/>
+      </w:pPr>
+    </w:lvl>
+    <w:lvl w:ilvl="8" w:tplc="0409001B" w:tentative="1">
+      <w:start w:val="1"/>
+      <w:numFmt w:val="lowerRoman"/>
+      <w:lvlText w:val="%9."/>
+      <w:lvlJc w:val="right"/>
+      <w:pPr>
+        <w:ind w:left="6480" w:hanging="180"/>
+      </w:pPr>
+    </w:lvl>
+  </w:abstractNum>
+  <w:abstractNum w:abstractNumId="17" w15:restartNumberingAfterBreak="0">
     <w:nsid w:val="5E6C1899"/>
     <w:multiLevelType w:val="hybridMultilevel"/>
     <w:tmpl w:val="61AEE986"/>
@@ -3395,7 +3964,7 @@
       </w:rPr>
     </w:lvl>
   </w:abstractNum>
-  <w:abstractNum w:abstractNumId="15" w15:restartNumberingAfterBreak="0">
+  <w:abstractNum w:abstractNumId="18" w15:restartNumberingAfterBreak="0">
     <w:nsid w:val="66B32F58"/>
     <w:multiLevelType w:val="hybridMultilevel"/>
     <w:tmpl w:val="2FFE94DC"/>
@@ -3508,7 +4077,7 @@
       </w:rPr>
     </w:lvl>
   </w:abstractNum>
-  <w:abstractNum w:abstractNumId="16" w15:restartNumberingAfterBreak="0">
+  <w:abstractNum w:abstractNumId="19" w15:restartNumberingAfterBreak="0">
     <w:nsid w:val="685C4D63"/>
     <w:multiLevelType w:val="hybridMultilevel"/>
     <w:tmpl w:val="3C40DEEA"/>
@@ -3594,7 +4163,7 @@
       </w:pPr>
     </w:lvl>
   </w:abstractNum>
-  <w:abstractNum w:abstractNumId="17" w15:restartNumberingAfterBreak="0">
+  <w:abstractNum w:abstractNumId="20" w15:restartNumberingAfterBreak="0">
     <w:nsid w:val="6EF50048"/>
     <w:multiLevelType w:val="hybridMultilevel"/>
     <w:tmpl w:val="1172B504"/>
@@ -3684,7 +4253,7 @@
       </w:pPr>
     </w:lvl>
   </w:abstractNum>
-  <w:abstractNum w:abstractNumId="18" w15:restartNumberingAfterBreak="0">
+  <w:abstractNum w:abstractNumId="21" w15:restartNumberingAfterBreak="0">
     <w:nsid w:val="724D37F8"/>
     <w:multiLevelType w:val="hybridMultilevel"/>
     <w:tmpl w:val="E520BF9C"/>
@@ -3770,7 +4339,7 @@
       </w:pPr>
     </w:lvl>
   </w:abstractNum>
-  <w:abstractNum w:abstractNumId="19" w15:restartNumberingAfterBreak="0">
+  <w:abstractNum w:abstractNumId="22" w15:restartNumberingAfterBreak="0">
     <w:nsid w:val="72B678BD"/>
     <w:multiLevelType w:val="hybridMultilevel"/>
     <w:tmpl w:val="5F62A33C"/>
@@ -3856,7 +4425,7 @@
       </w:pPr>
     </w:lvl>
   </w:abstractNum>
-  <w:abstractNum w:abstractNumId="20" w15:restartNumberingAfterBreak="0">
+  <w:abstractNum w:abstractNumId="23" w15:restartNumberingAfterBreak="0">
     <w:nsid w:val="7A8F015C"/>
     <w:multiLevelType w:val="hybridMultilevel"/>
     <w:tmpl w:val="4DB8F6D2"/>
@@ -3969,7 +4538,7 @@
       </w:rPr>
     </w:lvl>
   </w:abstractNum>
-  <w:abstractNum w:abstractNumId="21" w15:restartNumberingAfterBreak="0">
+  <w:abstractNum w:abstractNumId="24" w15:restartNumberingAfterBreak="0">
     <w:nsid w:val="7C1212A2"/>
     <w:multiLevelType w:val="hybridMultilevel"/>
     <w:tmpl w:val="710C7A38"/>
@@ -4059,13 +4628,13 @@
     </w:lvl>
   </w:abstractNum>
   <w:num w:numId="1" w16cid:durableId="1269125091">
-    <w:abstractNumId w:val="20"/>
+    <w:abstractNumId w:val="23"/>
   </w:num>
   <w:num w:numId="2" w16cid:durableId="884294248">
     <w:abstractNumId w:val="7"/>
   </w:num>
   <w:num w:numId="3" w16cid:durableId="1249538410">
-    <w:abstractNumId w:val="14"/>
+    <w:abstractNumId w:val="17"/>
   </w:num>
   <w:num w:numId="4" w16cid:durableId="1453749934">
     <w:abstractNumId w:val="1"/>
@@ -4077,52 +4646,61 @@
     <w:abstractNumId w:val="3"/>
   </w:num>
   <w:num w:numId="7" w16cid:durableId="720904575">
-    <w:abstractNumId w:val="10"/>
+    <w:abstractNumId w:val="11"/>
   </w:num>
   <w:num w:numId="8" w16cid:durableId="2000842609">
+    <w:abstractNumId w:val="24"/>
+  </w:num>
+  <w:num w:numId="9" w16cid:durableId="661197433">
     <w:abstractNumId w:val="21"/>
   </w:num>
-  <w:num w:numId="9" w16cid:durableId="661197433">
-    <w:abstractNumId w:val="18"/>
-  </w:num>
   <w:num w:numId="10" w16cid:durableId="1118447454">
-    <w:abstractNumId w:val="16"/>
+    <w:abstractNumId w:val="19"/>
   </w:num>
   <w:num w:numId="11" w16cid:durableId="476339819">
-    <w:abstractNumId w:val="19"/>
+    <w:abstractNumId w:val="22"/>
   </w:num>
   <w:num w:numId="12" w16cid:durableId="2097163918">
     <w:abstractNumId w:val="6"/>
   </w:num>
   <w:num w:numId="13" w16cid:durableId="1902784036">
-    <w:abstractNumId w:val="15"/>
+    <w:abstractNumId w:val="18"/>
   </w:num>
   <w:num w:numId="14" w16cid:durableId="1308631457">
-    <w:abstractNumId w:val="9"/>
+    <w:abstractNumId w:val="10"/>
   </w:num>
   <w:num w:numId="15" w16cid:durableId="1719864982">
-    <w:abstractNumId w:val="12"/>
+    <w:abstractNumId w:val="14"/>
   </w:num>
   <w:num w:numId="16" w16cid:durableId="1326936491">
-    <w:abstractNumId w:val="17"/>
+    <w:abstractNumId w:val="20"/>
   </w:num>
   <w:num w:numId="17" w16cid:durableId="1046485271">
     <w:abstractNumId w:val="5"/>
   </w:num>
   <w:num w:numId="18" w16cid:durableId="1699232923">
-    <w:abstractNumId w:val="11"/>
+    <w:abstractNumId w:val="13"/>
   </w:num>
   <w:num w:numId="19" w16cid:durableId="1600486298">
     <w:abstractNumId w:val="2"/>
   </w:num>
   <w:num w:numId="20" w16cid:durableId="865220796">
-    <w:abstractNumId w:val="8"/>
+    <w:abstractNumId w:val="9"/>
   </w:num>
   <w:num w:numId="21" w16cid:durableId="396586451">
     <w:abstractNumId w:val="0"/>
   </w:num>
   <w:num w:numId="22" w16cid:durableId="812478983">
-    <w:abstractNumId w:val="13"/>
+    <w:abstractNumId w:val="15"/>
+  </w:num>
+  <w:num w:numId="23" w16cid:durableId="674920417">
+    <w:abstractNumId w:val="8"/>
+  </w:num>
+  <w:num w:numId="24" w16cid:durableId="2122146270">
+    <w:abstractNumId w:val="12"/>
+  </w:num>
+  <w:num w:numId="25" w16cid:durableId="764500296">
+    <w:abstractNumId w:val="16"/>
   </w:num>
 </w:numbering>
 </file>

</xml_diff>

<commit_message>
LESSON 3: Some PyQt6 Widgets (COMPLETE)
</commit_message>
<xml_diff>
--- a/pythogui.com notes.docx
+++ b/pythogui.com notes.docx
@@ -426,7 +426,7 @@
     <w:p>
       <w:r>
         <w:pict w14:anchorId="01DD9C5F">
-          <v:rect id="_x0000_i1027" style="width:0;height:1.5pt" o:hralign="center" o:hrstd="t" o:hr="t" fillcolor="#a0a0a0" stroked="f"/>
+          <v:rect id="_x0000_i1025" style="width:0;height:1.5pt" o:hralign="center" o:hrstd="t" o:hr="t" fillcolor="#a0a0a0" stroked="f"/>
         </w:pict>
       </w:r>
     </w:p>
@@ -456,6 +456,18 @@
         </w:rPr>
         <w:t>QtWidget</w:t>
       </w:r>
+      <w:r>
+        <w:rPr>
+          <w:b/>
+          <w:bCs/>
+          <w:i/>
+          <w:iCs/>
+          <w:sz w:val="40"/>
+          <w:szCs w:val="40"/>
+          <w:u w:val="single"/>
+        </w:rPr>
+        <w:t>s</w:t>
+      </w:r>
     </w:p>
     <w:p>
       <w:pPr>
@@ -557,6 +569,86 @@
       <w:pPr>
         <w:pStyle w:val="ListParagraph"/>
         <w:numPr>
+          <w:ilvl w:val="1"/>
+          <w:numId w:val="14"/>
+        </w:numPr>
+      </w:pPr>
+      <w:r>
+        <w:t>.setCentralWidget(&lt;QtWidget&gt;=self)</w:t>
+      </w:r>
+      <w:r>
+        <w:tab/>
+        <w:t>inserts the widget at the center of the window and allows that widget to be altered by calling .centralWidget()</w:t>
+      </w:r>
+    </w:p>
+    <w:p>
+      <w:pPr>
+        <w:pStyle w:val="ListParagraph"/>
+        <w:numPr>
+          <w:ilvl w:val="1"/>
+          <w:numId w:val="14"/>
+        </w:numPr>
+      </w:pPr>
+      <w:r>
+        <w:t>.centralWidget()</w:t>
+      </w:r>
+      <w:r>
+        <w:tab/>
+        <w:t>gets the central widget.</w:t>
+      </w:r>
+    </w:p>
+    <w:p>
+      <w:pPr>
+        <w:pStyle w:val="ListParagraph"/>
+        <w:numPr>
+          <w:ilvl w:val="1"/>
+          <w:numId w:val="14"/>
+        </w:numPr>
+      </w:pPr>
+      <w:r>
+        <w:t>Signals:</w:t>
+      </w:r>
+    </w:p>
+    <w:p>
+      <w:pPr>
+        <w:pStyle w:val="ListParagraph"/>
+        <w:numPr>
+          <w:ilvl w:val="2"/>
+          <w:numId w:val="14"/>
+        </w:numPr>
+      </w:pPr>
+      <w:r>
+        <w:t>.windowTitleChanged</w:t>
+      </w:r>
+    </w:p>
+    <w:p>
+      <w:pPr>
+        <w:pStyle w:val="ListParagraph"/>
+        <w:numPr>
+          <w:ilvl w:val="3"/>
+          <w:numId w:val="14"/>
+        </w:numPr>
+      </w:pPr>
+      <w:r>
+        <w:t>Title of the main window is changed.</w:t>
+      </w:r>
+    </w:p>
+    <w:p>
+      <w:pPr>
+        <w:pStyle w:val="ListParagraph"/>
+        <w:numPr>
+          <w:ilvl w:val="3"/>
+          <w:numId w:val="14"/>
+        </w:numPr>
+      </w:pPr>
+      <w:r>
+        <w:t>New title is different from old title</w:t>
+      </w:r>
+    </w:p>
+    <w:p>
+      <w:pPr>
+        <w:pStyle w:val="ListParagraph"/>
+        <w:numPr>
           <w:ilvl w:val="0"/>
           <w:numId w:val="14"/>
         </w:numPr>
@@ -579,6 +671,9 @@
       <w:r>
         <w:t>UI Element</w:t>
       </w:r>
+      <w:r>
+        <w:t xml:space="preserve"> that the user can interact with.</w:t>
+      </w:r>
     </w:p>
     <w:p>
       <w:pPr>
@@ -596,6 +691,18 @@
       <w:pPr>
         <w:pStyle w:val="ListParagraph"/>
         <w:numPr>
+          <w:ilvl w:val="1"/>
+          <w:numId w:val="14"/>
+        </w:numPr>
+      </w:pPr>
+      <w:r>
+        <w:t>No special function</w:t>
+      </w:r>
+    </w:p>
+    <w:p>
+      <w:pPr>
+        <w:pStyle w:val="ListParagraph"/>
+        <w:numPr>
           <w:ilvl w:val="0"/>
           <w:numId w:val="19"/>
         </w:numPr>
@@ -625,7 +732,92 @@
         </w:numPr>
       </w:pPr>
       <w:r>
-        <w:t>Takes a string parameter. Shows the string over the button</w:t>
+        <w:t>Takes a string parameter</w:t>
+      </w:r>
+      <w:r>
+        <w:t xml:space="preserve"> and s</w:t>
+      </w:r>
+      <w:r>
+        <w:t>hows the string over the button</w:t>
+      </w:r>
+    </w:p>
+    <w:p>
+      <w:pPr>
+        <w:pStyle w:val="ListParagraph"/>
+        <w:numPr>
+          <w:ilvl w:val="1"/>
+          <w:numId w:val="19"/>
+        </w:numPr>
+      </w:pPr>
+      <w:r>
+        <w:t>Signals:</w:t>
+      </w:r>
+    </w:p>
+    <w:p>
+      <w:pPr>
+        <w:pStyle w:val="ListParagraph"/>
+        <w:numPr>
+          <w:ilvl w:val="2"/>
+          <w:numId w:val="19"/>
+        </w:numPr>
+      </w:pPr>
+      <w:r>
+        <w:t>.clicked</w:t>
+      </w:r>
+    </w:p>
+    <w:p>
+      <w:pPr>
+        <w:pStyle w:val="ListParagraph"/>
+        <w:numPr>
+          <w:ilvl w:val="3"/>
+          <w:numId w:val="19"/>
+        </w:numPr>
+      </w:pPr>
+      <w:r>
+        <w:t>Mouse clicks the button and releases while it is still within the border of the button.</w:t>
+      </w:r>
+    </w:p>
+    <w:p>
+      <w:pPr>
+        <w:pStyle w:val="ListParagraph"/>
+        <w:numPr>
+          <w:ilvl w:val="3"/>
+          <w:numId w:val="19"/>
+        </w:numPr>
+      </w:pPr>
+      <w:r>
+        <w:t xml:space="preserve">sends </w:t>
+      </w:r>
+      <w:r>
+        <w:t xml:space="preserve">&lt;bool&gt; </w:t>
+      </w:r>
+      <w:r>
+        <w:t>to the slot</w:t>
+      </w:r>
+    </w:p>
+    <w:p>
+      <w:pPr>
+        <w:pStyle w:val="ListParagraph"/>
+        <w:numPr>
+          <w:ilvl w:val="2"/>
+          <w:numId w:val="19"/>
+        </w:numPr>
+      </w:pPr>
+      <w:r>
+        <w:t>.released</w:t>
+      </w:r>
+    </w:p>
+    <w:p>
+      <w:pPr>
+        <w:pStyle w:val="ListParagraph"/>
+        <w:numPr>
+          <w:ilvl w:val="3"/>
+          <w:numId w:val="19"/>
+        </w:numPr>
+      </w:pPr>
+      <w:r>
+        <w:lastRenderedPageBreak/>
+        <w:t>Mouse clicks and is released anywhere.</w:t>
       </w:r>
     </w:p>
     <w:p>
@@ -656,6 +848,54 @@
       <w:pPr>
         <w:pStyle w:val="ListParagraph"/>
         <w:numPr>
+          <w:ilvl w:val="1"/>
+          <w:numId w:val="19"/>
+        </w:numPr>
+      </w:pPr>
+      <w:r>
+        <w:t>.setText(</w:t>
+      </w:r>
+      <w:r>
+        <w:t>&lt;string&gt;</w:t>
+      </w:r>
+      <w:r>
+        <w:t>) changes text display on the label</w:t>
+      </w:r>
+    </w:p>
+    <w:p>
+      <w:pPr>
+        <w:pStyle w:val="ListParagraph"/>
+        <w:numPr>
+          <w:ilvl w:val="1"/>
+          <w:numId w:val="19"/>
+        </w:numPr>
+      </w:pPr>
+      <w:r>
+        <w:t>.setFont(</w:t>
+      </w:r>
+      <w:r>
+        <w:t>&lt;QFont&gt;</w:t>
+      </w:r>
+      <w:r>
+        <w:t>) changes the font of text display</w:t>
+      </w:r>
+    </w:p>
+    <w:p>
+      <w:pPr>
+        <w:pStyle w:val="ListParagraph"/>
+        <w:numPr>
+          <w:ilvl w:val="1"/>
+          <w:numId w:val="19"/>
+        </w:numPr>
+      </w:pPr>
+      <w:r>
+        <w:t>.setPixmap(&lt;QPixmap&gt;) changes to image display</w:t>
+      </w:r>
+    </w:p>
+    <w:p>
+      <w:pPr>
+        <w:pStyle w:val="ListParagraph"/>
+        <w:numPr>
           <w:ilvl w:val="0"/>
           <w:numId w:val="19"/>
         </w:numPr>
@@ -673,7 +913,182 @@
         </w:numPr>
       </w:pPr>
       <w:r>
-        <w:t>Text input box</w:t>
+        <w:t xml:space="preserve">Single-line text editing </w:t>
+      </w:r>
+      <w:r>
+        <w:t>box</w:t>
+      </w:r>
+    </w:p>
+    <w:p>
+      <w:pPr>
+        <w:pStyle w:val="ListParagraph"/>
+        <w:numPr>
+          <w:ilvl w:val="1"/>
+          <w:numId w:val="19"/>
+        </w:numPr>
+      </w:pPr>
+      <w:r>
+        <w:t>.setMaxLength(&lt;int&gt;)</w:t>
+      </w:r>
+      <w:r>
+        <w:tab/>
+        <w:t>set maximum length of input</w:t>
+      </w:r>
+    </w:p>
+    <w:p>
+      <w:pPr>
+        <w:pStyle w:val="ListParagraph"/>
+        <w:numPr>
+          <w:ilvl w:val="1"/>
+          <w:numId w:val="19"/>
+        </w:numPr>
+      </w:pPr>
+      <w:r>
+        <w:t>.setPlaceholderText(&lt;str&gt;)</w:t>
+      </w:r>
+      <w:r>
+        <w:tab/>
+        <w:t>set background text when nothing is being input</w:t>
+      </w:r>
+    </w:p>
+    <w:p>
+      <w:pPr>
+        <w:pStyle w:val="ListParagraph"/>
+        <w:numPr>
+          <w:ilvl w:val="1"/>
+          <w:numId w:val="19"/>
+        </w:numPr>
+      </w:pPr>
+      <w:r>
+        <w:t>.setReadOnly(&lt;bool&gt;=False)</w:t>
+      </w:r>
+      <w:r>
+        <w:tab/>
+        <w:t>make line edit uneditable and read only</w:t>
+      </w:r>
+    </w:p>
+    <w:p>
+      <w:pPr>
+        <w:pStyle w:val="ListParagraph"/>
+        <w:numPr>
+          <w:ilvl w:val="1"/>
+          <w:numId w:val="19"/>
+        </w:numPr>
+      </w:pPr>
+      <w:r>
+        <w:t>.setInputMask(&lt;str&gt;)</w:t>
+      </w:r>
+      <w:r>
+        <w:tab/>
+        <w:t xml:space="preserve">restricts input to only accept the format described by the string. 0 represents any digit while “ ” represents any character. </w:t>
+      </w:r>
+    </w:p>
+    <w:p>
+      <w:pPr>
+        <w:pStyle w:val="ListParagraph"/>
+        <w:numPr>
+          <w:ilvl w:val="1"/>
+          <w:numId w:val="19"/>
+        </w:numPr>
+      </w:pPr>
+      <w:r>
+        <w:t>Signals:</w:t>
+      </w:r>
+    </w:p>
+    <w:p>
+      <w:pPr>
+        <w:pStyle w:val="ListParagraph"/>
+        <w:numPr>
+          <w:ilvl w:val="2"/>
+          <w:numId w:val="19"/>
+        </w:numPr>
+      </w:pPr>
+      <w:r>
+        <w:t>.returnPressed</w:t>
+      </w:r>
+    </w:p>
+    <w:p>
+      <w:pPr>
+        <w:pStyle w:val="ListParagraph"/>
+        <w:numPr>
+          <w:ilvl w:val="3"/>
+          <w:numId w:val="19"/>
+        </w:numPr>
+      </w:pPr>
+      <w:r>
+        <w:t>When ENTER is pressed</w:t>
+      </w:r>
+    </w:p>
+    <w:p>
+      <w:pPr>
+        <w:pStyle w:val="ListParagraph"/>
+        <w:numPr>
+          <w:ilvl w:val="2"/>
+          <w:numId w:val="19"/>
+        </w:numPr>
+      </w:pPr>
+      <w:r>
+        <w:t>.selectionChanged</w:t>
+      </w:r>
+    </w:p>
+    <w:p>
+      <w:pPr>
+        <w:pStyle w:val="ListParagraph"/>
+        <w:numPr>
+          <w:ilvl w:val="3"/>
+          <w:numId w:val="19"/>
+        </w:numPr>
+      </w:pPr>
+      <w:r>
+        <w:t>When text is selected holding the LMB or (SHIFT+LEFT/RIGHT)</w:t>
+      </w:r>
+    </w:p>
+    <w:p>
+      <w:pPr>
+        <w:pStyle w:val="ListParagraph"/>
+        <w:numPr>
+          <w:ilvl w:val="2"/>
+          <w:numId w:val="19"/>
+        </w:numPr>
+      </w:pPr>
+      <w:r>
+        <w:t>.textChanged</w:t>
+      </w:r>
+    </w:p>
+    <w:p>
+      <w:pPr>
+        <w:pStyle w:val="ListParagraph"/>
+        <w:numPr>
+          <w:ilvl w:val="3"/>
+          <w:numId w:val="19"/>
+        </w:numPr>
+      </w:pPr>
+      <w:r>
+        <w:t>When text is changed</w:t>
+      </w:r>
+    </w:p>
+    <w:p>
+      <w:pPr>
+        <w:pStyle w:val="ListParagraph"/>
+        <w:numPr>
+          <w:ilvl w:val="2"/>
+          <w:numId w:val="19"/>
+        </w:numPr>
+      </w:pPr>
+      <w:r>
+        <w:t>.textEdited</w:t>
+      </w:r>
+    </w:p>
+    <w:p>
+      <w:pPr>
+        <w:pStyle w:val="ListParagraph"/>
+        <w:numPr>
+          <w:ilvl w:val="3"/>
+          <w:numId w:val="19"/>
+        </w:numPr>
+      </w:pPr>
+      <w:r>
+        <w:t>When text is edited by the user</w:t>
       </w:r>
     </w:p>
     <w:p>
@@ -697,9 +1112,1522 @@
         </w:numPr>
       </w:pPr>
       <w:r>
-        <w:t>A menu of QAction obejcts</w:t>
-      </w:r>
-    </w:p>
+        <w:t>A</w:t>
+      </w:r>
+      <w:r>
+        <w:t>n interactive list</w:t>
+      </w:r>
+      <w:r>
+        <w:t xml:space="preserve"> of QAction obejcts</w:t>
+      </w:r>
+    </w:p>
+    <w:p>
+      <w:pPr>
+        <w:pStyle w:val="ListParagraph"/>
+        <w:numPr>
+          <w:ilvl w:val="1"/>
+          <w:numId w:val="19"/>
+        </w:numPr>
+      </w:pPr>
+      <w:r>
+        <w:t>.addAction(&lt;QAction&gt;) adds action to the menu</w:t>
+      </w:r>
+    </w:p>
+    <w:p>
+      <w:pPr>
+        <w:pStyle w:val="ListParagraph"/>
+        <w:numPr>
+          <w:ilvl w:val="0"/>
+          <w:numId w:val="19"/>
+        </w:numPr>
+      </w:pPr>
+      <w:r>
+        <w:t>QCheckBox</w:t>
+      </w:r>
+    </w:p>
+    <w:p>
+      <w:pPr>
+        <w:pStyle w:val="ListParagraph"/>
+        <w:numPr>
+          <w:ilvl w:val="1"/>
+          <w:numId w:val="19"/>
+        </w:numPr>
+      </w:pPr>
+      <w:r>
+        <w:t>A checkbox</w:t>
+      </w:r>
+    </w:p>
+    <w:p>
+      <w:pPr>
+        <w:pStyle w:val="ListParagraph"/>
+        <w:numPr>
+          <w:ilvl w:val="1"/>
+          <w:numId w:val="19"/>
+        </w:numPr>
+      </w:pPr>
+      <w:r>
+        <w:t xml:space="preserve">.setCheckState(&lt;Qt.CheckState.flag&gt;sets the checkbox’s check state </w:t>
+      </w:r>
+    </w:p>
+    <w:p>
+      <w:pPr>
+        <w:pStyle w:val="ListParagraph"/>
+        <w:numPr>
+          <w:ilvl w:val="1"/>
+          <w:numId w:val="19"/>
+        </w:numPr>
+      </w:pPr>
+      <w:r>
+        <w:t>By default, a Checkbox has 2 states: Checked and Unchecked, and starts out Unchecked</w:t>
+      </w:r>
+    </w:p>
+    <w:p>
+      <w:pPr>
+        <w:pStyle w:val="ListParagraph"/>
+        <w:numPr>
+          <w:ilvl w:val="1"/>
+          <w:numId w:val="19"/>
+        </w:numPr>
+      </w:pPr>
+      <w:r>
+        <w:t>Tristate checkboxes add another state: PartiallyChecked</w:t>
+      </w:r>
+    </w:p>
+    <w:p>
+      <w:pPr>
+        <w:pStyle w:val="ListParagraph"/>
+        <w:numPr>
+          <w:ilvl w:val="1"/>
+          <w:numId w:val="19"/>
+        </w:numPr>
+      </w:pPr>
+      <w:r>
+        <w:t>.setTristate(&lt;bool&gt;)</w:t>
+      </w:r>
+      <w:r>
+        <w:tab/>
+        <w:t>converts checkbox to tri-state checkbox</w:t>
+      </w:r>
+    </w:p>
+    <w:p>
+      <w:pPr>
+        <w:pStyle w:val="ListParagraph"/>
+        <w:numPr>
+          <w:ilvl w:val="1"/>
+          <w:numId w:val="19"/>
+        </w:numPr>
+      </w:pPr>
+      <w:r>
+        <w:t>.setChecked(&lt;bool&gt;)</w:t>
+      </w:r>
+      <w:r>
+        <w:tab/>
+        <w:t>puts the checkbox in Checked state</w:t>
+      </w:r>
+    </w:p>
+    <w:p>
+      <w:pPr>
+        <w:pStyle w:val="ListParagraph"/>
+        <w:numPr>
+          <w:ilvl w:val="0"/>
+          <w:numId w:val="19"/>
+        </w:numPr>
+      </w:pPr>
+      <w:r>
+        <w:t>QRadioButton</w:t>
+      </w:r>
+    </w:p>
+    <w:p>
+      <w:pPr>
+        <w:pStyle w:val="ListParagraph"/>
+        <w:numPr>
+          <w:ilvl w:val="1"/>
+          <w:numId w:val="19"/>
+        </w:numPr>
+      </w:pPr>
+    </w:p>
+    <w:p>
+      <w:pPr>
+        <w:pStyle w:val="ListParagraph"/>
+        <w:numPr>
+          <w:ilvl w:val="0"/>
+          <w:numId w:val="19"/>
+        </w:numPr>
+      </w:pPr>
+      <w:r>
+        <w:t>QComboBox</w:t>
+      </w:r>
+    </w:p>
+    <w:p>
+      <w:pPr>
+        <w:pStyle w:val="ListParagraph"/>
+        <w:numPr>
+          <w:ilvl w:val="1"/>
+          <w:numId w:val="19"/>
+        </w:numPr>
+      </w:pPr>
+      <w:r>
+        <w:t>A dropdown box</w:t>
+      </w:r>
+      <w:r>
+        <w:t xml:space="preserve"> with list of items</w:t>
+      </w:r>
+    </w:p>
+    <w:p>
+      <w:pPr>
+        <w:pStyle w:val="ListParagraph"/>
+        <w:numPr>
+          <w:ilvl w:val="1"/>
+          <w:numId w:val="19"/>
+        </w:numPr>
+      </w:pPr>
+      <w:r>
+        <w:lastRenderedPageBreak/>
+        <w:t>Acts like it has a index pointer</w:t>
+      </w:r>
+    </w:p>
+    <w:p>
+      <w:pPr>
+        <w:pStyle w:val="ListParagraph"/>
+        <w:numPr>
+          <w:ilvl w:val="1"/>
+          <w:numId w:val="19"/>
+        </w:numPr>
+      </w:pPr>
+      <w:r>
+        <w:t>.addItem(&lt;str&gt;), .addItems(&lt;list[str]&gt;)</w:t>
+      </w:r>
+    </w:p>
+    <w:p>
+      <w:pPr>
+        <w:pStyle w:val="ListParagraph"/>
+        <w:numPr>
+          <w:ilvl w:val="1"/>
+          <w:numId w:val="19"/>
+        </w:numPr>
+      </w:pPr>
+      <w:r>
+        <w:t xml:space="preserve">.setEditable(&lt;bool&gt;=False) </w:t>
+      </w:r>
+      <w:r>
+        <w:tab/>
+      </w:r>
+    </w:p>
+    <w:p>
+      <w:pPr>
+        <w:pStyle w:val="ListParagraph"/>
+        <w:numPr>
+          <w:ilvl w:val="2"/>
+          <w:numId w:val="19"/>
+        </w:numPr>
+      </w:pPr>
+      <w:r>
+        <w:t>makes the</w:t>
+      </w:r>
+      <w:r>
+        <w:t xml:space="preserve"> items in the</w:t>
+      </w:r>
+      <w:r>
+        <w:t xml:space="preserve"> combobox editable</w:t>
+      </w:r>
+    </w:p>
+    <w:p>
+      <w:pPr>
+        <w:pStyle w:val="ListParagraph"/>
+        <w:numPr>
+          <w:ilvl w:val="1"/>
+          <w:numId w:val="19"/>
+        </w:numPr>
+      </w:pPr>
+      <w:r>
+        <w:t>.setInsertPolicy(&lt;QComboBox.InsertPolicy.flag&gt;=NoInsert)</w:t>
+      </w:r>
+      <w:r>
+        <w:tab/>
+        <w:t>determine how items are added to the combobox</w:t>
+      </w:r>
+    </w:p>
+    <w:p>
+      <w:pPr>
+        <w:pStyle w:val="ListParagraph"/>
+        <w:numPr>
+          <w:ilvl w:val="1"/>
+          <w:numId w:val="19"/>
+        </w:numPr>
+      </w:pPr>
+      <w:r>
+        <w:t>.setMaxCount(&lt;int&gt;)</w:t>
+      </w:r>
+      <w:r>
+        <w:tab/>
+        <w:t>limit the number of items allowed in the box</w:t>
+      </w:r>
+    </w:p>
+    <w:p>
+      <w:pPr>
+        <w:pStyle w:val="ListParagraph"/>
+        <w:numPr>
+          <w:ilvl w:val="1"/>
+          <w:numId w:val="19"/>
+        </w:numPr>
+      </w:pPr>
+      <w:r>
+        <w:t>Signals:</w:t>
+      </w:r>
+    </w:p>
+    <w:p>
+      <w:pPr>
+        <w:pStyle w:val="ListParagraph"/>
+        <w:numPr>
+          <w:ilvl w:val="2"/>
+          <w:numId w:val="19"/>
+        </w:numPr>
+      </w:pPr>
+      <w:r>
+        <w:t>.</w:t>
+      </w:r>
+      <w:r>
+        <w:t>currentIndexChanged</w:t>
+      </w:r>
+    </w:p>
+    <w:p>
+      <w:pPr>
+        <w:pStyle w:val="ListParagraph"/>
+        <w:numPr>
+          <w:ilvl w:val="3"/>
+          <w:numId w:val="19"/>
+        </w:numPr>
+      </w:pPr>
+      <w:r>
+        <w:t>when</w:t>
+      </w:r>
+      <w:r>
+        <w:t xml:space="preserve"> the index of current </w:t>
+      </w:r>
+      <w:r>
+        <w:t xml:space="preserve">item is </w:t>
+      </w:r>
+      <w:r>
+        <w:t>changed</w:t>
+      </w:r>
+      <w:r>
+        <w:t xml:space="preserve"> / another item is selected</w:t>
+      </w:r>
+    </w:p>
+    <w:p>
+      <w:pPr>
+        <w:pStyle w:val="ListParagraph"/>
+        <w:numPr>
+          <w:ilvl w:val="3"/>
+          <w:numId w:val="19"/>
+        </w:numPr>
+      </w:pPr>
+      <w:r>
+        <w:t>sends the index of the item</w:t>
+      </w:r>
+      <w:r>
+        <w:t xml:space="preserve"> as integer</w:t>
+      </w:r>
+      <w:r>
+        <w:t xml:space="preserve"> to </w:t>
+      </w:r>
+      <w:r>
+        <w:t xml:space="preserve">the </w:t>
+      </w:r>
+      <w:r>
+        <w:t>slot</w:t>
+      </w:r>
+    </w:p>
+    <w:p>
+      <w:pPr>
+        <w:pStyle w:val="ListParagraph"/>
+        <w:numPr>
+          <w:ilvl w:val="2"/>
+          <w:numId w:val="19"/>
+        </w:numPr>
+      </w:pPr>
+      <w:r>
+        <w:t>.</w:t>
+      </w:r>
+      <w:r>
+        <w:t>currentTextChanged</w:t>
+      </w:r>
+    </w:p>
+    <w:p>
+      <w:pPr>
+        <w:pStyle w:val="ListParagraph"/>
+        <w:numPr>
+          <w:ilvl w:val="3"/>
+          <w:numId w:val="19"/>
+        </w:numPr>
+      </w:pPr>
+      <w:r>
+        <w:t xml:space="preserve">when text of </w:t>
+      </w:r>
+      <w:r>
+        <w:t xml:space="preserve">current </w:t>
+      </w:r>
+      <w:r>
+        <w:t>item is changed</w:t>
+      </w:r>
+      <w:r>
+        <w:t xml:space="preserve"> / another item is selected</w:t>
+      </w:r>
+    </w:p>
+    <w:p>
+      <w:pPr>
+        <w:pStyle w:val="ListParagraph"/>
+        <w:numPr>
+          <w:ilvl w:val="3"/>
+          <w:numId w:val="19"/>
+        </w:numPr>
+      </w:pPr>
+      <w:r>
+        <w:t xml:space="preserve">sends the text of the item </w:t>
+      </w:r>
+      <w:r>
+        <w:t xml:space="preserve">as string </w:t>
+      </w:r>
+      <w:r>
+        <w:t>to the slot</w:t>
+      </w:r>
+    </w:p>
+    <w:p>
+      <w:pPr>
+        <w:pStyle w:val="ListParagraph"/>
+        <w:numPr>
+          <w:ilvl w:val="0"/>
+          <w:numId w:val="19"/>
+        </w:numPr>
+      </w:pPr>
+      <w:r>
+        <w:t>QLisWidget</w:t>
+      </w:r>
+    </w:p>
+    <w:p>
+      <w:pPr>
+        <w:pStyle w:val="ListParagraph"/>
+        <w:numPr>
+          <w:ilvl w:val="1"/>
+          <w:numId w:val="19"/>
+        </w:numPr>
+      </w:pPr>
+      <w:r>
+        <w:t>Similar to QComboBox, except options are presented as scrollable list of items and not a dropdown</w:t>
+      </w:r>
+    </w:p>
+    <w:p>
+      <w:pPr>
+        <w:pStyle w:val="ListParagraph"/>
+        <w:numPr>
+          <w:ilvl w:val="1"/>
+          <w:numId w:val="19"/>
+        </w:numPr>
+      </w:pPr>
+      <w:r>
+        <w:t>.addItem(&lt;str&gt;), .addItems(&lt;list[str]&gt;)</w:t>
+      </w:r>
+    </w:p>
+    <w:p>
+      <w:pPr>
+        <w:pStyle w:val="ListParagraph"/>
+        <w:numPr>
+          <w:ilvl w:val="1"/>
+          <w:numId w:val="19"/>
+        </w:numPr>
+      </w:pPr>
+      <w:r>
+        <w:t>Signals:</w:t>
+      </w:r>
+    </w:p>
+    <w:p>
+      <w:pPr>
+        <w:pStyle w:val="ListParagraph"/>
+        <w:numPr>
+          <w:ilvl w:val="2"/>
+          <w:numId w:val="19"/>
+        </w:numPr>
+      </w:pPr>
+      <w:r>
+        <w:t>currentItemChanged</w:t>
+      </w:r>
+    </w:p>
+    <w:p>
+      <w:pPr>
+        <w:pStyle w:val="ListParagraph"/>
+        <w:numPr>
+          <w:ilvl w:val="3"/>
+          <w:numId w:val="19"/>
+        </w:numPr>
+      </w:pPr>
+      <w:r>
+        <w:t>when current item is changed</w:t>
+      </w:r>
+      <w:r>
+        <w:t xml:space="preserve"> / another item is selected</w:t>
+      </w:r>
+    </w:p>
+    <w:p>
+      <w:pPr>
+        <w:pStyle w:val="ListParagraph"/>
+        <w:numPr>
+          <w:ilvl w:val="3"/>
+          <w:numId w:val="19"/>
+        </w:numPr>
+      </w:pPr>
+      <w:r>
+        <w:t xml:space="preserve">returns PyQt6.QtWidgets.QListWidgetItem object </w:t>
+      </w:r>
+      <w:r>
+        <w:t>to the</w:t>
+      </w:r>
+      <w:r>
+        <w:t xml:space="preserve"> slot</w:t>
+      </w:r>
+    </w:p>
+    <w:p>
+      <w:pPr>
+        <w:pStyle w:val="ListParagraph"/>
+        <w:numPr>
+          <w:ilvl w:val="2"/>
+          <w:numId w:val="19"/>
+        </w:numPr>
+      </w:pPr>
+      <w:r>
+        <w:t>currentTextChanged</w:t>
+      </w:r>
+    </w:p>
+    <w:p>
+      <w:pPr>
+        <w:pStyle w:val="ListParagraph"/>
+        <w:numPr>
+          <w:ilvl w:val="3"/>
+          <w:numId w:val="19"/>
+        </w:numPr>
+      </w:pPr>
+      <w:r>
+        <w:t>when text of current item is changed</w:t>
+      </w:r>
+      <w:r>
+        <w:t xml:space="preserve"> </w:t>
+      </w:r>
+      <w:r>
+        <w:t>/ another item is selected</w:t>
+      </w:r>
+    </w:p>
+    <w:p>
+      <w:pPr>
+        <w:pStyle w:val="ListParagraph"/>
+        <w:numPr>
+          <w:ilvl w:val="3"/>
+          <w:numId w:val="19"/>
+        </w:numPr>
+      </w:pPr>
+      <w:r>
+        <w:t>return text of the item as string to the slot</w:t>
+      </w:r>
+    </w:p>
+    <w:p>
+      <w:pPr>
+        <w:pStyle w:val="ListParagraph"/>
+        <w:numPr>
+          <w:ilvl w:val="0"/>
+          <w:numId w:val="19"/>
+        </w:numPr>
+      </w:pPr>
+      <w:r>
+        <w:t>QDateEdit</w:t>
+      </w:r>
+    </w:p>
+    <w:p>
+      <w:pPr>
+        <w:pStyle w:val="ListParagraph"/>
+        <w:numPr>
+          <w:ilvl w:val="1"/>
+          <w:numId w:val="19"/>
+        </w:numPr>
+      </w:pPr>
+      <w:r>
+        <w:t>For editing dates</w:t>
+      </w:r>
+    </w:p>
+    <w:p>
+      <w:pPr>
+        <w:pStyle w:val="ListParagraph"/>
+        <w:numPr>
+          <w:ilvl w:val="0"/>
+          <w:numId w:val="19"/>
+        </w:numPr>
+      </w:pPr>
+      <w:r>
+        <w:t>QTimeEdit</w:t>
+      </w:r>
+    </w:p>
+    <w:p>
+      <w:pPr>
+        <w:pStyle w:val="ListParagraph"/>
+        <w:numPr>
+          <w:ilvl w:val="1"/>
+          <w:numId w:val="19"/>
+        </w:numPr>
+      </w:pPr>
+      <w:r>
+        <w:t>For editing times</w:t>
+      </w:r>
+    </w:p>
+    <w:p>
+      <w:pPr>
+        <w:pStyle w:val="ListParagraph"/>
+        <w:numPr>
+          <w:ilvl w:val="0"/>
+          <w:numId w:val="19"/>
+        </w:numPr>
+      </w:pPr>
+      <w:r>
+        <w:t>QDateTimeEdit</w:t>
+      </w:r>
+    </w:p>
+    <w:p>
+      <w:pPr>
+        <w:pStyle w:val="ListParagraph"/>
+        <w:numPr>
+          <w:ilvl w:val="1"/>
+          <w:numId w:val="19"/>
+        </w:numPr>
+      </w:pPr>
+      <w:r>
+        <w:t>For editing dates and times</w:t>
+      </w:r>
+    </w:p>
+    <w:p>
+      <w:pPr>
+        <w:pStyle w:val="ListParagraph"/>
+        <w:numPr>
+          <w:ilvl w:val="0"/>
+          <w:numId w:val="19"/>
+        </w:numPr>
+      </w:pPr>
+      <w:r>
+        <w:t>QSpinBox</w:t>
+      </w:r>
+    </w:p>
+    <w:p>
+      <w:pPr>
+        <w:pStyle w:val="ListParagraph"/>
+        <w:numPr>
+          <w:ilvl w:val="1"/>
+          <w:numId w:val="19"/>
+        </w:numPr>
+      </w:pPr>
+      <w:r>
+        <w:t>An integer spinner</w:t>
+      </w:r>
+      <w:r>
+        <w:t>/ numerical input box</w:t>
+      </w:r>
+    </w:p>
+    <w:p>
+      <w:pPr>
+        <w:pStyle w:val="ListParagraph"/>
+        <w:numPr>
+          <w:ilvl w:val="1"/>
+          <w:numId w:val="19"/>
+        </w:numPr>
+      </w:pPr>
+      <w:r>
+        <w:t>Arrows to increase or decrease value</w:t>
+      </w:r>
+    </w:p>
+    <w:p>
+      <w:pPr>
+        <w:pStyle w:val="ListParagraph"/>
+        <w:numPr>
+          <w:ilvl w:val="1"/>
+          <w:numId w:val="19"/>
+        </w:numPr>
+      </w:pPr>
+      <w:r>
+        <w:t>.setMininum(&lt;int&gt;), .setMaximum(&lt;int&gt;)</w:t>
+      </w:r>
+    </w:p>
+    <w:p>
+      <w:pPr>
+        <w:pStyle w:val="ListParagraph"/>
+        <w:numPr>
+          <w:ilvl w:val="1"/>
+          <w:numId w:val="19"/>
+        </w:numPr>
+      </w:pPr>
+      <w:r>
+        <w:t>.setRange(</w:t>
+      </w:r>
+      <w:r>
+        <w:t>&lt;int&gt;, &lt;int&gt;</w:t>
+      </w:r>
+      <w:r>
+        <w:t>)</w:t>
+      </w:r>
+      <w:r>
+        <w:t xml:space="preserve"> sets range from lower bound to upper bound inclusive</w:t>
+      </w:r>
+    </w:p>
+    <w:p>
+      <w:pPr>
+        <w:pStyle w:val="ListParagraph"/>
+        <w:numPr>
+          <w:ilvl w:val="1"/>
+          <w:numId w:val="19"/>
+        </w:numPr>
+      </w:pPr>
+      <w:r>
+        <w:lastRenderedPageBreak/>
+        <w:t>.setPrefix(&lt;str&gt;), .setSuffix(&lt;str&gt;)</w:t>
+      </w:r>
+      <w:r>
+        <w:tab/>
+        <w:t>adds text display in input box</w:t>
+      </w:r>
+    </w:p>
+    <w:p>
+      <w:pPr>
+        <w:pStyle w:val="ListParagraph"/>
+        <w:numPr>
+          <w:ilvl w:val="1"/>
+          <w:numId w:val="19"/>
+        </w:numPr>
+      </w:pPr>
+      <w:r>
+        <w:t>.setSingleStep(&lt;int&gt;=1)</w:t>
+      </w:r>
+      <w:r>
+        <w:tab/>
+        <w:t>how many steps to jump each increase or decrease input</w:t>
+      </w:r>
+    </w:p>
+    <w:p>
+      <w:pPr>
+        <w:pStyle w:val="ListParagraph"/>
+        <w:numPr>
+          <w:ilvl w:val="1"/>
+          <w:numId w:val="19"/>
+        </w:numPr>
+      </w:pPr>
+      <w:r>
+        <w:t>.lineEdit()</w:t>
+      </w:r>
+      <w:r>
+        <w:tab/>
+        <w:t>allows user to manually edit the spinbox without using the arrows</w:t>
+      </w:r>
+    </w:p>
+    <w:p>
+      <w:pPr>
+        <w:pStyle w:val="ListParagraph"/>
+        <w:numPr>
+          <w:ilvl w:val="1"/>
+          <w:numId w:val="19"/>
+        </w:numPr>
+      </w:pPr>
+      <w:r>
+        <w:t>.setReadOnly(&lt;bool&gt;=False)</w:t>
+      </w:r>
+      <w:r>
+        <w:tab/>
+        <w:t>makes it read only</w:t>
+      </w:r>
+    </w:p>
+    <w:p>
+      <w:pPr>
+        <w:pStyle w:val="ListParagraph"/>
+        <w:numPr>
+          <w:ilvl w:val="1"/>
+          <w:numId w:val="19"/>
+        </w:numPr>
+      </w:pPr>
+      <w:r>
+        <w:t>Additionally, .lineEdi().setReadOnly(True) is the default function</w:t>
+      </w:r>
+    </w:p>
+    <w:p>
+      <w:pPr>
+        <w:pStyle w:val="ListParagraph"/>
+        <w:numPr>
+          <w:ilvl w:val="1"/>
+          <w:numId w:val="19"/>
+        </w:numPr>
+      </w:pPr>
+      <w:r>
+        <w:t>Signals:</w:t>
+      </w:r>
+    </w:p>
+    <w:p>
+      <w:pPr>
+        <w:pStyle w:val="ListParagraph"/>
+        <w:numPr>
+          <w:ilvl w:val="2"/>
+          <w:numId w:val="19"/>
+        </w:numPr>
+      </w:pPr>
+      <w:r>
+        <w:t>.valueChanged</w:t>
+      </w:r>
+    </w:p>
+    <w:p>
+      <w:pPr>
+        <w:pStyle w:val="ListParagraph"/>
+        <w:numPr>
+          <w:ilvl w:val="3"/>
+          <w:numId w:val="19"/>
+        </w:numPr>
+      </w:pPr>
+      <w:r>
+        <w:t>When the value of input box is changed</w:t>
+      </w:r>
+    </w:p>
+    <w:p>
+      <w:pPr>
+        <w:pStyle w:val="ListParagraph"/>
+        <w:numPr>
+          <w:ilvl w:val="3"/>
+          <w:numId w:val="19"/>
+        </w:numPr>
+      </w:pPr>
+      <w:r>
+        <w:t>Sends the int value to the slot</w:t>
+      </w:r>
+    </w:p>
+    <w:p>
+      <w:pPr>
+        <w:pStyle w:val="ListParagraph"/>
+        <w:numPr>
+          <w:ilvl w:val="2"/>
+          <w:numId w:val="19"/>
+        </w:numPr>
+      </w:pPr>
+      <w:r>
+        <w:t>textChanged</w:t>
+      </w:r>
+    </w:p>
+    <w:p>
+      <w:pPr>
+        <w:pStyle w:val="ListParagraph"/>
+        <w:numPr>
+          <w:ilvl w:val="3"/>
+          <w:numId w:val="19"/>
+        </w:numPr>
+      </w:pPr>
+      <w:r>
+        <w:t>When the value of input box is changed</w:t>
+      </w:r>
+    </w:p>
+    <w:p>
+      <w:pPr>
+        <w:pStyle w:val="ListParagraph"/>
+        <w:numPr>
+          <w:ilvl w:val="3"/>
+          <w:numId w:val="19"/>
+        </w:numPr>
+      </w:pPr>
+      <w:r>
+        <w:t>Sends a string comprised of the value along with prefix and suffix to the slot</w:t>
+      </w:r>
+    </w:p>
+    <w:p>
+      <w:pPr>
+        <w:pStyle w:val="ListParagraph"/>
+        <w:numPr>
+          <w:ilvl w:val="0"/>
+          <w:numId w:val="19"/>
+        </w:numPr>
+      </w:pPr>
+      <w:r>
+        <w:t>QDoubleSpinBox</w:t>
+      </w:r>
+    </w:p>
+    <w:p>
+      <w:pPr>
+        <w:pStyle w:val="ListParagraph"/>
+        <w:numPr>
+          <w:ilvl w:val="1"/>
+          <w:numId w:val="19"/>
+        </w:numPr>
+      </w:pPr>
+      <w:r>
+        <w:t>Similar to SpinBox but for floats instead</w:t>
+      </w:r>
+    </w:p>
+    <w:p>
+      <w:pPr>
+        <w:pStyle w:val="ListParagraph"/>
+        <w:numPr>
+          <w:ilvl w:val="1"/>
+          <w:numId w:val="19"/>
+        </w:numPr>
+      </w:pPr>
+      <w:r>
+        <w:t>.setMininum(&lt;</w:t>
+      </w:r>
+      <w:r>
+        <w:t>float</w:t>
+      </w:r>
+      <w:r>
+        <w:t>&gt;), .setMaximum(&lt;</w:t>
+      </w:r>
+      <w:r>
+        <w:t>float</w:t>
+      </w:r>
+      <w:r>
+        <w:t>&gt;)</w:t>
+      </w:r>
+    </w:p>
+    <w:p>
+      <w:pPr>
+        <w:pStyle w:val="ListParagraph"/>
+        <w:numPr>
+          <w:ilvl w:val="1"/>
+          <w:numId w:val="19"/>
+        </w:numPr>
+      </w:pPr>
+      <w:r>
+        <w:t>.setRange(&lt;</w:t>
+      </w:r>
+      <w:r>
+        <w:t>float</w:t>
+      </w:r>
+      <w:r>
+        <w:t>&gt;, &lt;</w:t>
+      </w:r>
+      <w:r>
+        <w:t>float</w:t>
+      </w:r>
+      <w:r>
+        <w:t>&gt;) sets range from lower bound to upper bound inclusive</w:t>
+      </w:r>
+    </w:p>
+    <w:p>
+      <w:pPr>
+        <w:pStyle w:val="ListParagraph"/>
+        <w:numPr>
+          <w:ilvl w:val="1"/>
+          <w:numId w:val="19"/>
+        </w:numPr>
+      </w:pPr>
+      <w:r>
+        <w:t>.setPrefix(&lt;str&gt;), .setSuffix(&lt;str&gt;)</w:t>
+      </w:r>
+      <w:r>
+        <w:tab/>
+        <w:t>adds text display in input box</w:t>
+      </w:r>
+    </w:p>
+    <w:p>
+      <w:pPr>
+        <w:pStyle w:val="ListParagraph"/>
+        <w:numPr>
+          <w:ilvl w:val="1"/>
+          <w:numId w:val="19"/>
+        </w:numPr>
+      </w:pPr>
+      <w:r>
+        <w:t>.setSingleStep(&lt;</w:t>
+      </w:r>
+      <w:r>
+        <w:t>float</w:t>
+      </w:r>
+      <w:r>
+        <w:t>&gt;</w:t>
+      </w:r>
+      <w:r>
+        <w:t>=1</w:t>
+      </w:r>
+      <w:r>
+        <w:t>)</w:t>
+      </w:r>
+      <w:r>
+        <w:tab/>
+        <w:t>how many steps to jump each increase or decrease input</w:t>
+      </w:r>
+    </w:p>
+    <w:p>
+      <w:pPr>
+        <w:pStyle w:val="ListParagraph"/>
+        <w:numPr>
+          <w:ilvl w:val="1"/>
+          <w:numId w:val="19"/>
+        </w:numPr>
+      </w:pPr>
+      <w:r>
+        <w:t>.lineEdit()</w:t>
+      </w:r>
+      <w:r>
+        <w:tab/>
+        <w:t>allows user to manually edit the spinbox without using the arrows</w:t>
+      </w:r>
+    </w:p>
+    <w:p>
+      <w:pPr>
+        <w:pStyle w:val="ListParagraph"/>
+        <w:numPr>
+          <w:ilvl w:val="1"/>
+          <w:numId w:val="19"/>
+        </w:numPr>
+      </w:pPr>
+      <w:r>
+        <w:t>.setReadOnly(&lt;bool&gt;=False)</w:t>
+      </w:r>
+      <w:r>
+        <w:tab/>
+        <w:t>makes it read only</w:t>
+      </w:r>
+    </w:p>
+    <w:p>
+      <w:pPr>
+        <w:pStyle w:val="ListParagraph"/>
+        <w:numPr>
+          <w:ilvl w:val="1"/>
+          <w:numId w:val="19"/>
+        </w:numPr>
+      </w:pPr>
+      <w:r>
+        <w:t>Additionally, .lineEdi().setReadOnly(True) is the default function</w:t>
+      </w:r>
+    </w:p>
+    <w:p>
+      <w:pPr>
+        <w:pStyle w:val="ListParagraph"/>
+        <w:numPr>
+          <w:ilvl w:val="1"/>
+          <w:numId w:val="19"/>
+        </w:numPr>
+      </w:pPr>
+      <w:r>
+        <w:t>Signals:</w:t>
+      </w:r>
+    </w:p>
+    <w:p>
+      <w:pPr>
+        <w:pStyle w:val="ListParagraph"/>
+        <w:numPr>
+          <w:ilvl w:val="2"/>
+          <w:numId w:val="19"/>
+        </w:numPr>
+      </w:pPr>
+      <w:r>
+        <w:t>.valueChanged</w:t>
+      </w:r>
+    </w:p>
+    <w:p>
+      <w:pPr>
+        <w:pStyle w:val="ListParagraph"/>
+        <w:numPr>
+          <w:ilvl w:val="3"/>
+          <w:numId w:val="19"/>
+        </w:numPr>
+      </w:pPr>
+      <w:r>
+        <w:t>When the value of input box is changed</w:t>
+      </w:r>
+    </w:p>
+    <w:p>
+      <w:pPr>
+        <w:pStyle w:val="ListParagraph"/>
+        <w:numPr>
+          <w:ilvl w:val="3"/>
+          <w:numId w:val="19"/>
+        </w:numPr>
+      </w:pPr>
+      <w:r>
+        <w:t xml:space="preserve">Sends the </w:t>
+      </w:r>
+      <w:r>
+        <w:t xml:space="preserve">float </w:t>
+      </w:r>
+      <w:r>
+        <w:t>value to the slot</w:t>
+      </w:r>
+    </w:p>
+    <w:p>
+      <w:pPr>
+        <w:pStyle w:val="ListParagraph"/>
+        <w:numPr>
+          <w:ilvl w:val="2"/>
+          <w:numId w:val="19"/>
+        </w:numPr>
+      </w:pPr>
+      <w:r>
+        <w:t>textChanged</w:t>
+      </w:r>
+    </w:p>
+    <w:p>
+      <w:pPr>
+        <w:pStyle w:val="ListParagraph"/>
+        <w:numPr>
+          <w:ilvl w:val="3"/>
+          <w:numId w:val="19"/>
+        </w:numPr>
+      </w:pPr>
+      <w:r>
+        <w:t>When the value of input box is changed</w:t>
+      </w:r>
+    </w:p>
+    <w:p>
+      <w:pPr>
+        <w:pStyle w:val="ListParagraph"/>
+        <w:numPr>
+          <w:ilvl w:val="3"/>
+          <w:numId w:val="19"/>
+        </w:numPr>
+      </w:pPr>
+      <w:r>
+        <w:t>Sends a string comprised of the value along with prefix and suffix to the slot</w:t>
+      </w:r>
+    </w:p>
+    <w:p>
+      <w:pPr>
+        <w:pStyle w:val="ListParagraph"/>
+        <w:numPr>
+          <w:ilvl w:val="0"/>
+          <w:numId w:val="19"/>
+        </w:numPr>
+      </w:pPr>
+      <w:r>
+        <w:t>QSlider</w:t>
+      </w:r>
+    </w:p>
+    <w:p>
+      <w:pPr>
+        <w:pStyle w:val="ListParagraph"/>
+        <w:numPr>
+          <w:ilvl w:val="1"/>
+          <w:numId w:val="19"/>
+        </w:numPr>
+      </w:pPr>
+      <w:r>
+        <w:t>A slider widget</w:t>
+      </w:r>
+    </w:p>
+    <w:p>
+      <w:pPr>
+        <w:pStyle w:val="ListParagraph"/>
+        <w:numPr>
+          <w:ilvl w:val="1"/>
+          <w:numId w:val="19"/>
+        </w:numPr>
+      </w:pPr>
+      <w:r>
+        <w:t>Can be initialized with a &lt;Qt.Orientation.flag&gt; for vertical or horizontal arrangement. Default is Vertical</w:t>
+      </w:r>
+    </w:p>
+    <w:p>
+      <w:pPr>
+        <w:pStyle w:val="ListParagraph"/>
+        <w:numPr>
+          <w:ilvl w:val="1"/>
+          <w:numId w:val="19"/>
+        </w:numPr>
+      </w:pPr>
+      <w:r>
+        <w:lastRenderedPageBreak/>
+        <w:t>.setMinimum(&lt;int&gt;)</w:t>
+      </w:r>
+      <w:r>
+        <w:tab/>
+        <w:t>sets the minimum position of the slider</w:t>
+      </w:r>
+    </w:p>
+    <w:p>
+      <w:pPr>
+        <w:pStyle w:val="ListParagraph"/>
+        <w:numPr>
+          <w:ilvl w:val="1"/>
+          <w:numId w:val="19"/>
+        </w:numPr>
+      </w:pPr>
+      <w:r>
+        <w:t>.setMaximum(&lt;int&gt;)</w:t>
+      </w:r>
+      <w:r>
+        <w:tab/>
+        <w:t>sets the maximum position of the slider</w:t>
+      </w:r>
+    </w:p>
+    <w:p>
+      <w:pPr>
+        <w:pStyle w:val="ListParagraph"/>
+        <w:numPr>
+          <w:ilvl w:val="1"/>
+          <w:numId w:val="19"/>
+        </w:numPr>
+      </w:pPr>
+      <w:r>
+        <w:t>.setRange(&lt;int&gt;, &lt;int&gt;)</w:t>
+      </w:r>
+      <w:r>
+        <w:tab/>
+        <w:t>sets range of positions for the slider</w:t>
+      </w:r>
+    </w:p>
+    <w:p>
+      <w:pPr>
+        <w:pStyle w:val="ListParagraph"/>
+        <w:numPr>
+          <w:ilvl w:val="1"/>
+          <w:numId w:val="19"/>
+        </w:numPr>
+      </w:pPr>
+      <w:r>
+        <w:t>.setSingleStep(&lt;int&gt;)</w:t>
+      </w:r>
+      <w:r>
+        <w:tab/>
+        <w:t xml:space="preserve">sets the amount of steps taken by the slider if changed using the ARROW keys on the keyboard </w:t>
+      </w:r>
+    </w:p>
+    <w:p>
+      <w:pPr>
+        <w:pStyle w:val="ListParagraph"/>
+        <w:numPr>
+          <w:ilvl w:val="1"/>
+          <w:numId w:val="19"/>
+        </w:numPr>
+      </w:pPr>
+      <w:r>
+        <w:t>Signals:</w:t>
+      </w:r>
+    </w:p>
+    <w:p>
+      <w:pPr>
+        <w:pStyle w:val="ListParagraph"/>
+        <w:numPr>
+          <w:ilvl w:val="2"/>
+          <w:numId w:val="19"/>
+        </w:numPr>
+      </w:pPr>
+      <w:r>
+        <w:t>.valueChanged</w:t>
+      </w:r>
+    </w:p>
+    <w:p>
+      <w:pPr>
+        <w:pStyle w:val="ListParagraph"/>
+        <w:numPr>
+          <w:ilvl w:val="3"/>
+          <w:numId w:val="19"/>
+        </w:numPr>
+      </w:pPr>
+      <w:r>
+        <w:t>When the value is changed</w:t>
+      </w:r>
+    </w:p>
+    <w:p>
+      <w:pPr>
+        <w:pStyle w:val="ListParagraph"/>
+        <w:numPr>
+          <w:ilvl w:val="3"/>
+          <w:numId w:val="19"/>
+        </w:numPr>
+      </w:pPr>
+      <w:r>
+        <w:t>Sends int value to the slot</w:t>
+      </w:r>
+    </w:p>
+    <w:p>
+      <w:pPr>
+        <w:pStyle w:val="ListParagraph"/>
+        <w:numPr>
+          <w:ilvl w:val="2"/>
+          <w:numId w:val="19"/>
+        </w:numPr>
+      </w:pPr>
+      <w:r>
+        <w:t>.sliderMoved</w:t>
+      </w:r>
+    </w:p>
+    <w:p>
+      <w:pPr>
+        <w:pStyle w:val="ListParagraph"/>
+        <w:numPr>
+          <w:ilvl w:val="3"/>
+          <w:numId w:val="19"/>
+        </w:numPr>
+      </w:pPr>
+      <w:r>
+        <w:t>When the slider is manually moved</w:t>
+      </w:r>
+    </w:p>
+    <w:p>
+      <w:pPr>
+        <w:pStyle w:val="ListParagraph"/>
+        <w:numPr>
+          <w:ilvl w:val="3"/>
+          <w:numId w:val="19"/>
+        </w:numPr>
+      </w:pPr>
+      <w:r>
+        <w:t>Does not trigger when the bar is clicked</w:t>
+      </w:r>
+    </w:p>
+    <w:p>
+      <w:pPr>
+        <w:pStyle w:val="ListParagraph"/>
+        <w:numPr>
+          <w:ilvl w:val="3"/>
+          <w:numId w:val="19"/>
+        </w:numPr>
+      </w:pPr>
+      <w:r>
+        <w:t>Sends an int position of slider to the slot</w:t>
+      </w:r>
+    </w:p>
+    <w:p>
+      <w:pPr>
+        <w:pStyle w:val="ListParagraph"/>
+        <w:numPr>
+          <w:ilvl w:val="2"/>
+          <w:numId w:val="19"/>
+        </w:numPr>
+      </w:pPr>
+      <w:r>
+        <w:t>.sliderPressed</w:t>
+      </w:r>
+    </w:p>
+    <w:p>
+      <w:pPr>
+        <w:pStyle w:val="ListParagraph"/>
+        <w:numPr>
+          <w:ilvl w:val="3"/>
+          <w:numId w:val="19"/>
+        </w:numPr>
+      </w:pPr>
+      <w:r>
+        <w:t>When the slider or bar is initially pressed</w:t>
+      </w:r>
+    </w:p>
+    <w:p>
+      <w:pPr>
+        <w:pStyle w:val="ListParagraph"/>
+        <w:numPr>
+          <w:ilvl w:val="2"/>
+          <w:numId w:val="19"/>
+        </w:numPr>
+      </w:pPr>
+      <w:r>
+        <w:t>.sliderReleased</w:t>
+      </w:r>
+    </w:p>
+    <w:p>
+      <w:pPr>
+        <w:pStyle w:val="ListParagraph"/>
+        <w:numPr>
+          <w:ilvl w:val="3"/>
+          <w:numId w:val="19"/>
+        </w:numPr>
+      </w:pPr>
+      <w:r>
+        <w:t>When the slider or bar press is released</w:t>
+      </w:r>
+    </w:p>
+    <w:p>
+      <w:pPr>
+        <w:pStyle w:val="ListParagraph"/>
+        <w:numPr>
+          <w:ilvl w:val="0"/>
+          <w:numId w:val="19"/>
+        </w:numPr>
+      </w:pPr>
+      <w:r>
+        <w:t>QDial</w:t>
+      </w:r>
+    </w:p>
+    <w:p>
+      <w:pPr>
+        <w:pStyle w:val="ListParagraph"/>
+        <w:numPr>
+          <w:ilvl w:val="1"/>
+          <w:numId w:val="19"/>
+        </w:numPr>
+      </w:pPr>
+      <w:r>
+        <w:t>A rotatable dial</w:t>
+      </w:r>
+    </w:p>
+    <w:p>
+      <w:pPr>
+        <w:pStyle w:val="ListParagraph"/>
+        <w:numPr>
+          <w:ilvl w:val="1"/>
+          <w:numId w:val="19"/>
+        </w:numPr>
+      </w:pPr>
+      <w:r>
+        <w:t>Similar to the slider, but it’s circular.</w:t>
+      </w:r>
+    </w:p>
+    <w:p>
+      <w:pPr>
+        <w:pStyle w:val="ListParagraph"/>
+        <w:numPr>
+          <w:ilvl w:val="1"/>
+          <w:numId w:val="19"/>
+        </w:numPr>
+      </w:pPr>
+      <w:r>
+        <w:t>Max value rotates to min value and vice versa</w:t>
+      </w:r>
+    </w:p>
+    <w:p>
+      <w:pPr>
+        <w:pStyle w:val="ListParagraph"/>
+        <w:numPr>
+          <w:ilvl w:val="0"/>
+          <w:numId w:val="19"/>
+        </w:numPr>
+      </w:pPr>
+      <w:r>
+        <w:t>QFontComboBox</w:t>
+      </w:r>
+    </w:p>
+    <w:p>
+      <w:pPr>
+        <w:pStyle w:val="ListParagraph"/>
+        <w:numPr>
+          <w:ilvl w:val="1"/>
+          <w:numId w:val="19"/>
+        </w:numPr>
+      </w:pPr>
+      <w:r>
+        <w:t>A dropdown list of fonts</w:t>
+      </w:r>
+    </w:p>
+    <w:p>
+      <w:pPr>
+        <w:pStyle w:val="ListParagraph"/>
+        <w:numPr>
+          <w:ilvl w:val="0"/>
+          <w:numId w:val="19"/>
+        </w:numPr>
+      </w:pPr>
+      <w:r>
+        <w:t>QLCDNumber</w:t>
+      </w:r>
+    </w:p>
+    <w:p>
+      <w:pPr>
+        <w:pStyle w:val="ListParagraph"/>
+        <w:numPr>
+          <w:ilvl w:val="1"/>
+          <w:numId w:val="19"/>
+        </w:numPr>
+      </w:pPr>
+      <w:r>
+        <w:t>Ugly LCD display</w:t>
+      </w:r>
+    </w:p>
+    <w:p>
+      <w:pPr>
+        <w:pStyle w:val="ListParagraph"/>
+        <w:numPr>
+          <w:ilvl w:val="0"/>
+          <w:numId w:val="19"/>
+        </w:numPr>
+      </w:pPr>
+      <w:r>
+        <w:t>QProgressBar</w:t>
+      </w:r>
+    </w:p>
+    <w:p>
+      <w:pPr>
+        <w:pStyle w:val="ListParagraph"/>
+        <w:numPr>
+          <w:ilvl w:val="1"/>
+          <w:numId w:val="19"/>
+        </w:numPr>
+      </w:pPr>
+      <w:r>
+        <w:t>A progress bar</w:t>
+      </w:r>
+    </w:p>
+    <w:p>
+      <w:pPr>
+        <w:pStyle w:val="ListParagraph"/>
+        <w:ind w:left="1440"/>
+      </w:pPr>
+    </w:p>
+    <w:p>
+      <w:pPr>
+        <w:jc w:val="center"/>
+        <w:rPr>
+          <w:b/>
+          <w:bCs/>
+          <w:i/>
+          <w:iCs/>
+          <w:sz w:val="32"/>
+          <w:szCs w:val="32"/>
+          <w:u w:val="single"/>
+        </w:rPr>
+      </w:pPr>
+      <w:r>
+        <w:rPr>
+          <w:b/>
+          <w:bCs/>
+          <w:i/>
+          <w:iCs/>
+          <w:sz w:val="32"/>
+          <w:szCs w:val="32"/>
+          <w:u w:val="single"/>
+        </w:rPr>
+        <w:t>Widget Layout Objects</w:t>
+      </w:r>
+    </w:p>
+    <w:p>
+      <w:pPr>
+        <w:pStyle w:val="ListParagraph"/>
+        <w:numPr>
+          <w:ilvl w:val="0"/>
+          <w:numId w:val="26"/>
+        </w:numPr>
+      </w:pPr>
+      <w:r>
+        <w:t>QVBoxLayout</w:t>
+      </w:r>
+    </w:p>
+    <w:p>
+      <w:pPr>
+        <w:pStyle w:val="ListParagraph"/>
+        <w:numPr>
+          <w:ilvl w:val="1"/>
+          <w:numId w:val="26"/>
+        </w:numPr>
+      </w:pPr>
+      <w:r>
+        <w:t>Vertical aligned layout</w:t>
+      </w:r>
+    </w:p>
+    <w:p>
+      <w:pPr>
+        <w:pStyle w:val="ListParagraph"/>
+        <w:numPr>
+          <w:ilvl w:val="0"/>
+          <w:numId w:val="26"/>
+        </w:numPr>
+      </w:pPr>
+      <w:r>
+        <w:t>QHBoxLayour</w:t>
+      </w:r>
+    </w:p>
+    <w:p>
+      <w:pPr>
+        <w:pStyle w:val="ListParagraph"/>
+        <w:numPr>
+          <w:ilvl w:val="1"/>
+          <w:numId w:val="26"/>
+        </w:numPr>
+      </w:pPr>
+      <w:r>
+        <w:t>Horizontal aligned layout</w:t>
+      </w:r>
+    </w:p>
+    <w:p/>
     <w:p>
       <w:pPr>
         <w:pBdr>
@@ -768,7 +2696,22 @@
         </w:numPr>
       </w:pPr>
       <w:r>
-        <w:t>stores all qt constants and identifiers. Example: Qt.MouseButton</w:t>
+        <w:t>stores all qt constants and identifiers.</w:t>
+      </w:r>
+    </w:p>
+    <w:p>
+      <w:pPr>
+        <w:pStyle w:val="ListParagraph"/>
+        <w:numPr>
+          <w:ilvl w:val="1"/>
+          <w:numId w:val="21"/>
+        </w:numPr>
+      </w:pPr>
+      <w:r>
+        <w:t>Example: Qt.MouseButton</w:t>
+      </w:r>
+      <w:r>
+        <w:t>, Qt.AlignmentFlag</w:t>
       </w:r>
     </w:p>
     <w:p>
@@ -780,7 +2723,6 @@
         </w:numPr>
       </w:pPr>
       <w:r>
-        <w:lastRenderedPageBreak/>
         <w:t>QSize</w:t>
       </w:r>
     </w:p>
@@ -840,6 +2782,140 @@
         <w:jc w:val="both"/>
       </w:pPr>
       <w:r>
+        <w:t>QFont</w:t>
+      </w:r>
+    </w:p>
+    <w:p>
+      <w:pPr>
+        <w:pStyle w:val="ListParagraph"/>
+        <w:numPr>
+          <w:ilvl w:val="1"/>
+          <w:numId w:val="24"/>
+        </w:numPr>
+        <w:jc w:val="both"/>
+      </w:pPr>
+      <w:r>
+        <w:t>Font object type</w:t>
+      </w:r>
+    </w:p>
+    <w:p>
+      <w:pPr>
+        <w:pStyle w:val="ListParagraph"/>
+        <w:numPr>
+          <w:ilvl w:val="1"/>
+          <w:numId w:val="24"/>
+        </w:numPr>
+        <w:jc w:val="both"/>
+      </w:pPr>
+      <w:r>
+        <w:t>.font() gets font of widgets</w:t>
+      </w:r>
+    </w:p>
+    <w:p>
+      <w:pPr>
+        <w:pStyle w:val="ListParagraph"/>
+        <w:numPr>
+          <w:ilvl w:val="1"/>
+          <w:numId w:val="24"/>
+        </w:numPr>
+        <w:jc w:val="both"/>
+      </w:pPr>
+      <w:r>
+        <w:t>.setFont(&lt;QFont&gt;) sets the font of widget</w:t>
+      </w:r>
+    </w:p>
+    <w:p>
+      <w:pPr>
+        <w:pStyle w:val="ListParagraph"/>
+        <w:numPr>
+          <w:ilvl w:val="1"/>
+          <w:numId w:val="24"/>
+        </w:numPr>
+        <w:jc w:val="both"/>
+      </w:pPr>
+      <w:r>
+        <w:t>.setFontSize(&lt;integer&gt;) changes the font size of QFont object</w:t>
+      </w:r>
+    </w:p>
+    <w:p>
+      <w:pPr>
+        <w:pStyle w:val="ListParagraph"/>
+        <w:numPr>
+          <w:ilvl w:val="0"/>
+          <w:numId w:val="24"/>
+        </w:numPr>
+        <w:jc w:val="both"/>
+      </w:pPr>
+      <w:r>
+        <w:t>QPixmap</w:t>
+      </w:r>
+    </w:p>
+    <w:p>
+      <w:pPr>
+        <w:pStyle w:val="ListParagraph"/>
+        <w:numPr>
+          <w:ilvl w:val="1"/>
+          <w:numId w:val="24"/>
+        </w:numPr>
+        <w:jc w:val="both"/>
+      </w:pPr>
+      <w:r>
+        <w:t>Converts an image file to a Qt object</w:t>
+      </w:r>
+    </w:p>
+    <w:p>
+      <w:pPr>
+        <w:pStyle w:val="ListParagraph"/>
+        <w:numPr>
+          <w:ilvl w:val="1"/>
+          <w:numId w:val="24"/>
+        </w:numPr>
+        <w:jc w:val="both"/>
+      </w:pPr>
+      <w:r>
+        <w:t>.setPixmap(&lt;QPixmap&gt;) sets the contents of a label to an image</w:t>
+      </w:r>
+    </w:p>
+    <w:p>
+      <w:pPr>
+        <w:pStyle w:val="ListParagraph"/>
+        <w:numPr>
+          <w:ilvl w:val="1"/>
+          <w:numId w:val="24"/>
+        </w:numPr>
+      </w:pPr>
+      <w:r>
+        <w:t>.setScaledContents(&lt;bool&gt;)</w:t>
+      </w:r>
+      <w:r>
+        <w:t xml:space="preserve"> s</w:t>
+      </w:r>
+      <w:r>
+        <w:t>tretch and scale the contents of a widget to fit the widget size.</w:t>
+      </w:r>
+    </w:p>
+    <w:p>
+      <w:pPr>
+        <w:pStyle w:val="ListParagraph"/>
+        <w:numPr>
+          <w:ilvl w:val="1"/>
+          <w:numId w:val="24"/>
+        </w:numPr>
+      </w:pPr>
+      <w:r>
+        <w:t>By default, image only scales up to its aspect ratio.</w:t>
+      </w:r>
+    </w:p>
+    <w:p>
+      <w:pPr>
+        <w:pStyle w:val="ListParagraph"/>
+        <w:numPr>
+          <w:ilvl w:val="0"/>
+          <w:numId w:val="24"/>
+        </w:numPr>
+        <w:jc w:val="both"/>
+      </w:pPr>
+      <w:r>
         <w:t>QAction</w:t>
       </w:r>
     </w:p>
@@ -854,6 +2930,19 @@
       </w:pPr>
       <w:r>
         <w:t>QMenu dropdown objects</w:t>
+      </w:r>
+    </w:p>
+    <w:p>
+      <w:pPr>
+        <w:pStyle w:val="ListParagraph"/>
+        <w:numPr>
+          <w:ilvl w:val="1"/>
+          <w:numId w:val="24"/>
+        </w:numPr>
+        <w:jc w:val="both"/>
+      </w:pPr>
+      <w:r>
+        <w:t>.addAction(&lt;QAction&gt;) adds action to a menu</w:t>
       </w:r>
     </w:p>
     <w:p>
@@ -927,6 +3016,7 @@
         </w:numPr>
       </w:pPr>
       <w:r>
+        <w:lastRenderedPageBreak/>
         <w:t>Starts event loop.</w:t>
       </w:r>
     </w:p>
@@ -951,7 +3041,7 @@
         </w:numPr>
       </w:pPr>
       <w:r>
-        <w:t xml:space="preserve">.setCentralWidget(&lt;widget&gt;) </w:t>
+        <w:t xml:space="preserve">.setFixedSize(&lt;QSize&gt;) </w:t>
       </w:r>
     </w:p>
     <w:p>
@@ -963,19 +3053,7 @@
         </w:numPr>
       </w:pPr>
       <w:r>
-        <w:t xml:space="preserve">places a widget at the middle of the window. By default, it takes self. </w:t>
-      </w:r>
-    </w:p>
-    <w:p>
-      <w:pPr>
-        <w:pStyle w:val="ListParagraph"/>
-        <w:numPr>
-          <w:ilvl w:val="1"/>
-          <w:numId w:val="21"/>
-        </w:numPr>
-      </w:pPr>
-      <w:r>
-        <w:t>The widget resizes alongside the window.</w:t>
+        <w:t>will create a fixed window size.</w:t>
       </w:r>
     </w:p>
     <w:p>
@@ -987,19 +3065,7 @@
         </w:numPr>
       </w:pPr>
       <w:r>
-        <w:t xml:space="preserve">.setFixedSize(&lt;QSize&gt;) </w:t>
-      </w:r>
-    </w:p>
-    <w:p>
-      <w:pPr>
-        <w:pStyle w:val="ListParagraph"/>
-        <w:numPr>
-          <w:ilvl w:val="1"/>
-          <w:numId w:val="21"/>
-        </w:numPr>
-      </w:pPr>
-      <w:r>
-        <w:t>will create a fixed window size.</w:t>
+        <w:t>.setMinimumSize(&lt;QSize&gt;), .setMaximumSize(&lt;QSize&gt;)</w:t>
       </w:r>
     </w:p>
     <w:p>
@@ -1011,7 +3077,31 @@
         </w:numPr>
       </w:pPr>
       <w:r>
-        <w:t>.setMinimumSize(&lt;QSize&gt;), .setMaximumSize(&lt;QSize&gt;)</w:t>
+        <w:t>.setCheckable(&lt;bool&gt;)</w:t>
+      </w:r>
+    </w:p>
+    <w:p>
+      <w:pPr>
+        <w:pStyle w:val="ListParagraph"/>
+        <w:numPr>
+          <w:ilvl w:val="1"/>
+          <w:numId w:val="21"/>
+        </w:numPr>
+      </w:pPr>
+      <w:r>
+        <w:t>&lt;bool&gt; can be set to True or False and accordingly,</w:t>
+      </w:r>
+    </w:p>
+    <w:p>
+      <w:pPr>
+        <w:pStyle w:val="ListParagraph"/>
+        <w:numPr>
+          <w:ilvl w:val="1"/>
+          <w:numId w:val="21"/>
+        </w:numPr>
+      </w:pPr>
+      <w:r>
+        <w:t>Gives widgets an on(True) or off(False) state.</w:t>
       </w:r>
     </w:p>
     <w:p>
@@ -1023,7 +3113,7 @@
         </w:numPr>
       </w:pPr>
       <w:r>
-        <w:t>.setCheckable(&lt;bool&gt;)</w:t>
+        <w:t>.setChecked (&lt;bool&gt;)</w:t>
       </w:r>
     </w:p>
     <w:p>
@@ -1035,19 +3125,7 @@
         </w:numPr>
       </w:pPr>
       <w:r>
-        <w:t>&lt;bool&gt; can be set to True or False and accordingly,</w:t>
-      </w:r>
-    </w:p>
-    <w:p>
-      <w:pPr>
-        <w:pStyle w:val="ListParagraph"/>
-        <w:numPr>
-          <w:ilvl w:val="1"/>
-          <w:numId w:val="21"/>
-        </w:numPr>
-      </w:pPr>
-      <w:r>
-        <w:t>Gives widgets an on(True) or off(False) state.</w:t>
+        <w:t>Set the state(True or False) for widget</w:t>
       </w:r>
     </w:p>
     <w:p>
@@ -1059,19 +3137,7 @@
         </w:numPr>
       </w:pPr>
       <w:r>
-        <w:t>.setChecked (&lt;bool&gt;)</w:t>
-      </w:r>
-    </w:p>
-    <w:p>
-      <w:pPr>
-        <w:pStyle w:val="ListParagraph"/>
-        <w:numPr>
-          <w:ilvl w:val="1"/>
-          <w:numId w:val="21"/>
-        </w:numPr>
-      </w:pPr>
-      <w:r>
-        <w:t>Set the state(True or False) for widget</w:t>
+        <w:t>.setEnabled(&lt;bool&gt;), .setDisabled(&lt;bool&gt;)</w:t>
       </w:r>
     </w:p>
     <w:p>
@@ -1083,7 +3149,19 @@
         </w:numPr>
       </w:pPr>
       <w:r>
-        <w:t>.setEnabled(&lt;bool&gt;), .setDisabled(&lt;bool&gt;)</w:t>
+        <w:t>.setText(&lt;string&gt;)</w:t>
+      </w:r>
+    </w:p>
+    <w:p>
+      <w:pPr>
+        <w:pStyle w:val="ListParagraph"/>
+        <w:numPr>
+          <w:ilvl w:val="1"/>
+          <w:numId w:val="21"/>
+        </w:numPr>
+      </w:pPr>
+      <w:r>
+        <w:t>change the text in widget</w:t>
       </w:r>
     </w:p>
     <w:p>
@@ -1095,7 +3173,7 @@
         </w:numPr>
       </w:pPr>
       <w:r>
-        <w:t>.setText(&lt;string&gt;)</w:t>
+        <w:t>.setLayout(&lt;layout_object&gt;)</w:t>
       </w:r>
     </w:p>
     <w:p>
@@ -1107,7 +3185,7 @@
         </w:numPr>
       </w:pPr>
       <w:r>
-        <w:t>change the text in widget</w:t>
+        <w:t>Takes a layout object as parameter and lays out the widgets within the layout accordingly in the outer widget.</w:t>
       </w:r>
     </w:p>
     <w:p>
@@ -1119,7 +3197,10 @@
         </w:numPr>
       </w:pPr>
       <w:r>
-        <w:t>.setLayout(&lt;layout_object&gt;)</w:t>
+        <w:t>.</w:t>
+      </w:r>
+      <w:r>
+        <w:t>setMouseTracking(True)</w:t>
       </w:r>
     </w:p>
     <w:p>
@@ -1131,7 +3212,19 @@
         </w:numPr>
       </w:pPr>
       <w:r>
-        <w:t>Takes a layout object as parameter and lays out the widgets within the layout accordingly in the outer widget.</w:t>
+        <w:t>allows widgets to detect mouseMoveEvent even when a button on the mouse is not clicked</w:t>
+      </w:r>
+    </w:p>
+    <w:p>
+      <w:pPr>
+        <w:pStyle w:val="ListParagraph"/>
+        <w:numPr>
+          <w:ilvl w:val="1"/>
+          <w:numId w:val="21"/>
+        </w:numPr>
+      </w:pPr>
+      <w:r>
+        <w:t>must be called for both window and widget</w:t>
       </w:r>
     </w:p>
     <w:p>
@@ -1143,11 +3236,7 @@
         </w:numPr>
       </w:pPr>
       <w:r>
-        <w:lastRenderedPageBreak/>
-        <w:t>.</w:t>
-      </w:r>
-      <w:r>
-        <w:t>setMouseTracking(True)</w:t>
+        <w:t>.addAction(&lt;QAction&gt;)</w:t>
       </w:r>
     </w:p>
     <w:p>
@@ -1159,19 +3248,7 @@
         </w:numPr>
       </w:pPr>
       <w:r>
-        <w:t>allows widgets to detect mouseMoveEvent even when a button on the mouse is not clicked</w:t>
-      </w:r>
-    </w:p>
-    <w:p>
-      <w:pPr>
-        <w:pStyle w:val="ListParagraph"/>
-        <w:numPr>
-          <w:ilvl w:val="1"/>
-          <w:numId w:val="21"/>
-        </w:numPr>
-      </w:pPr>
-      <w:r>
-        <w:t>must be called for both window and widget</w:t>
+        <w:t>can add QAction object to QMenu objects.</w:t>
       </w:r>
     </w:p>
     <w:p>
@@ -1183,7 +3260,7 @@
         </w:numPr>
       </w:pPr>
       <w:r>
-        <w:t>.addAction(&lt;QAction&gt;)</w:t>
+        <w:t>.mapToGlobal(&lt;QPoint&gt;)</w:t>
       </w:r>
     </w:p>
     <w:p>
@@ -1195,7 +3272,7 @@
         </w:numPr>
       </w:pPr>
       <w:r>
-        <w:t>can add QAction object to QMenu objects.</w:t>
+        <w:t>Takes relative position and returns global screen coordinates</w:t>
       </w:r>
     </w:p>
     <w:p>
@@ -1207,7 +3284,7 @@
         </w:numPr>
       </w:pPr>
       <w:r>
-        <w:t>.mapToGlobal(&lt;QPoint&gt;)</w:t>
+        <w:t>.font()</w:t>
       </w:r>
     </w:p>
     <w:p>
@@ -1219,7 +3296,67 @@
         </w:numPr>
       </w:pPr>
       <w:r>
-        <w:t>Takes relative position and returns global screen coordinates</w:t>
+        <w:t>Gets the font type of text in widget</w:t>
+      </w:r>
+    </w:p>
+    <w:p>
+      <w:pPr>
+        <w:pStyle w:val="ListParagraph"/>
+        <w:numPr>
+          <w:ilvl w:val="0"/>
+          <w:numId w:val="21"/>
+        </w:numPr>
+      </w:pPr>
+      <w:r>
+        <w:t>.setAlignment(&lt;Qt.AlignmentFlag&gt;)</w:t>
+      </w:r>
+    </w:p>
+    <w:p>
+      <w:pPr>
+        <w:pStyle w:val="ListParagraph"/>
+        <w:numPr>
+          <w:ilvl w:val="1"/>
+          <w:numId w:val="21"/>
+        </w:numPr>
+      </w:pPr>
+      <w:r>
+        <w:t>Sets the alignment of object according to the alignment flag.</w:t>
+      </w:r>
+    </w:p>
+    <w:p>
+      <w:pPr>
+        <w:pStyle w:val="ListParagraph"/>
+        <w:numPr>
+          <w:ilvl w:val="1"/>
+          <w:numId w:val="21"/>
+        </w:numPr>
+      </w:pPr>
+      <w:r>
+        <w:t>By default, the alignment is Center-Left of available space</w:t>
+      </w:r>
+    </w:p>
+    <w:p>
+      <w:pPr>
+        <w:pStyle w:val="ListParagraph"/>
+        <w:numPr>
+          <w:ilvl w:val="0"/>
+          <w:numId w:val="21"/>
+        </w:numPr>
+      </w:pPr>
+      <w:r>
+        <w:t>.setScaledContents(&lt;bool&gt;)</w:t>
+      </w:r>
+    </w:p>
+    <w:p>
+      <w:pPr>
+        <w:pStyle w:val="ListParagraph"/>
+        <w:numPr>
+          <w:ilvl w:val="1"/>
+          <w:numId w:val="21"/>
+        </w:numPr>
+      </w:pPr>
+      <w:r>
+        <w:t>Stretch and scale the contents of a widget to fit the widget size.</w:t>
       </w:r>
     </w:p>
     <w:p>
@@ -1277,6 +3414,7 @@
         </w:numPr>
       </w:pPr>
       <w:r>
+        <w:lastRenderedPageBreak/>
         <w:t>This may include notifying that an event occurred or data being sent to provide additional context</w:t>
       </w:r>
     </w:p>
@@ -1290,114 +3428,6 @@
       </w:pPr>
       <w:r>
         <w:t>Built-in and custom signals</w:t>
-      </w:r>
-    </w:p>
-    <w:p>
-      <w:pPr>
-        <w:pStyle w:val="ListParagraph"/>
-        <w:numPr>
-          <w:ilvl w:val="1"/>
-          <w:numId w:val="22"/>
-        </w:numPr>
-      </w:pPr>
-      <w:r>
-        <w:t>QPushButton.clicked</w:t>
-      </w:r>
-    </w:p>
-    <w:p>
-      <w:pPr>
-        <w:pStyle w:val="ListParagraph"/>
-        <w:numPr>
-          <w:ilvl w:val="2"/>
-          <w:numId w:val="22"/>
-        </w:numPr>
-      </w:pPr>
-      <w:r>
-        <w:t>Mouse clicks the button and releases while it is still within the border of the button.</w:t>
-      </w:r>
-    </w:p>
-    <w:p>
-      <w:pPr>
-        <w:pStyle w:val="ListParagraph"/>
-        <w:numPr>
-          <w:ilvl w:val="2"/>
-          <w:numId w:val="22"/>
-        </w:numPr>
-      </w:pPr>
-      <w:r>
-        <w:t>Signal sends a &lt;bool&gt; argument</w:t>
-      </w:r>
-    </w:p>
-    <w:p>
-      <w:pPr>
-        <w:pStyle w:val="ListParagraph"/>
-        <w:numPr>
-          <w:ilvl w:val="1"/>
-          <w:numId w:val="22"/>
-        </w:numPr>
-      </w:pPr>
-      <w:r>
-        <w:t>QPushButton.released</w:t>
-      </w:r>
-    </w:p>
-    <w:p>
-      <w:pPr>
-        <w:pStyle w:val="ListParagraph"/>
-        <w:numPr>
-          <w:ilvl w:val="2"/>
-          <w:numId w:val="22"/>
-        </w:numPr>
-      </w:pPr>
-      <w:r>
-        <w:t>Mouse clicks and is released anywhere.</w:t>
-      </w:r>
-    </w:p>
-    <w:p>
-      <w:pPr>
-        <w:pStyle w:val="ListParagraph"/>
-        <w:numPr>
-          <w:ilvl w:val="2"/>
-          <w:numId w:val="22"/>
-        </w:numPr>
-      </w:pPr>
-      <w:r>
-        <w:t>Signal does not send a &lt;bool&gt; argument</w:t>
-      </w:r>
-    </w:p>
-    <w:p>
-      <w:pPr>
-        <w:pStyle w:val="ListParagraph"/>
-        <w:numPr>
-          <w:ilvl w:val="1"/>
-          <w:numId w:val="22"/>
-        </w:numPr>
-      </w:pPr>
-      <w:r>
-        <w:t>QMainWindow.windowTitleChanged</w:t>
-      </w:r>
-    </w:p>
-    <w:p>
-      <w:pPr>
-        <w:pStyle w:val="ListParagraph"/>
-        <w:numPr>
-          <w:ilvl w:val="2"/>
-          <w:numId w:val="22"/>
-        </w:numPr>
-      </w:pPr>
-      <w:r>
-        <w:t>Title of the main window is changed.</w:t>
-      </w:r>
-    </w:p>
-    <w:p>
-      <w:pPr>
-        <w:pStyle w:val="ListParagraph"/>
-        <w:numPr>
-          <w:ilvl w:val="2"/>
-          <w:numId w:val="22"/>
-        </w:numPr>
-      </w:pPr>
-      <w:r>
-        <w:t>New title is different from old title</w:t>
       </w:r>
     </w:p>
     <w:p>
@@ -1497,7 +3527,6 @@
         </w:numPr>
       </w:pPr>
       <w:r>
-        <w:lastRenderedPageBreak/>
         <w:t>Events are every interaction that the user has with a Qt application.</w:t>
       </w:r>
     </w:p>
@@ -1778,6 +3807,7 @@
         </w:numPr>
       </w:pPr>
       <w:r>
+        <w:lastRenderedPageBreak/>
         <w:t>QContextMenuEvent</w:t>
       </w:r>
     </w:p>
@@ -2067,6 +4097,579 @@
       </w:r>
     </w:p>
     <w:p/>
+    <w:p>
+      <w:r>
+        <w:pict w14:anchorId="2A9F08DE">
+          <v:rect id="_x0000_i1026" style="width:0;height:1.5pt" o:hralign="center" o:hrstd="t" o:hr="t" fillcolor="#a0a0a0" stroked="f"/>
+        </w:pict>
+      </w:r>
+    </w:p>
+    <w:p/>
+    <w:p>
+      <w:pPr>
+        <w:jc w:val="center"/>
+        <w:rPr>
+          <w:b/>
+          <w:bCs/>
+          <w:i/>
+          <w:iCs/>
+          <w:sz w:val="40"/>
+          <w:szCs w:val="40"/>
+          <w:u w:val="single"/>
+        </w:rPr>
+      </w:pPr>
+      <w:r>
+        <w:rPr>
+          <w:b/>
+          <w:bCs/>
+          <w:i/>
+          <w:iCs/>
+          <w:sz w:val="40"/>
+          <w:szCs w:val="40"/>
+          <w:u w:val="single"/>
+        </w:rPr>
+        <w:lastRenderedPageBreak/>
+        <w:t>PyQt6 Flags</w:t>
+      </w:r>
+    </w:p>
+    <w:p>
+      <w:pPr>
+        <w:pStyle w:val="ListParagraph"/>
+        <w:numPr>
+          <w:ilvl w:val="0"/>
+          <w:numId w:val="27"/>
+        </w:numPr>
+      </w:pPr>
+      <w:r>
+        <w:t>Flags are combined using an OR pipe(|) because flags are represented by non-overlapping hexadecimal bitmasks. Eg: 0x0001 and 0x0040 are AlignLeft and AlignBottom. When ORing together, it become 0x0041 which represents ‘Align bottom left.’</w:t>
+      </w:r>
+    </w:p>
+    <w:p>
+      <w:pPr>
+        <w:pStyle w:val="ListParagraph"/>
+        <w:numPr>
+          <w:ilvl w:val="0"/>
+          <w:numId w:val="27"/>
+        </w:numPr>
+      </w:pPr>
+      <w:r>
+        <w:t>Qt.AlignmentFlag</w:t>
+      </w:r>
+    </w:p>
+    <w:p>
+      <w:pPr>
+        <w:pStyle w:val="ListParagraph"/>
+        <w:numPr>
+          <w:ilvl w:val="1"/>
+          <w:numId w:val="27"/>
+        </w:numPr>
+      </w:pPr>
+      <w:r>
+        <w:t>.AlignLeft</w:t>
+      </w:r>
+    </w:p>
+    <w:p>
+      <w:pPr>
+        <w:pStyle w:val="ListParagraph"/>
+        <w:numPr>
+          <w:ilvl w:val="2"/>
+          <w:numId w:val="27"/>
+        </w:numPr>
+      </w:pPr>
+      <w:r>
+        <w:t>Left edge</w:t>
+      </w:r>
+    </w:p>
+    <w:p>
+      <w:pPr>
+        <w:pStyle w:val="ListParagraph"/>
+        <w:numPr>
+          <w:ilvl w:val="1"/>
+          <w:numId w:val="27"/>
+        </w:numPr>
+      </w:pPr>
+      <w:r>
+        <w:t>.AlignRight</w:t>
+      </w:r>
+    </w:p>
+    <w:p>
+      <w:pPr>
+        <w:pStyle w:val="ListParagraph"/>
+        <w:numPr>
+          <w:ilvl w:val="2"/>
+          <w:numId w:val="27"/>
+        </w:numPr>
+      </w:pPr>
+      <w:r>
+        <w:t>Right edge</w:t>
+      </w:r>
+    </w:p>
+    <w:p>
+      <w:pPr>
+        <w:pStyle w:val="ListParagraph"/>
+        <w:numPr>
+          <w:ilvl w:val="1"/>
+          <w:numId w:val="27"/>
+        </w:numPr>
+      </w:pPr>
+      <w:r>
+        <w:t>.</w:t>
+      </w:r>
+      <w:r>
+        <w:t>AlignHCenter</w:t>
+      </w:r>
+    </w:p>
+    <w:p>
+      <w:pPr>
+        <w:pStyle w:val="ListParagraph"/>
+        <w:numPr>
+          <w:ilvl w:val="2"/>
+          <w:numId w:val="27"/>
+        </w:numPr>
+      </w:pPr>
+      <w:r>
+        <w:t>Centers Horizontally in available space</w:t>
+      </w:r>
+    </w:p>
+    <w:p>
+      <w:pPr>
+        <w:pStyle w:val="ListParagraph"/>
+        <w:numPr>
+          <w:ilvl w:val="1"/>
+          <w:numId w:val="27"/>
+        </w:numPr>
+      </w:pPr>
+      <w:r>
+        <w:t>.</w:t>
+      </w:r>
+      <w:r>
+        <w:t>AlignJustify</w:t>
+      </w:r>
+    </w:p>
+    <w:p>
+      <w:pPr>
+        <w:pStyle w:val="ListParagraph"/>
+        <w:numPr>
+          <w:ilvl w:val="2"/>
+          <w:numId w:val="27"/>
+        </w:numPr>
+      </w:pPr>
+      <w:r>
+        <w:t>Justifies in available space</w:t>
+      </w:r>
+    </w:p>
+    <w:p>
+      <w:pPr>
+        <w:pStyle w:val="ListParagraph"/>
+        <w:numPr>
+          <w:ilvl w:val="1"/>
+          <w:numId w:val="27"/>
+        </w:numPr>
+      </w:pPr>
+      <w:r>
+        <w:t>.AlignTop</w:t>
+      </w:r>
+    </w:p>
+    <w:p>
+      <w:pPr>
+        <w:pStyle w:val="ListParagraph"/>
+        <w:numPr>
+          <w:ilvl w:val="2"/>
+          <w:numId w:val="27"/>
+        </w:numPr>
+      </w:pPr>
+      <w:r>
+        <w:t>Top edge</w:t>
+      </w:r>
+    </w:p>
+    <w:p>
+      <w:pPr>
+        <w:pStyle w:val="ListParagraph"/>
+        <w:numPr>
+          <w:ilvl w:val="1"/>
+          <w:numId w:val="27"/>
+        </w:numPr>
+      </w:pPr>
+      <w:r>
+        <w:t>.AlignBottom</w:t>
+      </w:r>
+    </w:p>
+    <w:p>
+      <w:pPr>
+        <w:pStyle w:val="ListParagraph"/>
+        <w:numPr>
+          <w:ilvl w:val="2"/>
+          <w:numId w:val="27"/>
+        </w:numPr>
+      </w:pPr>
+      <w:r>
+        <w:t>Bottom edge</w:t>
+      </w:r>
+    </w:p>
+    <w:p>
+      <w:pPr>
+        <w:pStyle w:val="ListParagraph"/>
+        <w:numPr>
+          <w:ilvl w:val="1"/>
+          <w:numId w:val="27"/>
+        </w:numPr>
+      </w:pPr>
+      <w:r>
+        <w:t>.</w:t>
+      </w:r>
+      <w:r>
+        <w:t>AlignVCenter</w:t>
+      </w:r>
+    </w:p>
+    <w:p>
+      <w:pPr>
+        <w:pStyle w:val="ListParagraph"/>
+        <w:numPr>
+          <w:ilvl w:val="2"/>
+          <w:numId w:val="27"/>
+        </w:numPr>
+      </w:pPr>
+      <w:r>
+        <w:t>Centers Vertically in available space</w:t>
+      </w:r>
+    </w:p>
+    <w:p>
+      <w:pPr>
+        <w:pStyle w:val="ListParagraph"/>
+        <w:numPr>
+          <w:ilvl w:val="1"/>
+          <w:numId w:val="27"/>
+        </w:numPr>
+      </w:pPr>
+      <w:r>
+        <w:t>.AlignCenter == …AlignHCenter | …AlignVCenter</w:t>
+      </w:r>
+    </w:p>
+    <w:p>
+      <w:pPr>
+        <w:pStyle w:val="ListParagraph"/>
+        <w:numPr>
+          <w:ilvl w:val="2"/>
+          <w:numId w:val="27"/>
+        </w:numPr>
+      </w:pPr>
+      <w:r>
+        <w:t>Centers both vertically and horizontally</w:t>
+      </w:r>
+    </w:p>
+    <w:p>
+      <w:pPr>
+        <w:pStyle w:val="ListParagraph"/>
+        <w:numPr>
+          <w:ilvl w:val="1"/>
+          <w:numId w:val="27"/>
+        </w:numPr>
+      </w:pPr>
+      <w:r>
+        <w:t xml:space="preserve">Similarly combinations of alignments can be made by using the OR pipe(|) </w:t>
+      </w:r>
+    </w:p>
+    <w:p>
+      <w:pPr>
+        <w:pStyle w:val="ListParagraph"/>
+        <w:numPr>
+          <w:ilvl w:val="1"/>
+          <w:numId w:val="27"/>
+        </w:numPr>
+      </w:pPr>
+      <w:r>
+        <w:t>Only one horizontal and one vertical alignment flags can be used at a time.</w:t>
+      </w:r>
+    </w:p>
+    <w:p>
+      <w:pPr>
+        <w:pStyle w:val="ListParagraph"/>
+        <w:numPr>
+          <w:ilvl w:val="0"/>
+          <w:numId w:val="27"/>
+        </w:numPr>
+      </w:pPr>
+      <w:r>
+        <w:t>Qt.CheckState</w:t>
+      </w:r>
+    </w:p>
+    <w:p>
+      <w:pPr>
+        <w:pStyle w:val="ListParagraph"/>
+        <w:numPr>
+          <w:ilvl w:val="1"/>
+          <w:numId w:val="27"/>
+        </w:numPr>
+      </w:pPr>
+      <w:r>
+        <w:t>.Unchecked</w:t>
+      </w:r>
+    </w:p>
+    <w:p>
+      <w:pPr>
+        <w:pStyle w:val="ListParagraph"/>
+        <w:numPr>
+          <w:ilvl w:val="2"/>
+          <w:numId w:val="27"/>
+        </w:numPr>
+      </w:pPr>
+      <w:r>
+        <w:t>Value = 0</w:t>
+      </w:r>
+    </w:p>
+    <w:p>
+      <w:pPr>
+        <w:pStyle w:val="ListParagraph"/>
+        <w:numPr>
+          <w:ilvl w:val="1"/>
+          <w:numId w:val="27"/>
+        </w:numPr>
+      </w:pPr>
+      <w:r>
+        <w:t>.PartiallyChecked</w:t>
+      </w:r>
+    </w:p>
+    <w:p>
+      <w:pPr>
+        <w:pStyle w:val="ListParagraph"/>
+        <w:numPr>
+          <w:ilvl w:val="2"/>
+          <w:numId w:val="27"/>
+        </w:numPr>
+      </w:pPr>
+      <w:r>
+        <w:t>Value = 1</w:t>
+      </w:r>
+    </w:p>
+    <w:p>
+      <w:pPr>
+        <w:pStyle w:val="ListParagraph"/>
+        <w:numPr>
+          <w:ilvl w:val="1"/>
+          <w:numId w:val="27"/>
+        </w:numPr>
+      </w:pPr>
+      <w:r>
+        <w:t>.Checked</w:t>
+      </w:r>
+    </w:p>
+    <w:p>
+      <w:pPr>
+        <w:pStyle w:val="ListParagraph"/>
+        <w:numPr>
+          <w:ilvl w:val="2"/>
+          <w:numId w:val="27"/>
+        </w:numPr>
+      </w:pPr>
+      <w:r>
+        <w:t>Value = 2</w:t>
+      </w:r>
+    </w:p>
+    <w:p>
+      <w:pPr>
+        <w:pStyle w:val="ListParagraph"/>
+        <w:numPr>
+          <w:ilvl w:val="0"/>
+          <w:numId w:val="27"/>
+        </w:numPr>
+      </w:pPr>
+      <w:r>
+        <w:t>QCombobox.InserPolicy</w:t>
+      </w:r>
+    </w:p>
+    <w:p>
+      <w:pPr>
+        <w:pStyle w:val="ListParagraph"/>
+        <w:numPr>
+          <w:ilvl w:val="1"/>
+          <w:numId w:val="27"/>
+        </w:numPr>
+      </w:pPr>
+      <w:r>
+        <w:t>.NoInsert</w:t>
+      </w:r>
+    </w:p>
+    <w:p>
+      <w:pPr>
+        <w:pStyle w:val="ListParagraph"/>
+        <w:numPr>
+          <w:ilvl w:val="1"/>
+          <w:numId w:val="27"/>
+        </w:numPr>
+      </w:pPr>
+      <w:r>
+        <w:t>.InserAtTop</w:t>
+      </w:r>
+    </w:p>
+    <w:p>
+      <w:pPr>
+        <w:pStyle w:val="ListParagraph"/>
+        <w:numPr>
+          <w:ilvl w:val="2"/>
+          <w:numId w:val="27"/>
+        </w:numPr>
+      </w:pPr>
+      <w:r>
+        <w:t>Before topmost item</w:t>
+      </w:r>
+    </w:p>
+    <w:p>
+      <w:pPr>
+        <w:pStyle w:val="ListParagraph"/>
+        <w:numPr>
+          <w:ilvl w:val="1"/>
+          <w:numId w:val="27"/>
+        </w:numPr>
+      </w:pPr>
+      <w:r>
+        <w:t>.InserAtCurrent</w:t>
+      </w:r>
+    </w:p>
+    <w:p>
+      <w:pPr>
+        <w:pStyle w:val="ListParagraph"/>
+        <w:numPr>
+          <w:ilvl w:val="2"/>
+          <w:numId w:val="27"/>
+        </w:numPr>
+      </w:pPr>
+      <w:r>
+        <w:t>Replace currently selected item</w:t>
+      </w:r>
+    </w:p>
+    <w:p>
+      <w:pPr>
+        <w:pStyle w:val="ListParagraph"/>
+        <w:numPr>
+          <w:ilvl w:val="1"/>
+          <w:numId w:val="27"/>
+        </w:numPr>
+      </w:pPr>
+      <w:r>
+        <w:lastRenderedPageBreak/>
+        <w:t>.InsertAtBottom</w:t>
+      </w:r>
+    </w:p>
+    <w:p>
+      <w:pPr>
+        <w:pStyle w:val="ListParagraph"/>
+        <w:numPr>
+          <w:ilvl w:val="2"/>
+          <w:numId w:val="27"/>
+        </w:numPr>
+      </w:pPr>
+      <w:r>
+        <w:t>After bottommost item</w:t>
+      </w:r>
+    </w:p>
+    <w:p>
+      <w:pPr>
+        <w:pStyle w:val="ListParagraph"/>
+        <w:numPr>
+          <w:ilvl w:val="1"/>
+          <w:numId w:val="27"/>
+        </w:numPr>
+      </w:pPr>
+      <w:r>
+        <w:t>.InserAfterCurrent</w:t>
+      </w:r>
+    </w:p>
+    <w:p>
+      <w:pPr>
+        <w:pStyle w:val="ListParagraph"/>
+        <w:numPr>
+          <w:ilvl w:val="2"/>
+          <w:numId w:val="27"/>
+        </w:numPr>
+      </w:pPr>
+      <w:r>
+        <w:t>After currently selected item</w:t>
+      </w:r>
+    </w:p>
+    <w:p>
+      <w:pPr>
+        <w:pStyle w:val="ListParagraph"/>
+        <w:numPr>
+          <w:ilvl w:val="1"/>
+          <w:numId w:val="27"/>
+        </w:numPr>
+      </w:pPr>
+      <w:r>
+        <w:t>.InsertBeforeCurrent</w:t>
+      </w:r>
+    </w:p>
+    <w:p>
+      <w:pPr>
+        <w:pStyle w:val="ListParagraph"/>
+        <w:numPr>
+          <w:ilvl w:val="2"/>
+          <w:numId w:val="27"/>
+        </w:numPr>
+      </w:pPr>
+      <w:r>
+        <w:t>Before currently selected item</w:t>
+      </w:r>
+    </w:p>
+    <w:p>
+      <w:pPr>
+        <w:pStyle w:val="ListParagraph"/>
+        <w:numPr>
+          <w:ilvl w:val="1"/>
+          <w:numId w:val="27"/>
+        </w:numPr>
+      </w:pPr>
+      <w:r>
+        <w:t>.InsertAlphabetically</w:t>
+      </w:r>
+    </w:p>
+    <w:p>
+      <w:pPr>
+        <w:pStyle w:val="ListParagraph"/>
+        <w:numPr>
+          <w:ilvl w:val="2"/>
+          <w:numId w:val="27"/>
+        </w:numPr>
+      </w:pPr>
+      <w:r>
+        <w:t>Alphabetical order</w:t>
+      </w:r>
+    </w:p>
+    <w:p>
+      <w:pPr>
+        <w:pStyle w:val="ListParagraph"/>
+        <w:numPr>
+          <w:ilvl w:val="0"/>
+          <w:numId w:val="27"/>
+        </w:numPr>
+      </w:pPr>
+      <w:r>
+        <w:t>Qt.Orientation</w:t>
+      </w:r>
+    </w:p>
+    <w:p>
+      <w:pPr>
+        <w:pStyle w:val="ListParagraph"/>
+        <w:numPr>
+          <w:ilvl w:val="1"/>
+          <w:numId w:val="27"/>
+        </w:numPr>
+      </w:pPr>
+      <w:r>
+        <w:t>.Vertical</w:t>
+      </w:r>
+    </w:p>
+    <w:p>
+      <w:pPr>
+        <w:pStyle w:val="ListParagraph"/>
+        <w:numPr>
+          <w:ilvl w:val="1"/>
+          <w:numId w:val="27"/>
+        </w:numPr>
+      </w:pPr>
+      <w:r>
+        <w:t>.Horizontal</w:t>
+      </w:r>
+    </w:p>
     <w:sectPr>
       <w:headerReference w:type="default" r:id="rId8"/>
       <w:pgSz w:w="12240" w:h="15840"/>
@@ -2407,7 +5010,7 @@
         <w:rFonts w:ascii="Courier New" w:hAnsi="Courier New" w:cs="Courier New" w:hint="default"/>
       </w:rPr>
     </w:lvl>
-    <w:lvl w:ilvl="2" w:tplc="04090005" w:tentative="1">
+    <w:lvl w:ilvl="2" w:tplc="04090005">
       <w:start w:val="1"/>
       <w:numFmt w:val="bullet"/>
       <w:lvlText w:val=""/>
@@ -2419,7 +5022,7 @@
         <w:rFonts w:ascii="Wingdings" w:hAnsi="Wingdings" w:hint="default"/>
       </w:rPr>
     </w:lvl>
-    <w:lvl w:ilvl="3" w:tplc="04090001" w:tentative="1">
+    <w:lvl w:ilvl="3" w:tplc="04090001">
       <w:start w:val="1"/>
       <w:numFmt w:val="bullet"/>
       <w:lvlText w:val=""/>
@@ -3188,7 +5791,7 @@
         <w:rFonts w:ascii="Courier New" w:hAnsi="Courier New" w:cs="Courier New" w:hint="default"/>
       </w:rPr>
     </w:lvl>
-    <w:lvl w:ilvl="2" w:tplc="04090005" w:tentative="1">
+    <w:lvl w:ilvl="2" w:tplc="04090005">
       <w:start w:val="1"/>
       <w:numFmt w:val="bullet"/>
       <w:lvlText w:val=""/>
@@ -3200,7 +5803,7 @@
         <w:rFonts w:ascii="Wingdings" w:hAnsi="Wingdings" w:hint="default"/>
       </w:rPr>
     </w:lvl>
-    <w:lvl w:ilvl="3" w:tplc="04090001" w:tentative="1">
+    <w:lvl w:ilvl="3" w:tplc="04090001">
       <w:start w:val="1"/>
       <w:numFmt w:val="bullet"/>
       <w:lvlText w:val=""/>
@@ -3387,7 +5990,7 @@
         <w:rFonts w:ascii="Courier New" w:hAnsi="Courier New" w:cs="Courier New" w:hint="default"/>
       </w:rPr>
     </w:lvl>
-    <w:lvl w:ilvl="2" w:tplc="04090005" w:tentative="1">
+    <w:lvl w:ilvl="2" w:tplc="04090005">
       <w:start w:val="1"/>
       <w:numFmt w:val="bullet"/>
       <w:lvlText w:val=""/>
@@ -3653,6 +6256,119 @@
     </w:lvl>
   </w:abstractNum>
   <w:abstractNum w:abstractNumId="15" w15:restartNumberingAfterBreak="0">
+    <w:nsid w:val="5515427C"/>
+    <w:multiLevelType w:val="hybridMultilevel"/>
+    <w:tmpl w:val="86EA59DA"/>
+    <w:lvl w:ilvl="0" w:tplc="04090001">
+      <w:start w:val="1"/>
+      <w:numFmt w:val="bullet"/>
+      <w:lvlText w:val=""/>
+      <w:lvlJc w:val="left"/>
+      <w:pPr>
+        <w:ind w:left="720" w:hanging="360"/>
+      </w:pPr>
+      <w:rPr>
+        <w:rFonts w:ascii="Symbol" w:hAnsi="Symbol" w:hint="default"/>
+      </w:rPr>
+    </w:lvl>
+    <w:lvl w:ilvl="1" w:tplc="04090003">
+      <w:start w:val="1"/>
+      <w:numFmt w:val="bullet"/>
+      <w:lvlText w:val="o"/>
+      <w:lvlJc w:val="left"/>
+      <w:pPr>
+        <w:ind w:left="1440" w:hanging="360"/>
+      </w:pPr>
+      <w:rPr>
+        <w:rFonts w:ascii="Courier New" w:hAnsi="Courier New" w:cs="Courier New" w:hint="default"/>
+      </w:rPr>
+    </w:lvl>
+    <w:lvl w:ilvl="2" w:tplc="04090005" w:tentative="1">
+      <w:start w:val="1"/>
+      <w:numFmt w:val="bullet"/>
+      <w:lvlText w:val=""/>
+      <w:lvlJc w:val="left"/>
+      <w:pPr>
+        <w:ind w:left="2160" w:hanging="360"/>
+      </w:pPr>
+      <w:rPr>
+        <w:rFonts w:ascii="Wingdings" w:hAnsi="Wingdings" w:hint="default"/>
+      </w:rPr>
+    </w:lvl>
+    <w:lvl w:ilvl="3" w:tplc="04090001" w:tentative="1">
+      <w:start w:val="1"/>
+      <w:numFmt w:val="bullet"/>
+      <w:lvlText w:val=""/>
+      <w:lvlJc w:val="left"/>
+      <w:pPr>
+        <w:ind w:left="2880" w:hanging="360"/>
+      </w:pPr>
+      <w:rPr>
+        <w:rFonts w:ascii="Symbol" w:hAnsi="Symbol" w:hint="default"/>
+      </w:rPr>
+    </w:lvl>
+    <w:lvl w:ilvl="4" w:tplc="04090003" w:tentative="1">
+      <w:start w:val="1"/>
+      <w:numFmt w:val="bullet"/>
+      <w:lvlText w:val="o"/>
+      <w:lvlJc w:val="left"/>
+      <w:pPr>
+        <w:ind w:left="3600" w:hanging="360"/>
+      </w:pPr>
+      <w:rPr>
+        <w:rFonts w:ascii="Courier New" w:hAnsi="Courier New" w:cs="Courier New" w:hint="default"/>
+      </w:rPr>
+    </w:lvl>
+    <w:lvl w:ilvl="5" w:tplc="04090005" w:tentative="1">
+      <w:start w:val="1"/>
+      <w:numFmt w:val="bullet"/>
+      <w:lvlText w:val=""/>
+      <w:lvlJc w:val="left"/>
+      <w:pPr>
+        <w:ind w:left="4320" w:hanging="360"/>
+      </w:pPr>
+      <w:rPr>
+        <w:rFonts w:ascii="Wingdings" w:hAnsi="Wingdings" w:hint="default"/>
+      </w:rPr>
+    </w:lvl>
+    <w:lvl w:ilvl="6" w:tplc="04090001" w:tentative="1">
+      <w:start w:val="1"/>
+      <w:numFmt w:val="bullet"/>
+      <w:lvlText w:val=""/>
+      <w:lvlJc w:val="left"/>
+      <w:pPr>
+        <w:ind w:left="5040" w:hanging="360"/>
+      </w:pPr>
+      <w:rPr>
+        <w:rFonts w:ascii="Symbol" w:hAnsi="Symbol" w:hint="default"/>
+      </w:rPr>
+    </w:lvl>
+    <w:lvl w:ilvl="7" w:tplc="04090003" w:tentative="1">
+      <w:start w:val="1"/>
+      <w:numFmt w:val="bullet"/>
+      <w:lvlText w:val="o"/>
+      <w:lvlJc w:val="left"/>
+      <w:pPr>
+        <w:ind w:left="5760" w:hanging="360"/>
+      </w:pPr>
+      <w:rPr>
+        <w:rFonts w:ascii="Courier New" w:hAnsi="Courier New" w:cs="Courier New" w:hint="default"/>
+      </w:rPr>
+    </w:lvl>
+    <w:lvl w:ilvl="8" w:tplc="04090005" w:tentative="1">
+      <w:start w:val="1"/>
+      <w:numFmt w:val="bullet"/>
+      <w:lvlText w:val=""/>
+      <w:lvlJc w:val="left"/>
+      <w:pPr>
+        <w:ind w:left="6480" w:hanging="360"/>
+      </w:pPr>
+      <w:rPr>
+        <w:rFonts w:ascii="Wingdings" w:hAnsi="Wingdings" w:hint="default"/>
+      </w:rPr>
+    </w:lvl>
+  </w:abstractNum>
+  <w:abstractNum w:abstractNumId="16" w15:restartNumberingAfterBreak="0">
     <w:nsid w:val="597B1A34"/>
     <w:multiLevelType w:val="hybridMultilevel"/>
     <w:tmpl w:val="25849922"/>
@@ -3765,7 +6481,7 @@
       </w:rPr>
     </w:lvl>
   </w:abstractNum>
-  <w:abstractNum w:abstractNumId="16" w15:restartNumberingAfterBreak="0">
+  <w:abstractNum w:abstractNumId="17" w15:restartNumberingAfterBreak="0">
     <w:nsid w:val="5AD42FE0"/>
     <w:multiLevelType w:val="hybridMultilevel"/>
     <w:tmpl w:val="DD92E936"/>
@@ -3851,7 +6567,7 @@
       </w:pPr>
     </w:lvl>
   </w:abstractNum>
-  <w:abstractNum w:abstractNumId="17" w15:restartNumberingAfterBreak="0">
+  <w:abstractNum w:abstractNumId="18" w15:restartNumberingAfterBreak="0">
     <w:nsid w:val="5E6C1899"/>
     <w:multiLevelType w:val="hybridMultilevel"/>
     <w:tmpl w:val="61AEE986"/>
@@ -3964,7 +6680,7 @@
       </w:rPr>
     </w:lvl>
   </w:abstractNum>
-  <w:abstractNum w:abstractNumId="18" w15:restartNumberingAfterBreak="0">
+  <w:abstractNum w:abstractNumId="19" w15:restartNumberingAfterBreak="0">
     <w:nsid w:val="66B32F58"/>
     <w:multiLevelType w:val="hybridMultilevel"/>
     <w:tmpl w:val="2FFE94DC"/>
@@ -4077,7 +6793,120 @@
       </w:rPr>
     </w:lvl>
   </w:abstractNum>
-  <w:abstractNum w:abstractNumId="19" w15:restartNumberingAfterBreak="0">
+  <w:abstractNum w:abstractNumId="20" w15:restartNumberingAfterBreak="0">
+    <w:nsid w:val="67810AEA"/>
+    <w:multiLevelType w:val="hybridMultilevel"/>
+    <w:tmpl w:val="AE161C10"/>
+    <w:lvl w:ilvl="0" w:tplc="04090001">
+      <w:start w:val="1"/>
+      <w:numFmt w:val="bullet"/>
+      <w:lvlText w:val=""/>
+      <w:lvlJc w:val="left"/>
+      <w:pPr>
+        <w:ind w:left="720" w:hanging="360"/>
+      </w:pPr>
+      <w:rPr>
+        <w:rFonts w:ascii="Symbol" w:hAnsi="Symbol" w:hint="default"/>
+      </w:rPr>
+    </w:lvl>
+    <w:lvl w:ilvl="1" w:tplc="04090003">
+      <w:start w:val="1"/>
+      <w:numFmt w:val="bullet"/>
+      <w:lvlText w:val="o"/>
+      <w:lvlJc w:val="left"/>
+      <w:pPr>
+        <w:ind w:left="1440" w:hanging="360"/>
+      </w:pPr>
+      <w:rPr>
+        <w:rFonts w:ascii="Courier New" w:hAnsi="Courier New" w:cs="Courier New" w:hint="default"/>
+      </w:rPr>
+    </w:lvl>
+    <w:lvl w:ilvl="2" w:tplc="04090005">
+      <w:start w:val="1"/>
+      <w:numFmt w:val="bullet"/>
+      <w:lvlText w:val=""/>
+      <w:lvlJc w:val="left"/>
+      <w:pPr>
+        <w:ind w:left="2160" w:hanging="360"/>
+      </w:pPr>
+      <w:rPr>
+        <w:rFonts w:ascii="Wingdings" w:hAnsi="Wingdings" w:hint="default"/>
+      </w:rPr>
+    </w:lvl>
+    <w:lvl w:ilvl="3" w:tplc="04090001" w:tentative="1">
+      <w:start w:val="1"/>
+      <w:numFmt w:val="bullet"/>
+      <w:lvlText w:val=""/>
+      <w:lvlJc w:val="left"/>
+      <w:pPr>
+        <w:ind w:left="2880" w:hanging="360"/>
+      </w:pPr>
+      <w:rPr>
+        <w:rFonts w:ascii="Symbol" w:hAnsi="Symbol" w:hint="default"/>
+      </w:rPr>
+    </w:lvl>
+    <w:lvl w:ilvl="4" w:tplc="04090003" w:tentative="1">
+      <w:start w:val="1"/>
+      <w:numFmt w:val="bullet"/>
+      <w:lvlText w:val="o"/>
+      <w:lvlJc w:val="left"/>
+      <w:pPr>
+        <w:ind w:left="3600" w:hanging="360"/>
+      </w:pPr>
+      <w:rPr>
+        <w:rFonts w:ascii="Courier New" w:hAnsi="Courier New" w:cs="Courier New" w:hint="default"/>
+      </w:rPr>
+    </w:lvl>
+    <w:lvl w:ilvl="5" w:tplc="04090005" w:tentative="1">
+      <w:start w:val="1"/>
+      <w:numFmt w:val="bullet"/>
+      <w:lvlText w:val=""/>
+      <w:lvlJc w:val="left"/>
+      <w:pPr>
+        <w:ind w:left="4320" w:hanging="360"/>
+      </w:pPr>
+      <w:rPr>
+        <w:rFonts w:ascii="Wingdings" w:hAnsi="Wingdings" w:hint="default"/>
+      </w:rPr>
+    </w:lvl>
+    <w:lvl w:ilvl="6" w:tplc="04090001" w:tentative="1">
+      <w:start w:val="1"/>
+      <w:numFmt w:val="bullet"/>
+      <w:lvlText w:val=""/>
+      <w:lvlJc w:val="left"/>
+      <w:pPr>
+        <w:ind w:left="5040" w:hanging="360"/>
+      </w:pPr>
+      <w:rPr>
+        <w:rFonts w:ascii="Symbol" w:hAnsi="Symbol" w:hint="default"/>
+      </w:rPr>
+    </w:lvl>
+    <w:lvl w:ilvl="7" w:tplc="04090003" w:tentative="1">
+      <w:start w:val="1"/>
+      <w:numFmt w:val="bullet"/>
+      <w:lvlText w:val="o"/>
+      <w:lvlJc w:val="left"/>
+      <w:pPr>
+        <w:ind w:left="5760" w:hanging="360"/>
+      </w:pPr>
+      <w:rPr>
+        <w:rFonts w:ascii="Courier New" w:hAnsi="Courier New" w:cs="Courier New" w:hint="default"/>
+      </w:rPr>
+    </w:lvl>
+    <w:lvl w:ilvl="8" w:tplc="04090005" w:tentative="1">
+      <w:start w:val="1"/>
+      <w:numFmt w:val="bullet"/>
+      <w:lvlText w:val=""/>
+      <w:lvlJc w:val="left"/>
+      <w:pPr>
+        <w:ind w:left="6480" w:hanging="360"/>
+      </w:pPr>
+      <w:rPr>
+        <w:rFonts w:ascii="Wingdings" w:hAnsi="Wingdings" w:hint="default"/>
+      </w:rPr>
+    </w:lvl>
+  </w:abstractNum>
+  <w:abstractNum w:abstractNumId="21" w15:restartNumberingAfterBreak="0">
     <w:nsid w:val="685C4D63"/>
     <w:multiLevelType w:val="hybridMultilevel"/>
     <w:tmpl w:val="3C40DEEA"/>
@@ -4163,7 +6992,7 @@
       </w:pPr>
     </w:lvl>
   </w:abstractNum>
-  <w:abstractNum w:abstractNumId="20" w15:restartNumberingAfterBreak="0">
+  <w:abstractNum w:abstractNumId="22" w15:restartNumberingAfterBreak="0">
     <w:nsid w:val="6EF50048"/>
     <w:multiLevelType w:val="hybridMultilevel"/>
     <w:tmpl w:val="1172B504"/>
@@ -4253,7 +7082,7 @@
       </w:pPr>
     </w:lvl>
   </w:abstractNum>
-  <w:abstractNum w:abstractNumId="21" w15:restartNumberingAfterBreak="0">
+  <w:abstractNum w:abstractNumId="23" w15:restartNumberingAfterBreak="0">
     <w:nsid w:val="724D37F8"/>
     <w:multiLevelType w:val="hybridMultilevel"/>
     <w:tmpl w:val="E520BF9C"/>
@@ -4339,7 +7168,7 @@
       </w:pPr>
     </w:lvl>
   </w:abstractNum>
-  <w:abstractNum w:abstractNumId="22" w15:restartNumberingAfterBreak="0">
+  <w:abstractNum w:abstractNumId="24" w15:restartNumberingAfterBreak="0">
     <w:nsid w:val="72B678BD"/>
     <w:multiLevelType w:val="hybridMultilevel"/>
     <w:tmpl w:val="5F62A33C"/>
@@ -4425,7 +7254,7 @@
       </w:pPr>
     </w:lvl>
   </w:abstractNum>
-  <w:abstractNum w:abstractNumId="23" w15:restartNumberingAfterBreak="0">
+  <w:abstractNum w:abstractNumId="25" w15:restartNumberingAfterBreak="0">
     <w:nsid w:val="7A8F015C"/>
     <w:multiLevelType w:val="hybridMultilevel"/>
     <w:tmpl w:val="4DB8F6D2"/>
@@ -4538,7 +7367,7 @@
       </w:rPr>
     </w:lvl>
   </w:abstractNum>
-  <w:abstractNum w:abstractNumId="24" w15:restartNumberingAfterBreak="0">
+  <w:abstractNum w:abstractNumId="26" w15:restartNumberingAfterBreak="0">
     <w:nsid w:val="7C1212A2"/>
     <w:multiLevelType w:val="hybridMultilevel"/>
     <w:tmpl w:val="710C7A38"/>
@@ -4628,13 +7457,13 @@
     </w:lvl>
   </w:abstractNum>
   <w:num w:numId="1" w16cid:durableId="1269125091">
-    <w:abstractNumId w:val="23"/>
+    <w:abstractNumId w:val="25"/>
   </w:num>
   <w:num w:numId="2" w16cid:durableId="884294248">
     <w:abstractNumId w:val="7"/>
   </w:num>
   <w:num w:numId="3" w16cid:durableId="1249538410">
-    <w:abstractNumId w:val="17"/>
+    <w:abstractNumId w:val="18"/>
   </w:num>
   <w:num w:numId="4" w16cid:durableId="1453749934">
     <w:abstractNumId w:val="1"/>
@@ -4649,22 +7478,22 @@
     <w:abstractNumId w:val="11"/>
   </w:num>
   <w:num w:numId="8" w16cid:durableId="2000842609">
-    <w:abstractNumId w:val="24"/>
+    <w:abstractNumId w:val="26"/>
   </w:num>
   <w:num w:numId="9" w16cid:durableId="661197433">
+    <w:abstractNumId w:val="23"/>
+  </w:num>
+  <w:num w:numId="10" w16cid:durableId="1118447454">
     <w:abstractNumId w:val="21"/>
   </w:num>
-  <w:num w:numId="10" w16cid:durableId="1118447454">
-    <w:abstractNumId w:val="19"/>
-  </w:num>
   <w:num w:numId="11" w16cid:durableId="476339819">
-    <w:abstractNumId w:val="22"/>
+    <w:abstractNumId w:val="24"/>
   </w:num>
   <w:num w:numId="12" w16cid:durableId="2097163918">
     <w:abstractNumId w:val="6"/>
   </w:num>
   <w:num w:numId="13" w16cid:durableId="1902784036">
-    <w:abstractNumId w:val="18"/>
+    <w:abstractNumId w:val="19"/>
   </w:num>
   <w:num w:numId="14" w16cid:durableId="1308631457">
     <w:abstractNumId w:val="10"/>
@@ -4673,7 +7502,7 @@
     <w:abstractNumId w:val="14"/>
   </w:num>
   <w:num w:numId="16" w16cid:durableId="1326936491">
-    <w:abstractNumId w:val="20"/>
+    <w:abstractNumId w:val="22"/>
   </w:num>
   <w:num w:numId="17" w16cid:durableId="1046485271">
     <w:abstractNumId w:val="5"/>
@@ -4691,7 +7520,7 @@
     <w:abstractNumId w:val="0"/>
   </w:num>
   <w:num w:numId="22" w16cid:durableId="812478983">
-    <w:abstractNumId w:val="15"/>
+    <w:abstractNumId w:val="16"/>
   </w:num>
   <w:num w:numId="23" w16cid:durableId="674920417">
     <w:abstractNumId w:val="8"/>
@@ -4700,7 +7529,13 @@
     <w:abstractNumId w:val="12"/>
   </w:num>
   <w:num w:numId="25" w16cid:durableId="764500296">
-    <w:abstractNumId w:val="16"/>
+    <w:abstractNumId w:val="17"/>
+  </w:num>
+  <w:num w:numId="26" w16cid:durableId="34963112">
+    <w:abstractNumId w:val="15"/>
+  </w:num>
+  <w:num w:numId="27" w16cid:durableId="1817528350">
+    <w:abstractNumId w:val="20"/>
   </w:num>
 </w:numbering>
 </file>
@@ -5308,6 +8143,7 @@
   <w:style w:type="character" w:default="1" w:styleId="DefaultParagraphFont">
     <w:name w:val="Default Paragraph Font"/>
     <w:uiPriority w:val="1"/>
+    <w:semiHidden/>
     <w:unhideWhenUsed/>
   </w:style>
   <w:style w:type="table" w:default="1" w:styleId="TableNormal">

</xml_diff>